<commit_message>
Reemplazar tabla de verificación por observaciones generales en la hoja de campo
Co-Authored-By: Claude Opus 5.5 <noreply@anthropic.com>
Claude-Session: https://claude.ai/code/session_01FfUnftB8faW5Tj1T7jUfMj
</commit_message>
<xml_diff>
--- a/Hoja_Campo_Limpieza_Roceria_Comuna2.docx
+++ b/Hoja_Campo_Limpieza_Roceria_Comuna2.docx
@@ -4637,7 +4637,7 @@
           <w:sz w:val="18"/>
           <w:szCs w:val="18"/>
         </w:rPr>
-        <w:t xml:space="preserve">4. ESTADO DEL TRAMO Y VERIFICACIÓN DEL FRENTE</w:t>
+        <w:t xml:space="preserve">4. ESTADO DEL TRAMO Y OBSERVACIONES</w:t>
       </w:r>
     </w:p>
     <w:tbl>
@@ -5090,10 +5090,7 @@
         <w:tblLayout w:type="fixed"/>
       </w:tblPr>
       <w:tblGrid>
-        <w:gridCol w:w="6720"/>
-        <w:gridCol w:w="700"/>
-        <w:gridCol w:w="700"/>
-        <w:gridCol w:w="3400"/>
+        <w:gridCol w:w="11520"/>
       </w:tblGrid>
       <w:tr>
         <w:trPr>
@@ -5101,7 +5098,7 @@
         </w:trPr>
         <w:tc>
           <w:tcPr>
-            <w:tcW w:type="dxa" w:w="6720"/>
+            <w:tcW w:type="dxa" w:w="11520"/>
             <w:tcBorders>
               <w:top w:val="single" w:color="555555" w:sz="4"/>
               <w:left w:val="single" w:color="555555" w:sz="4"/>
@@ -5130,216 +5127,18 @@
                 <w:sz w:val="16"/>
                 <w:szCs w:val="16"/>
               </w:rPr>
-              <w:t xml:space="preserve">Verificación</w:t>
-            </w:r>
-          </w:p>
-        </w:tc>
-        <w:tc>
-          <w:tcPr>
-            <w:tcW w:type="dxa" w:w="700"/>
-            <w:tcBorders>
-              <w:top w:val="single" w:color="555555" w:sz="4"/>
-              <w:left w:val="single" w:color="555555" w:sz="4"/>
-              <w:bottom w:val="single" w:color="555555" w:sz="4"/>
-              <w:right w:val="single" w:color="555555" w:sz="4"/>
-            </w:tcBorders>
-            <w:shd w:fill="D9E2D0" w:color="auto" w:val="clear"/>
-            <w:tcMar>
-              <w:top w:type="dxa" w:w="30"/>
-              <w:left w:type="dxa" w:w="60"/>
-              <w:bottom w:type="dxa" w:w="30"/>
-              <w:right w:type="dxa" w:w="60"/>
-            </w:tcMar>
-            <w:vAlign w:val="center"/>
-          </w:tcPr>
-          <w:p>
-            <w:pPr>
-              <w:spacing w:after="0" w:before="0"/>
-              <w:jc w:val="center"/>
-            </w:pPr>
-            <w:r>
-              <w:rPr>
-                <w:rFonts w:ascii="Arial" w:cs="Arial" w:eastAsia="Arial" w:hAnsi="Arial"/>
-                <w:b/>
-                <w:bCs/>
-                <w:sz w:val="16"/>
-                <w:szCs w:val="16"/>
-              </w:rPr>
-              <w:t xml:space="preserve">Sí</w:t>
-            </w:r>
-          </w:p>
-        </w:tc>
-        <w:tc>
-          <w:tcPr>
-            <w:tcW w:type="dxa" w:w="700"/>
-            <w:tcBorders>
-              <w:top w:val="single" w:color="555555" w:sz="4"/>
-              <w:left w:val="single" w:color="555555" w:sz="4"/>
-              <w:bottom w:val="single" w:color="555555" w:sz="4"/>
-              <w:right w:val="single" w:color="555555" w:sz="4"/>
-            </w:tcBorders>
-            <w:shd w:fill="D9E2D0" w:color="auto" w:val="clear"/>
-            <w:tcMar>
-              <w:top w:type="dxa" w:w="30"/>
-              <w:left w:type="dxa" w:w="60"/>
-              <w:bottom w:type="dxa" w:w="30"/>
-              <w:right w:type="dxa" w:w="60"/>
-            </w:tcMar>
-            <w:vAlign w:val="center"/>
-          </w:tcPr>
-          <w:p>
-            <w:pPr>
-              <w:spacing w:after="0" w:before="0"/>
-              <w:jc w:val="center"/>
-            </w:pPr>
-            <w:r>
-              <w:rPr>
-                <w:rFonts w:ascii="Arial" w:cs="Arial" w:eastAsia="Arial" w:hAnsi="Arial"/>
-                <w:b/>
-                <w:bCs/>
-                <w:sz w:val="16"/>
-                <w:szCs w:val="16"/>
-              </w:rPr>
-              <w:t xml:space="preserve">No</w:t>
-            </w:r>
-          </w:p>
-        </w:tc>
-        <w:tc>
-          <w:tcPr>
-            <w:tcW w:type="dxa" w:w="3400"/>
-            <w:tcBorders>
-              <w:top w:val="single" w:color="555555" w:sz="4"/>
-              <w:left w:val="single" w:color="555555" w:sz="4"/>
-              <w:bottom w:val="single" w:color="555555" w:sz="4"/>
-              <w:right w:val="single" w:color="555555" w:sz="4"/>
-            </w:tcBorders>
-            <w:shd w:fill="D9E2D0" w:color="auto" w:val="clear"/>
-            <w:tcMar>
-              <w:top w:type="dxa" w:w="30"/>
-              <w:left w:type="dxa" w:w="60"/>
-              <w:bottom w:type="dxa" w:w="30"/>
-              <w:right w:type="dxa" w:w="60"/>
-            </w:tcMar>
-            <w:vAlign w:val="center"/>
-          </w:tcPr>
-          <w:p>
-            <w:pPr>
-              <w:spacing w:after="0" w:before="0"/>
-              <w:jc w:val="center"/>
-            </w:pPr>
-            <w:r>
-              <w:rPr>
-                <w:rFonts w:ascii="Arial" w:cs="Arial" w:eastAsia="Arial" w:hAnsi="Arial"/>
-                <w:b/>
-                <w:bCs/>
-                <w:sz w:val="16"/>
-                <w:szCs w:val="16"/>
-              </w:rPr>
-              <w:t xml:space="preserve">Observación</w:t>
+              <w:t xml:space="preserve">Observaciones generales de la jornada (cómo quedó el frente, qué falta, qué se recomienda para mañana)</w:t>
             </w:r>
           </w:p>
         </w:tc>
       </w:tr>
       <w:tr>
         <w:trPr>
-          <w:trHeight w:val="300" w:hRule="atLeast"/>
+          <w:trHeight w:val="380" w:hRule="atLeast"/>
         </w:trPr>
         <w:tc>
           <w:tcPr>
-            <w:tcW w:type="dxa" w:w="6720"/>
-            <w:tcBorders>
-              <w:top w:val="single" w:color="555555" w:sz="4"/>
-              <w:left w:val="single" w:color="555555" w:sz="4"/>
-              <w:bottom w:val="single" w:color="555555" w:sz="4"/>
-              <w:right w:val="single" w:color="555555" w:sz="4"/>
-            </w:tcBorders>
-            <w:tcMar>
-              <w:top w:type="dxa" w:w="30"/>
-              <w:left w:type="dxa" w:w="60"/>
-              <w:bottom w:type="dxa" w:w="30"/>
-              <w:right w:type="dxa" w:w="60"/>
-            </w:tcMar>
-            <w:vAlign w:val="center"/>
-          </w:tcPr>
-          <w:p>
-            <w:pPr>
-              <w:spacing w:after="0" w:before="0"/>
-            </w:pPr>
-            <w:r>
-              <w:rPr>
-                <w:rFonts w:ascii="Arial" w:cs="Arial" w:eastAsia="Arial" w:hAnsi="Arial"/>
-                <w:sz w:val="16"/>
-                <w:szCs w:val="16"/>
-              </w:rPr>
-              <w:t xml:space="preserve">Se intervino solo el tramo programado y autorizado</w:t>
-            </w:r>
-          </w:p>
-        </w:tc>
-        <w:tc>
-          <w:tcPr>
-            <w:tcW w:type="dxa" w:w="700"/>
-            <w:tcBorders>
-              <w:top w:val="single" w:color="555555" w:sz="4"/>
-              <w:left w:val="single" w:color="555555" w:sz="4"/>
-              <w:bottom w:val="single" w:color="555555" w:sz="4"/>
-              <w:right w:val="single" w:color="555555" w:sz="4"/>
-            </w:tcBorders>
-            <w:tcMar>
-              <w:top w:type="dxa" w:w="30"/>
-              <w:left w:type="dxa" w:w="60"/>
-              <w:bottom w:type="dxa" w:w="30"/>
-              <w:right w:type="dxa" w:w="60"/>
-            </w:tcMar>
-            <w:vAlign w:val="center"/>
-          </w:tcPr>
-          <w:p>
-            <w:pPr>
-              <w:spacing w:after="0" w:before="0"/>
-            </w:pPr>
-            <w:r>
-              <w:rPr>
-                <w:rFonts w:ascii="Arial" w:cs="Arial" w:eastAsia="Arial" w:hAnsi="Arial"/>
-                <w:sz w:val="16"/>
-                <w:szCs w:val="16"/>
-              </w:rPr>
-              <w:t xml:space="preserve"/>
-            </w:r>
-          </w:p>
-        </w:tc>
-        <w:tc>
-          <w:tcPr>
-            <w:tcW w:type="dxa" w:w="700"/>
-            <w:tcBorders>
-              <w:top w:val="single" w:color="555555" w:sz="4"/>
-              <w:left w:val="single" w:color="555555" w:sz="4"/>
-              <w:bottom w:val="single" w:color="555555" w:sz="4"/>
-              <w:right w:val="single" w:color="555555" w:sz="4"/>
-            </w:tcBorders>
-            <w:tcMar>
-              <w:top w:type="dxa" w:w="30"/>
-              <w:left w:type="dxa" w:w="60"/>
-              <w:bottom w:type="dxa" w:w="30"/>
-              <w:right w:type="dxa" w:w="60"/>
-            </w:tcMar>
-            <w:vAlign w:val="center"/>
-          </w:tcPr>
-          <w:p>
-            <w:pPr>
-              <w:spacing w:after="0" w:before="0"/>
-            </w:pPr>
-            <w:r>
-              <w:rPr>
-                <w:rFonts w:ascii="Arial" w:cs="Arial" w:eastAsia="Arial" w:hAnsi="Arial"/>
-                <w:sz w:val="16"/>
-                <w:szCs w:val="16"/>
-              </w:rPr>
-              <w:t xml:space="preserve"/>
-            </w:r>
-          </w:p>
-        </w:tc>
-        <w:tc>
-          <w:tcPr>
-            <w:tcW w:type="dxa" w:w="3400"/>
+            <w:tcW w:type="dxa" w:w="11520"/>
             <w:tcBorders>
               <w:top w:val="single" w:color="555555" w:sz="4"/>
               <w:left w:val="single" w:color="555555" w:sz="4"/>
@@ -5371,104 +5170,11 @@
       </w:tr>
       <w:tr>
         <w:trPr>
-          <w:trHeight w:val="300" w:hRule="atLeast"/>
+          <w:trHeight w:val="380" w:hRule="atLeast"/>
         </w:trPr>
         <w:tc>
           <w:tcPr>
-            <w:tcW w:type="dxa" w:w="6720"/>
-            <w:tcBorders>
-              <w:top w:val="single" w:color="555555" w:sz="4"/>
-              <w:left w:val="single" w:color="555555" w:sz="4"/>
-              <w:bottom w:val="single" w:color="555555" w:sz="4"/>
-              <w:right w:val="single" w:color="555555" w:sz="4"/>
-            </w:tcBorders>
-            <w:tcMar>
-              <w:top w:type="dxa" w:w="30"/>
-              <w:left w:type="dxa" w:w="60"/>
-              <w:bottom w:type="dxa" w:w="30"/>
-              <w:right w:type="dxa" w:w="60"/>
-            </w:tcMar>
-            <w:vAlign w:val="center"/>
-          </w:tcPr>
-          <w:p>
-            <w:pPr>
-              <w:spacing w:after="0" w:before="0"/>
-            </w:pPr>
-            <w:r>
-              <w:rPr>
-                <w:rFonts w:ascii="Arial" w:cs="Arial" w:eastAsia="Arial" w:hAnsi="Arial"/>
-                <w:sz w:val="16"/>
-                <w:szCs w:val="16"/>
-              </w:rPr>
-              <w:t xml:space="preserve">La limpieza quedó conforme a las instrucciones técnicas</w:t>
-            </w:r>
-          </w:p>
-        </w:tc>
-        <w:tc>
-          <w:tcPr>
-            <w:tcW w:type="dxa" w:w="700"/>
-            <w:tcBorders>
-              <w:top w:val="single" w:color="555555" w:sz="4"/>
-              <w:left w:val="single" w:color="555555" w:sz="4"/>
-              <w:bottom w:val="single" w:color="555555" w:sz="4"/>
-              <w:right w:val="single" w:color="555555" w:sz="4"/>
-            </w:tcBorders>
-            <w:tcMar>
-              <w:top w:type="dxa" w:w="30"/>
-              <w:left w:type="dxa" w:w="60"/>
-              <w:bottom w:type="dxa" w:w="30"/>
-              <w:right w:type="dxa" w:w="60"/>
-            </w:tcMar>
-            <w:vAlign w:val="center"/>
-          </w:tcPr>
-          <w:p>
-            <w:pPr>
-              <w:spacing w:after="0" w:before="0"/>
-            </w:pPr>
-            <w:r>
-              <w:rPr>
-                <w:rFonts w:ascii="Arial" w:cs="Arial" w:eastAsia="Arial" w:hAnsi="Arial"/>
-                <w:sz w:val="16"/>
-                <w:szCs w:val="16"/>
-              </w:rPr>
-              <w:t xml:space="preserve"/>
-            </w:r>
-          </w:p>
-        </w:tc>
-        <w:tc>
-          <w:tcPr>
-            <w:tcW w:type="dxa" w:w="700"/>
-            <w:tcBorders>
-              <w:top w:val="single" w:color="555555" w:sz="4"/>
-              <w:left w:val="single" w:color="555555" w:sz="4"/>
-              <w:bottom w:val="single" w:color="555555" w:sz="4"/>
-              <w:right w:val="single" w:color="555555" w:sz="4"/>
-            </w:tcBorders>
-            <w:tcMar>
-              <w:top w:type="dxa" w:w="30"/>
-              <w:left w:type="dxa" w:w="60"/>
-              <w:bottom w:type="dxa" w:w="30"/>
-              <w:right w:type="dxa" w:w="60"/>
-            </w:tcMar>
-            <w:vAlign w:val="center"/>
-          </w:tcPr>
-          <w:p>
-            <w:pPr>
-              <w:spacing w:after="0" w:before="0"/>
-            </w:pPr>
-            <w:r>
-              <w:rPr>
-                <w:rFonts w:ascii="Arial" w:cs="Arial" w:eastAsia="Arial" w:hAnsi="Arial"/>
-                <w:sz w:val="16"/>
-                <w:szCs w:val="16"/>
-              </w:rPr>
-              <w:t xml:space="preserve"/>
-            </w:r>
-          </w:p>
-        </w:tc>
-        <w:tc>
-          <w:tcPr>
-            <w:tcW w:type="dxa" w:w="3400"/>
+            <w:tcW w:type="dxa" w:w="11520"/>
             <w:tcBorders>
               <w:top w:val="single" w:color="555555" w:sz="4"/>
               <w:left w:val="single" w:color="555555" w:sz="4"/>
@@ -5500,104 +5206,11 @@
       </w:tr>
       <w:tr>
         <w:trPr>
-          <w:trHeight w:val="300" w:hRule="atLeast"/>
+          <w:trHeight w:val="380" w:hRule="atLeast"/>
         </w:trPr>
         <w:tc>
           <w:tcPr>
-            <w:tcW w:type="dxa" w:w="6720"/>
-            <w:tcBorders>
-              <w:top w:val="single" w:color="555555" w:sz="4"/>
-              <w:left w:val="single" w:color="555555" w:sz="4"/>
-              <w:bottom w:val="single" w:color="555555" w:sz="4"/>
-              <w:right w:val="single" w:color="555555" w:sz="4"/>
-            </w:tcBorders>
-            <w:tcMar>
-              <w:top w:type="dxa" w:w="30"/>
-              <w:left w:type="dxa" w:w="60"/>
-              <w:bottom w:type="dxa" w:w="30"/>
-              <w:right w:type="dxa" w:w="60"/>
-            </w:tcMar>
-            <w:vAlign w:val="center"/>
-          </w:tcPr>
-          <w:p>
-            <w:pPr>
-              <w:spacing w:after="0" w:before="0"/>
-            </w:pPr>
-            <w:r>
-              <w:rPr>
-                <w:rFonts w:ascii="Arial" w:cs="Arial" w:eastAsia="Arial" w:hAnsi="Arial"/>
-                <w:sz w:val="16"/>
-                <w:szCs w:val="16"/>
-              </w:rPr>
-              <w:t xml:space="preserve">El material retirado quedó acopiado en el punto indicado (no devuelto al canal)</w:t>
-            </w:r>
-          </w:p>
-        </w:tc>
-        <w:tc>
-          <w:tcPr>
-            <w:tcW w:type="dxa" w:w="700"/>
-            <w:tcBorders>
-              <w:top w:val="single" w:color="555555" w:sz="4"/>
-              <w:left w:val="single" w:color="555555" w:sz="4"/>
-              <w:bottom w:val="single" w:color="555555" w:sz="4"/>
-              <w:right w:val="single" w:color="555555" w:sz="4"/>
-            </w:tcBorders>
-            <w:tcMar>
-              <w:top w:type="dxa" w:w="30"/>
-              <w:left w:type="dxa" w:w="60"/>
-              <w:bottom w:type="dxa" w:w="30"/>
-              <w:right w:type="dxa" w:w="60"/>
-            </w:tcMar>
-            <w:vAlign w:val="center"/>
-          </w:tcPr>
-          <w:p>
-            <w:pPr>
-              <w:spacing w:after="0" w:before="0"/>
-            </w:pPr>
-            <w:r>
-              <w:rPr>
-                <w:rFonts w:ascii="Arial" w:cs="Arial" w:eastAsia="Arial" w:hAnsi="Arial"/>
-                <w:sz w:val="16"/>
-                <w:szCs w:val="16"/>
-              </w:rPr>
-              <w:t xml:space="preserve"/>
-            </w:r>
-          </w:p>
-        </w:tc>
-        <w:tc>
-          <w:tcPr>
-            <w:tcW w:type="dxa" w:w="700"/>
-            <w:tcBorders>
-              <w:top w:val="single" w:color="555555" w:sz="4"/>
-              <w:left w:val="single" w:color="555555" w:sz="4"/>
-              <w:bottom w:val="single" w:color="555555" w:sz="4"/>
-              <w:right w:val="single" w:color="555555" w:sz="4"/>
-            </w:tcBorders>
-            <w:tcMar>
-              <w:top w:type="dxa" w:w="30"/>
-              <w:left w:type="dxa" w:w="60"/>
-              <w:bottom w:type="dxa" w:w="30"/>
-              <w:right w:type="dxa" w:w="60"/>
-            </w:tcMar>
-            <w:vAlign w:val="center"/>
-          </w:tcPr>
-          <w:p>
-            <w:pPr>
-              <w:spacing w:after="0" w:before="0"/>
-            </w:pPr>
-            <w:r>
-              <w:rPr>
-                <w:rFonts w:ascii="Arial" w:cs="Arial" w:eastAsia="Arial" w:hAnsi="Arial"/>
-                <w:sz w:val="16"/>
-                <w:szCs w:val="16"/>
-              </w:rPr>
-              <w:t xml:space="preserve"/>
-            </w:r>
-          </w:p>
-        </w:tc>
-        <w:tc>
-          <w:tcPr>
-            <w:tcW w:type="dxa" w:w="3400"/>
+            <w:tcW w:type="dxa" w:w="11520"/>
             <w:tcBorders>
               <w:top w:val="single" w:color="555555" w:sz="4"/>
               <w:left w:val="single" w:color="555555" w:sz="4"/>
@@ -5629,233 +5242,11 @@
       </w:tr>
       <w:tr>
         <w:trPr>
-          <w:trHeight w:val="300" w:hRule="atLeast"/>
+          <w:trHeight w:val="380" w:hRule="atLeast"/>
         </w:trPr>
         <w:tc>
           <w:tcPr>
-            <w:tcW w:type="dxa" w:w="6720"/>
-            <w:tcBorders>
-              <w:top w:val="single" w:color="555555" w:sz="4"/>
-              <w:left w:val="single" w:color="555555" w:sz="4"/>
-              <w:bottom w:val="single" w:color="555555" w:sz="4"/>
-              <w:right w:val="single" w:color="555555" w:sz="4"/>
-            </w:tcBorders>
-            <w:tcMar>
-              <w:top w:type="dxa" w:w="30"/>
-              <w:left w:type="dxa" w:w="60"/>
-              <w:bottom w:type="dxa" w:w="30"/>
-              <w:right w:type="dxa" w:w="60"/>
-            </w:tcMar>
-            <w:vAlign w:val="center"/>
-          </w:tcPr>
-          <w:p>
-            <w:pPr>
-              <w:spacing w:after="0" w:before="0"/>
-            </w:pPr>
-            <w:r>
-              <w:rPr>
-                <w:rFonts w:ascii="Arial" w:cs="Arial" w:eastAsia="Arial" w:hAnsi="Arial"/>
-                <w:sz w:val="16"/>
-                <w:szCs w:val="16"/>
-              </w:rPr>
-              <w:t xml:space="preserve">Herramientas entregadas y devueltas completas y en buen estado</w:t>
-            </w:r>
-          </w:p>
-        </w:tc>
-        <w:tc>
-          <w:tcPr>
-            <w:tcW w:type="dxa" w:w="700"/>
-            <w:tcBorders>
-              <w:top w:val="single" w:color="555555" w:sz="4"/>
-              <w:left w:val="single" w:color="555555" w:sz="4"/>
-              <w:bottom w:val="single" w:color="555555" w:sz="4"/>
-              <w:right w:val="single" w:color="555555" w:sz="4"/>
-            </w:tcBorders>
-            <w:tcMar>
-              <w:top w:type="dxa" w:w="30"/>
-              <w:left w:type="dxa" w:w="60"/>
-              <w:bottom w:type="dxa" w:w="30"/>
-              <w:right w:type="dxa" w:w="60"/>
-            </w:tcMar>
-            <w:vAlign w:val="center"/>
-          </w:tcPr>
-          <w:p>
-            <w:pPr>
-              <w:spacing w:after="0" w:before="0"/>
-            </w:pPr>
-            <w:r>
-              <w:rPr>
-                <w:rFonts w:ascii="Arial" w:cs="Arial" w:eastAsia="Arial" w:hAnsi="Arial"/>
-                <w:sz w:val="16"/>
-                <w:szCs w:val="16"/>
-              </w:rPr>
-              <w:t xml:space="preserve"/>
-            </w:r>
-          </w:p>
-        </w:tc>
-        <w:tc>
-          <w:tcPr>
-            <w:tcW w:type="dxa" w:w="700"/>
-            <w:tcBorders>
-              <w:top w:val="single" w:color="555555" w:sz="4"/>
-              <w:left w:val="single" w:color="555555" w:sz="4"/>
-              <w:bottom w:val="single" w:color="555555" w:sz="4"/>
-              <w:right w:val="single" w:color="555555" w:sz="4"/>
-            </w:tcBorders>
-            <w:tcMar>
-              <w:top w:type="dxa" w:w="30"/>
-              <w:left w:type="dxa" w:w="60"/>
-              <w:bottom w:type="dxa" w:w="30"/>
-              <w:right w:type="dxa" w:w="60"/>
-            </w:tcMar>
-            <w:vAlign w:val="center"/>
-          </w:tcPr>
-          <w:p>
-            <w:pPr>
-              <w:spacing w:after="0" w:before="0"/>
-            </w:pPr>
-            <w:r>
-              <w:rPr>
-                <w:rFonts w:ascii="Arial" w:cs="Arial" w:eastAsia="Arial" w:hAnsi="Arial"/>
-                <w:sz w:val="16"/>
-                <w:szCs w:val="16"/>
-              </w:rPr>
-              <w:t xml:space="preserve"/>
-            </w:r>
-          </w:p>
-        </w:tc>
-        <w:tc>
-          <w:tcPr>
-            <w:tcW w:type="dxa" w:w="3400"/>
-            <w:tcBorders>
-              <w:top w:val="single" w:color="555555" w:sz="4"/>
-              <w:left w:val="single" w:color="555555" w:sz="4"/>
-              <w:bottom w:val="single" w:color="555555" w:sz="4"/>
-              <w:right w:val="single" w:color="555555" w:sz="4"/>
-            </w:tcBorders>
-            <w:tcMar>
-              <w:top w:type="dxa" w:w="30"/>
-              <w:left w:type="dxa" w:w="60"/>
-              <w:bottom w:type="dxa" w:w="30"/>
-              <w:right w:type="dxa" w:w="60"/>
-            </w:tcMar>
-            <w:vAlign w:val="center"/>
-          </w:tcPr>
-          <w:p>
-            <w:pPr>
-              <w:spacing w:after="0" w:before="0"/>
-            </w:pPr>
-            <w:r>
-              <w:rPr>
-                <w:rFonts w:ascii="Arial" w:cs="Arial" w:eastAsia="Arial" w:hAnsi="Arial"/>
-                <w:sz w:val="16"/>
-                <w:szCs w:val="16"/>
-              </w:rPr>
-              <w:t xml:space="preserve"/>
-            </w:r>
-          </w:p>
-        </w:tc>
-      </w:tr>
-      <w:tr>
-        <w:trPr>
-          <w:trHeight w:val="300" w:hRule="atLeast"/>
-        </w:trPr>
-        <w:tc>
-          <w:tcPr>
-            <w:tcW w:type="dxa" w:w="6720"/>
-            <w:tcBorders>
-              <w:top w:val="single" w:color="555555" w:sz="4"/>
-              <w:left w:val="single" w:color="555555" w:sz="4"/>
-              <w:bottom w:val="single" w:color="555555" w:sz="4"/>
-              <w:right w:val="single" w:color="555555" w:sz="4"/>
-            </w:tcBorders>
-            <w:tcMar>
-              <w:top w:type="dxa" w:w="30"/>
-              <w:left w:type="dxa" w:w="60"/>
-              <w:bottom w:type="dxa" w:w="30"/>
-              <w:right w:type="dxa" w:w="60"/>
-            </w:tcMar>
-            <w:vAlign w:val="center"/>
-          </w:tcPr>
-          <w:p>
-            <w:pPr>
-              <w:spacing w:after="0" w:before="0"/>
-            </w:pPr>
-            <w:r>
-              <w:rPr>
-                <w:rFonts w:ascii="Arial" w:cs="Arial" w:eastAsia="Arial" w:hAnsi="Arial"/>
-                <w:sz w:val="16"/>
-                <w:szCs w:val="16"/>
-              </w:rPr>
-              <w:t xml:space="preserve">Se informó el avance al responsable de obra / interventoría</w:t>
-            </w:r>
-          </w:p>
-        </w:tc>
-        <w:tc>
-          <w:tcPr>
-            <w:tcW w:type="dxa" w:w="700"/>
-            <w:tcBorders>
-              <w:top w:val="single" w:color="555555" w:sz="4"/>
-              <w:left w:val="single" w:color="555555" w:sz="4"/>
-              <w:bottom w:val="single" w:color="555555" w:sz="4"/>
-              <w:right w:val="single" w:color="555555" w:sz="4"/>
-            </w:tcBorders>
-            <w:tcMar>
-              <w:top w:type="dxa" w:w="30"/>
-              <w:left w:type="dxa" w:w="60"/>
-              <w:bottom w:type="dxa" w:w="30"/>
-              <w:right w:type="dxa" w:w="60"/>
-            </w:tcMar>
-            <w:vAlign w:val="center"/>
-          </w:tcPr>
-          <w:p>
-            <w:pPr>
-              <w:spacing w:after="0" w:before="0"/>
-            </w:pPr>
-            <w:r>
-              <w:rPr>
-                <w:rFonts w:ascii="Arial" w:cs="Arial" w:eastAsia="Arial" w:hAnsi="Arial"/>
-                <w:sz w:val="16"/>
-                <w:szCs w:val="16"/>
-              </w:rPr>
-              <w:t xml:space="preserve"/>
-            </w:r>
-          </w:p>
-        </w:tc>
-        <w:tc>
-          <w:tcPr>
-            <w:tcW w:type="dxa" w:w="700"/>
-            <w:tcBorders>
-              <w:top w:val="single" w:color="555555" w:sz="4"/>
-              <w:left w:val="single" w:color="555555" w:sz="4"/>
-              <w:bottom w:val="single" w:color="555555" w:sz="4"/>
-              <w:right w:val="single" w:color="555555" w:sz="4"/>
-            </w:tcBorders>
-            <w:tcMar>
-              <w:top w:type="dxa" w:w="30"/>
-              <w:left w:type="dxa" w:w="60"/>
-              <w:bottom w:type="dxa" w:w="30"/>
-              <w:right w:type="dxa" w:w="60"/>
-            </w:tcMar>
-            <w:vAlign w:val="center"/>
-          </w:tcPr>
-          <w:p>
-            <w:pPr>
-              <w:spacing w:after="0" w:before="0"/>
-            </w:pPr>
-            <w:r>
-              <w:rPr>
-                <w:rFonts w:ascii="Arial" w:cs="Arial" w:eastAsia="Arial" w:hAnsi="Arial"/>
-                <w:sz w:val="16"/>
-                <w:szCs w:val="16"/>
-              </w:rPr>
-              <w:t xml:space="preserve"/>
-            </w:r>
-          </w:p>
-        </w:tc>
-        <w:tc>
-          <w:tcPr>
-            <w:tcW w:type="dxa" w:w="3400"/>
+            <w:tcW w:type="dxa" w:w="11520"/>
             <w:tcBorders>
               <w:top w:val="single" w:color="555555" w:sz="4"/>
               <w:left w:val="single" w:color="555555" w:sz="4"/>

</xml_diff>

<commit_message>
Hoja de campo: tramo del día único y actividades en metros lineales
Co-Authored-By: Claude Opus 5.5 <noreply@anthropic.com>
Claude-Session: https://claude.ai/code/session_01FfUnftB8faW5Tj1T7jUfMj
</commit_message>
<xml_diff>
--- a/Hoja_Campo_Limpieza_Roceria_Comuna2.docx
+++ b/Hoja_Campo_Limpieza_Roceria_Comuna2.docx
@@ -451,7 +451,7 @@
                 <w:sz w:val="18"/>
                 <w:szCs w:val="18"/>
               </w:rPr>
-              <w:t xml:space="preserve">Tramo trabajado (de – a)</w:t>
+              <w:t xml:space="preserve">Tramo del día (abscisa de – a)</w:t>
             </w:r>
           </w:p>
         </w:tc>
@@ -484,7 +484,7 @@
                 <w:sz w:val="18"/>
                 <w:szCs w:val="18"/>
               </w:rPr>
-              <w:t xml:space="preserve"/>
+              <w:t xml:space="preserve">de ________ a ________</w:t>
             </w:r>
           </w:p>
         </w:tc>
@@ -1898,7 +1898,7 @@
           <w:sz w:val="15"/>
           <w:szCs w:val="15"/>
         </w:rPr>
-        <w:t xml:space="preserve">Rendimiento (%) = Ejecutado ÷ Programado × 100.   Acumulado = total del tramo hasta hoy.</w:t>
+        <w:t xml:space="preserve">Todas las actividades se miden sobre el tramo del día (ej.: de abscisa 0 a 55 = 55 metros lineales). Rend. (%) = Ejecutado ÷ Programado × 100. Acumulado = total desde el inicio.</w:t>
       </w:r>
     </w:p>
     <w:tbl>
@@ -1915,13 +1915,12 @@
         <w:tblLayout w:type="fixed"/>
       </w:tblPr>
       <w:tblGrid>
-        <w:gridCol w:w="3420"/>
-        <w:gridCol w:w="1200"/>
-        <w:gridCol w:w="1500"/>
-        <w:gridCol w:w="1350"/>
-        <w:gridCol w:w="1350"/>
-        <w:gridCol w:w="1200"/>
-        <w:gridCol w:w="1500"/>
+        <w:gridCol w:w="3920"/>
+        <w:gridCol w:w="1300"/>
+        <w:gridCol w:w="1600"/>
+        <w:gridCol w:w="1600"/>
+        <w:gridCol w:w="1400"/>
+        <w:gridCol w:w="1700"/>
       </w:tblGrid>
       <w:tr>
         <w:trPr>
@@ -1929,7 +1928,7 @@
         </w:trPr>
         <w:tc>
           <w:tcPr>
-            <w:tcW w:type="dxa" w:w="3420"/>
+            <w:tcW w:type="dxa" w:w="3920"/>
             <w:tcBorders>
               <w:top w:val="single" w:color="555555" w:sz="4"/>
               <w:left w:val="single" w:color="555555" w:sz="4"/>
@@ -1964,7 +1963,7 @@
         </w:tc>
         <w:tc>
           <w:tcPr>
-            <w:tcW w:type="dxa" w:w="1200"/>
+            <w:tcW w:type="dxa" w:w="1300"/>
             <w:tcBorders>
               <w:top w:val="single" w:color="555555" w:sz="4"/>
               <w:left w:val="single" w:color="555555" w:sz="4"/>
@@ -1999,7 +1998,7 @@
         </w:tc>
         <w:tc>
           <w:tcPr>
-            <w:tcW w:type="dxa" w:w="1500"/>
+            <w:tcW w:type="dxa" w:w="1600"/>
             <w:tcBorders>
               <w:top w:val="single" w:color="555555" w:sz="4"/>
               <w:left w:val="single" w:color="555555" w:sz="4"/>
@@ -2028,13 +2027,13 @@
                 <w:sz w:val="18"/>
                 <w:szCs w:val="18"/>
               </w:rPr>
-              <w:t xml:space="preserve">Abscisa (de – a)</w:t>
-            </w:r>
-          </w:p>
-        </w:tc>
-        <w:tc>
-          <w:tcPr>
-            <w:tcW w:type="dxa" w:w="1350"/>
+              <w:t xml:space="preserve">Programado hoy</w:t>
+            </w:r>
+          </w:p>
+        </w:tc>
+        <w:tc>
+          <w:tcPr>
+            <w:tcW w:type="dxa" w:w="1600"/>
             <w:tcBorders>
               <w:top w:val="single" w:color="555555" w:sz="4"/>
               <w:left w:val="single" w:color="555555" w:sz="4"/>
@@ -2063,13 +2062,13 @@
                 <w:sz w:val="18"/>
                 <w:szCs w:val="18"/>
               </w:rPr>
-              <w:t xml:space="preserve">Programado hoy</w:t>
-            </w:r>
-          </w:p>
-        </w:tc>
-        <w:tc>
-          <w:tcPr>
-            <w:tcW w:type="dxa" w:w="1350"/>
+              <w:t xml:space="preserve">Ejecutado hoy</w:t>
+            </w:r>
+          </w:p>
+        </w:tc>
+        <w:tc>
+          <w:tcPr>
+            <w:tcW w:type="dxa" w:w="1400"/>
             <w:tcBorders>
               <w:top w:val="single" w:color="555555" w:sz="4"/>
               <w:left w:val="single" w:color="555555" w:sz="4"/>
@@ -2098,13 +2097,13 @@
                 <w:sz w:val="18"/>
                 <w:szCs w:val="18"/>
               </w:rPr>
-              <w:t xml:space="preserve">Ejecutado hoy</w:t>
-            </w:r>
-          </w:p>
-        </w:tc>
-        <w:tc>
-          <w:tcPr>
-            <w:tcW w:type="dxa" w:w="1200"/>
+              <w:t xml:space="preserve">Rend. (%)</w:t>
+            </w:r>
+          </w:p>
+        </w:tc>
+        <w:tc>
+          <w:tcPr>
+            <w:tcW w:type="dxa" w:w="1700"/>
             <w:tcBorders>
               <w:top w:val="single" w:color="555555" w:sz="4"/>
               <w:left w:val="single" w:color="555555" w:sz="4"/>
@@ -2133,42 +2132,7 @@
                 <w:sz w:val="18"/>
                 <w:szCs w:val="18"/>
               </w:rPr>
-              <w:t xml:space="preserve">Rend. (%)</w:t>
-            </w:r>
-          </w:p>
-        </w:tc>
-        <w:tc>
-          <w:tcPr>
-            <w:tcW w:type="dxa" w:w="1500"/>
-            <w:tcBorders>
-              <w:top w:val="single" w:color="555555" w:sz="4"/>
-              <w:left w:val="single" w:color="555555" w:sz="4"/>
-              <w:bottom w:val="single" w:color="555555" w:sz="4"/>
-              <w:right w:val="single" w:color="555555" w:sz="4"/>
-            </w:tcBorders>
-            <w:shd w:fill="D9E2D0" w:color="auto" w:val="clear"/>
-            <w:tcMar>
-              <w:top w:type="dxa" w:w="30"/>
-              <w:left w:type="dxa" w:w="60"/>
-              <w:bottom w:type="dxa" w:w="30"/>
-              <w:right w:type="dxa" w:w="60"/>
-            </w:tcMar>
-            <w:vAlign w:val="center"/>
-          </w:tcPr>
-          <w:p>
-            <w:pPr>
-              <w:spacing w:after="0" w:before="0"/>
-              <w:jc w:val="center"/>
-            </w:pPr>
-            <w:r>
-              <w:rPr>
-                <w:rFonts w:ascii="Arial" w:cs="Arial" w:eastAsia="Arial" w:hAnsi="Arial"/>
-                <w:b/>
-                <w:bCs/>
-                <w:sz w:val="18"/>
-                <w:szCs w:val="18"/>
-              </w:rPr>
-              <w:t xml:space="preserve">Acumulado tramo</w:t>
+              <w:t xml:space="preserve">Acumulado</w:t>
             </w:r>
           </w:p>
         </w:tc>
@@ -2179,7 +2143,7 @@
         </w:trPr>
         <w:tc>
           <w:tcPr>
-            <w:tcW w:type="dxa" w:w="3420"/>
+            <w:tcW w:type="dxa" w:w="3920"/>
             <w:tcBorders>
               <w:top w:val="single" w:color="555555" w:sz="4"/>
               <w:left w:val="single" w:color="555555" w:sz="4"/>
@@ -2210,7 +2174,7 @@
         </w:tc>
         <w:tc>
           <w:tcPr>
-            <w:tcW w:type="dxa" w:w="1200"/>
+            <w:tcW w:type="dxa" w:w="1300"/>
             <w:tcBorders>
               <w:top w:val="single" w:color="555555" w:sz="4"/>
               <w:left w:val="single" w:color="555555" w:sz="4"/>
@@ -2236,137 +2200,106 @@
                 <w:sz w:val="18"/>
                 <w:szCs w:val="18"/>
               </w:rPr>
-              <w:t xml:space="preserve">m²</w:t>
-            </w:r>
-          </w:p>
-        </w:tc>
-        <w:tc>
-          <w:tcPr>
-            <w:tcW w:type="dxa" w:w="1500"/>
-            <w:tcBorders>
-              <w:top w:val="single" w:color="555555" w:sz="4"/>
-              <w:left w:val="single" w:color="555555" w:sz="4"/>
-              <w:bottom w:val="single" w:color="555555" w:sz="4"/>
-              <w:right w:val="single" w:color="555555" w:sz="4"/>
-            </w:tcBorders>
-            <w:tcMar>
-              <w:top w:type="dxa" w:w="30"/>
-              <w:left w:type="dxa" w:w="60"/>
-              <w:bottom w:type="dxa" w:w="30"/>
-              <w:right w:type="dxa" w:w="60"/>
-            </w:tcMar>
-            <w:vAlign w:val="center"/>
-          </w:tcPr>
-          <w:p>
-            <w:pPr>
-              <w:spacing w:after="0" w:before="0"/>
-            </w:pPr>
-            <w:r>
-              <w:rPr>
-                <w:rFonts w:ascii="Arial" w:cs="Arial" w:eastAsia="Arial" w:hAnsi="Arial"/>
-                <w:sz w:val="18"/>
-                <w:szCs w:val="18"/>
-              </w:rPr>
-              <w:t xml:space="preserve"/>
-            </w:r>
-          </w:p>
-        </w:tc>
-        <w:tc>
-          <w:tcPr>
-            <w:tcW w:type="dxa" w:w="1350"/>
-            <w:tcBorders>
-              <w:top w:val="single" w:color="555555" w:sz="4"/>
-              <w:left w:val="single" w:color="555555" w:sz="4"/>
-              <w:bottom w:val="single" w:color="555555" w:sz="4"/>
-              <w:right w:val="single" w:color="555555" w:sz="4"/>
-            </w:tcBorders>
-            <w:tcMar>
-              <w:top w:type="dxa" w:w="30"/>
-              <w:left w:type="dxa" w:w="60"/>
-              <w:bottom w:type="dxa" w:w="30"/>
-              <w:right w:type="dxa" w:w="60"/>
-            </w:tcMar>
-            <w:vAlign w:val="center"/>
-          </w:tcPr>
-          <w:p>
-            <w:pPr>
-              <w:spacing w:after="0" w:before="0"/>
-            </w:pPr>
-            <w:r>
-              <w:rPr>
-                <w:rFonts w:ascii="Arial" w:cs="Arial" w:eastAsia="Arial" w:hAnsi="Arial"/>
-                <w:sz w:val="18"/>
-                <w:szCs w:val="18"/>
-              </w:rPr>
-              <w:t xml:space="preserve"/>
-            </w:r>
-          </w:p>
-        </w:tc>
-        <w:tc>
-          <w:tcPr>
-            <w:tcW w:type="dxa" w:w="1350"/>
-            <w:tcBorders>
-              <w:top w:val="single" w:color="555555" w:sz="4"/>
-              <w:left w:val="single" w:color="555555" w:sz="4"/>
-              <w:bottom w:val="single" w:color="555555" w:sz="4"/>
-              <w:right w:val="single" w:color="555555" w:sz="4"/>
-            </w:tcBorders>
-            <w:tcMar>
-              <w:top w:type="dxa" w:w="30"/>
-              <w:left w:type="dxa" w:w="60"/>
-              <w:bottom w:type="dxa" w:w="30"/>
-              <w:right w:type="dxa" w:w="60"/>
-            </w:tcMar>
-            <w:vAlign w:val="center"/>
-          </w:tcPr>
-          <w:p>
-            <w:pPr>
-              <w:spacing w:after="0" w:before="0"/>
-            </w:pPr>
-            <w:r>
-              <w:rPr>
-                <w:rFonts w:ascii="Arial" w:cs="Arial" w:eastAsia="Arial" w:hAnsi="Arial"/>
-                <w:sz w:val="18"/>
-                <w:szCs w:val="18"/>
-              </w:rPr>
-              <w:t xml:space="preserve"/>
-            </w:r>
-          </w:p>
-        </w:tc>
-        <w:tc>
-          <w:tcPr>
-            <w:tcW w:type="dxa" w:w="1200"/>
-            <w:tcBorders>
-              <w:top w:val="single" w:color="555555" w:sz="4"/>
-              <w:left w:val="single" w:color="555555" w:sz="4"/>
-              <w:bottom w:val="single" w:color="555555" w:sz="4"/>
-              <w:right w:val="single" w:color="555555" w:sz="4"/>
-            </w:tcBorders>
-            <w:tcMar>
-              <w:top w:type="dxa" w:w="30"/>
-              <w:left w:type="dxa" w:w="60"/>
-              <w:bottom w:type="dxa" w:w="30"/>
-              <w:right w:type="dxa" w:w="60"/>
-            </w:tcMar>
-            <w:vAlign w:val="center"/>
-          </w:tcPr>
-          <w:p>
-            <w:pPr>
-              <w:spacing w:after="0" w:before="0"/>
-            </w:pPr>
-            <w:r>
-              <w:rPr>
-                <w:rFonts w:ascii="Arial" w:cs="Arial" w:eastAsia="Arial" w:hAnsi="Arial"/>
-                <w:sz w:val="18"/>
-                <w:szCs w:val="18"/>
-              </w:rPr>
-              <w:t xml:space="preserve"/>
-            </w:r>
-          </w:p>
-        </w:tc>
-        <w:tc>
-          <w:tcPr>
-            <w:tcW w:type="dxa" w:w="1500"/>
+              <w:t xml:space="preserve">m lineal</w:t>
+            </w:r>
+          </w:p>
+        </w:tc>
+        <w:tc>
+          <w:tcPr>
+            <w:tcW w:type="dxa" w:w="1600"/>
+            <w:tcBorders>
+              <w:top w:val="single" w:color="555555" w:sz="4"/>
+              <w:left w:val="single" w:color="555555" w:sz="4"/>
+              <w:bottom w:val="single" w:color="555555" w:sz="4"/>
+              <w:right w:val="single" w:color="555555" w:sz="4"/>
+            </w:tcBorders>
+            <w:tcMar>
+              <w:top w:type="dxa" w:w="30"/>
+              <w:left w:type="dxa" w:w="60"/>
+              <w:bottom w:type="dxa" w:w="30"/>
+              <w:right w:type="dxa" w:w="60"/>
+            </w:tcMar>
+            <w:vAlign w:val="center"/>
+          </w:tcPr>
+          <w:p>
+            <w:pPr>
+              <w:spacing w:after="0" w:before="0"/>
+            </w:pPr>
+            <w:r>
+              <w:rPr>
+                <w:rFonts w:ascii="Arial" w:cs="Arial" w:eastAsia="Arial" w:hAnsi="Arial"/>
+                <w:sz w:val="18"/>
+                <w:szCs w:val="18"/>
+              </w:rPr>
+              <w:t xml:space="preserve"/>
+            </w:r>
+          </w:p>
+        </w:tc>
+        <w:tc>
+          <w:tcPr>
+            <w:tcW w:type="dxa" w:w="1600"/>
+            <w:tcBorders>
+              <w:top w:val="single" w:color="555555" w:sz="4"/>
+              <w:left w:val="single" w:color="555555" w:sz="4"/>
+              <w:bottom w:val="single" w:color="555555" w:sz="4"/>
+              <w:right w:val="single" w:color="555555" w:sz="4"/>
+            </w:tcBorders>
+            <w:tcMar>
+              <w:top w:type="dxa" w:w="30"/>
+              <w:left w:type="dxa" w:w="60"/>
+              <w:bottom w:type="dxa" w:w="30"/>
+              <w:right w:type="dxa" w:w="60"/>
+            </w:tcMar>
+            <w:vAlign w:val="center"/>
+          </w:tcPr>
+          <w:p>
+            <w:pPr>
+              <w:spacing w:after="0" w:before="0"/>
+            </w:pPr>
+            <w:r>
+              <w:rPr>
+                <w:rFonts w:ascii="Arial" w:cs="Arial" w:eastAsia="Arial" w:hAnsi="Arial"/>
+                <w:sz w:val="18"/>
+                <w:szCs w:val="18"/>
+              </w:rPr>
+              <w:t xml:space="preserve"/>
+            </w:r>
+          </w:p>
+        </w:tc>
+        <w:tc>
+          <w:tcPr>
+            <w:tcW w:type="dxa" w:w="1400"/>
+            <w:tcBorders>
+              <w:top w:val="single" w:color="555555" w:sz="4"/>
+              <w:left w:val="single" w:color="555555" w:sz="4"/>
+              <w:bottom w:val="single" w:color="555555" w:sz="4"/>
+              <w:right w:val="single" w:color="555555" w:sz="4"/>
+            </w:tcBorders>
+            <w:tcMar>
+              <w:top w:type="dxa" w:w="30"/>
+              <w:left w:type="dxa" w:w="60"/>
+              <w:bottom w:type="dxa" w:w="30"/>
+              <w:right w:type="dxa" w:w="60"/>
+            </w:tcMar>
+            <w:vAlign w:val="center"/>
+          </w:tcPr>
+          <w:p>
+            <w:pPr>
+              <w:spacing w:after="0" w:before="0"/>
+            </w:pPr>
+            <w:r>
+              <w:rPr>
+                <w:rFonts w:ascii="Arial" w:cs="Arial" w:eastAsia="Arial" w:hAnsi="Arial"/>
+                <w:sz w:val="18"/>
+                <w:szCs w:val="18"/>
+              </w:rPr>
+              <w:t xml:space="preserve"/>
+            </w:r>
+          </w:p>
+        </w:tc>
+        <w:tc>
+          <w:tcPr>
+            <w:tcW w:type="dxa" w:w="1700"/>
             <w:tcBorders>
               <w:top w:val="single" w:color="555555" w:sz="4"/>
               <w:left w:val="single" w:color="555555" w:sz="4"/>
@@ -2402,7 +2335,7 @@
         </w:trPr>
         <w:tc>
           <w:tcPr>
-            <w:tcW w:type="dxa" w:w="3420"/>
+            <w:tcW w:type="dxa" w:w="3920"/>
             <w:tcBorders>
               <w:top w:val="single" w:color="555555" w:sz="4"/>
               <w:left w:val="single" w:color="555555" w:sz="4"/>
@@ -2433,7 +2366,7 @@
         </w:tc>
         <w:tc>
           <w:tcPr>
-            <w:tcW w:type="dxa" w:w="1200"/>
+            <w:tcW w:type="dxa" w:w="1300"/>
             <w:tcBorders>
               <w:top w:val="single" w:color="555555" w:sz="4"/>
               <w:left w:val="single" w:color="555555" w:sz="4"/>
@@ -2459,137 +2392,106 @@
                 <w:sz w:val="18"/>
                 <w:szCs w:val="18"/>
               </w:rPr>
-              <w:t xml:space="preserve">m</w:t>
-            </w:r>
-          </w:p>
-        </w:tc>
-        <w:tc>
-          <w:tcPr>
-            <w:tcW w:type="dxa" w:w="1500"/>
-            <w:tcBorders>
-              <w:top w:val="single" w:color="555555" w:sz="4"/>
-              <w:left w:val="single" w:color="555555" w:sz="4"/>
-              <w:bottom w:val="single" w:color="555555" w:sz="4"/>
-              <w:right w:val="single" w:color="555555" w:sz="4"/>
-            </w:tcBorders>
-            <w:tcMar>
-              <w:top w:type="dxa" w:w="30"/>
-              <w:left w:type="dxa" w:w="60"/>
-              <w:bottom w:type="dxa" w:w="30"/>
-              <w:right w:type="dxa" w:w="60"/>
-            </w:tcMar>
-            <w:vAlign w:val="center"/>
-          </w:tcPr>
-          <w:p>
-            <w:pPr>
-              <w:spacing w:after="0" w:before="0"/>
-            </w:pPr>
-            <w:r>
-              <w:rPr>
-                <w:rFonts w:ascii="Arial" w:cs="Arial" w:eastAsia="Arial" w:hAnsi="Arial"/>
-                <w:sz w:val="18"/>
-                <w:szCs w:val="18"/>
-              </w:rPr>
-              <w:t xml:space="preserve"/>
-            </w:r>
-          </w:p>
-        </w:tc>
-        <w:tc>
-          <w:tcPr>
-            <w:tcW w:type="dxa" w:w="1350"/>
-            <w:tcBorders>
-              <w:top w:val="single" w:color="555555" w:sz="4"/>
-              <w:left w:val="single" w:color="555555" w:sz="4"/>
-              <w:bottom w:val="single" w:color="555555" w:sz="4"/>
-              <w:right w:val="single" w:color="555555" w:sz="4"/>
-            </w:tcBorders>
-            <w:tcMar>
-              <w:top w:type="dxa" w:w="30"/>
-              <w:left w:type="dxa" w:w="60"/>
-              <w:bottom w:type="dxa" w:w="30"/>
-              <w:right w:type="dxa" w:w="60"/>
-            </w:tcMar>
-            <w:vAlign w:val="center"/>
-          </w:tcPr>
-          <w:p>
-            <w:pPr>
-              <w:spacing w:after="0" w:before="0"/>
-            </w:pPr>
-            <w:r>
-              <w:rPr>
-                <w:rFonts w:ascii="Arial" w:cs="Arial" w:eastAsia="Arial" w:hAnsi="Arial"/>
-                <w:sz w:val="18"/>
-                <w:szCs w:val="18"/>
-              </w:rPr>
-              <w:t xml:space="preserve"/>
-            </w:r>
-          </w:p>
-        </w:tc>
-        <w:tc>
-          <w:tcPr>
-            <w:tcW w:type="dxa" w:w="1350"/>
-            <w:tcBorders>
-              <w:top w:val="single" w:color="555555" w:sz="4"/>
-              <w:left w:val="single" w:color="555555" w:sz="4"/>
-              <w:bottom w:val="single" w:color="555555" w:sz="4"/>
-              <w:right w:val="single" w:color="555555" w:sz="4"/>
-            </w:tcBorders>
-            <w:tcMar>
-              <w:top w:type="dxa" w:w="30"/>
-              <w:left w:type="dxa" w:w="60"/>
-              <w:bottom w:type="dxa" w:w="30"/>
-              <w:right w:type="dxa" w:w="60"/>
-            </w:tcMar>
-            <w:vAlign w:val="center"/>
-          </w:tcPr>
-          <w:p>
-            <w:pPr>
-              <w:spacing w:after="0" w:before="0"/>
-            </w:pPr>
-            <w:r>
-              <w:rPr>
-                <w:rFonts w:ascii="Arial" w:cs="Arial" w:eastAsia="Arial" w:hAnsi="Arial"/>
-                <w:sz w:val="18"/>
-                <w:szCs w:val="18"/>
-              </w:rPr>
-              <w:t xml:space="preserve"/>
-            </w:r>
-          </w:p>
-        </w:tc>
-        <w:tc>
-          <w:tcPr>
-            <w:tcW w:type="dxa" w:w="1200"/>
-            <w:tcBorders>
-              <w:top w:val="single" w:color="555555" w:sz="4"/>
-              <w:left w:val="single" w:color="555555" w:sz="4"/>
-              <w:bottom w:val="single" w:color="555555" w:sz="4"/>
-              <w:right w:val="single" w:color="555555" w:sz="4"/>
-            </w:tcBorders>
-            <w:tcMar>
-              <w:top w:type="dxa" w:w="30"/>
-              <w:left w:type="dxa" w:w="60"/>
-              <w:bottom w:type="dxa" w:w="30"/>
-              <w:right w:type="dxa" w:w="60"/>
-            </w:tcMar>
-            <w:vAlign w:val="center"/>
-          </w:tcPr>
-          <w:p>
-            <w:pPr>
-              <w:spacing w:after="0" w:before="0"/>
-            </w:pPr>
-            <w:r>
-              <w:rPr>
-                <w:rFonts w:ascii="Arial" w:cs="Arial" w:eastAsia="Arial" w:hAnsi="Arial"/>
-                <w:sz w:val="18"/>
-                <w:szCs w:val="18"/>
-              </w:rPr>
-              <w:t xml:space="preserve"/>
-            </w:r>
-          </w:p>
-        </w:tc>
-        <w:tc>
-          <w:tcPr>
-            <w:tcW w:type="dxa" w:w="1500"/>
+              <w:t xml:space="preserve">m lineal</w:t>
+            </w:r>
+          </w:p>
+        </w:tc>
+        <w:tc>
+          <w:tcPr>
+            <w:tcW w:type="dxa" w:w="1600"/>
+            <w:tcBorders>
+              <w:top w:val="single" w:color="555555" w:sz="4"/>
+              <w:left w:val="single" w:color="555555" w:sz="4"/>
+              <w:bottom w:val="single" w:color="555555" w:sz="4"/>
+              <w:right w:val="single" w:color="555555" w:sz="4"/>
+            </w:tcBorders>
+            <w:tcMar>
+              <w:top w:type="dxa" w:w="30"/>
+              <w:left w:type="dxa" w:w="60"/>
+              <w:bottom w:type="dxa" w:w="30"/>
+              <w:right w:type="dxa" w:w="60"/>
+            </w:tcMar>
+            <w:vAlign w:val="center"/>
+          </w:tcPr>
+          <w:p>
+            <w:pPr>
+              <w:spacing w:after="0" w:before="0"/>
+            </w:pPr>
+            <w:r>
+              <w:rPr>
+                <w:rFonts w:ascii="Arial" w:cs="Arial" w:eastAsia="Arial" w:hAnsi="Arial"/>
+                <w:sz w:val="18"/>
+                <w:szCs w:val="18"/>
+              </w:rPr>
+              <w:t xml:space="preserve"/>
+            </w:r>
+          </w:p>
+        </w:tc>
+        <w:tc>
+          <w:tcPr>
+            <w:tcW w:type="dxa" w:w="1600"/>
+            <w:tcBorders>
+              <w:top w:val="single" w:color="555555" w:sz="4"/>
+              <w:left w:val="single" w:color="555555" w:sz="4"/>
+              <w:bottom w:val="single" w:color="555555" w:sz="4"/>
+              <w:right w:val="single" w:color="555555" w:sz="4"/>
+            </w:tcBorders>
+            <w:tcMar>
+              <w:top w:type="dxa" w:w="30"/>
+              <w:left w:type="dxa" w:w="60"/>
+              <w:bottom w:type="dxa" w:w="30"/>
+              <w:right w:type="dxa" w:w="60"/>
+            </w:tcMar>
+            <w:vAlign w:val="center"/>
+          </w:tcPr>
+          <w:p>
+            <w:pPr>
+              <w:spacing w:after="0" w:before="0"/>
+            </w:pPr>
+            <w:r>
+              <w:rPr>
+                <w:rFonts w:ascii="Arial" w:cs="Arial" w:eastAsia="Arial" w:hAnsi="Arial"/>
+                <w:sz w:val="18"/>
+                <w:szCs w:val="18"/>
+              </w:rPr>
+              <w:t xml:space="preserve"/>
+            </w:r>
+          </w:p>
+        </w:tc>
+        <w:tc>
+          <w:tcPr>
+            <w:tcW w:type="dxa" w:w="1400"/>
+            <w:tcBorders>
+              <w:top w:val="single" w:color="555555" w:sz="4"/>
+              <w:left w:val="single" w:color="555555" w:sz="4"/>
+              <w:bottom w:val="single" w:color="555555" w:sz="4"/>
+              <w:right w:val="single" w:color="555555" w:sz="4"/>
+            </w:tcBorders>
+            <w:tcMar>
+              <w:top w:type="dxa" w:w="30"/>
+              <w:left w:type="dxa" w:w="60"/>
+              <w:bottom w:type="dxa" w:w="30"/>
+              <w:right w:type="dxa" w:w="60"/>
+            </w:tcMar>
+            <w:vAlign w:val="center"/>
+          </w:tcPr>
+          <w:p>
+            <w:pPr>
+              <w:spacing w:after="0" w:before="0"/>
+            </w:pPr>
+            <w:r>
+              <w:rPr>
+                <w:rFonts w:ascii="Arial" w:cs="Arial" w:eastAsia="Arial" w:hAnsi="Arial"/>
+                <w:sz w:val="18"/>
+                <w:szCs w:val="18"/>
+              </w:rPr>
+              <w:t xml:space="preserve"/>
+            </w:r>
+          </w:p>
+        </w:tc>
+        <w:tc>
+          <w:tcPr>
+            <w:tcW w:type="dxa" w:w="1700"/>
             <w:tcBorders>
               <w:top w:val="single" w:color="555555" w:sz="4"/>
               <w:left w:val="single" w:color="555555" w:sz="4"/>
@@ -2625,7 +2527,7 @@
         </w:trPr>
         <w:tc>
           <w:tcPr>
-            <w:tcW w:type="dxa" w:w="3420"/>
+            <w:tcW w:type="dxa" w:w="3920"/>
             <w:tcBorders>
               <w:top w:val="single" w:color="555555" w:sz="4"/>
               <w:left w:val="single" w:color="555555" w:sz="4"/>
@@ -2656,7 +2558,7 @@
         </w:tc>
         <w:tc>
           <w:tcPr>
-            <w:tcW w:type="dxa" w:w="1200"/>
+            <w:tcW w:type="dxa" w:w="1300"/>
             <w:tcBorders>
               <w:top w:val="single" w:color="555555" w:sz="4"/>
               <w:left w:val="single" w:color="555555" w:sz="4"/>
@@ -2682,137 +2584,106 @@
                 <w:sz w:val="18"/>
                 <w:szCs w:val="18"/>
               </w:rPr>
-              <w:t xml:space="preserve">m</w:t>
-            </w:r>
-          </w:p>
-        </w:tc>
-        <w:tc>
-          <w:tcPr>
-            <w:tcW w:type="dxa" w:w="1500"/>
-            <w:tcBorders>
-              <w:top w:val="single" w:color="555555" w:sz="4"/>
-              <w:left w:val="single" w:color="555555" w:sz="4"/>
-              <w:bottom w:val="single" w:color="555555" w:sz="4"/>
-              <w:right w:val="single" w:color="555555" w:sz="4"/>
-            </w:tcBorders>
-            <w:tcMar>
-              <w:top w:type="dxa" w:w="30"/>
-              <w:left w:type="dxa" w:w="60"/>
-              <w:bottom w:type="dxa" w:w="30"/>
-              <w:right w:type="dxa" w:w="60"/>
-            </w:tcMar>
-            <w:vAlign w:val="center"/>
-          </w:tcPr>
-          <w:p>
-            <w:pPr>
-              <w:spacing w:after="0" w:before="0"/>
-            </w:pPr>
-            <w:r>
-              <w:rPr>
-                <w:rFonts w:ascii="Arial" w:cs="Arial" w:eastAsia="Arial" w:hAnsi="Arial"/>
-                <w:sz w:val="18"/>
-                <w:szCs w:val="18"/>
-              </w:rPr>
-              <w:t xml:space="preserve"/>
-            </w:r>
-          </w:p>
-        </w:tc>
-        <w:tc>
-          <w:tcPr>
-            <w:tcW w:type="dxa" w:w="1350"/>
-            <w:tcBorders>
-              <w:top w:val="single" w:color="555555" w:sz="4"/>
-              <w:left w:val="single" w:color="555555" w:sz="4"/>
-              <w:bottom w:val="single" w:color="555555" w:sz="4"/>
-              <w:right w:val="single" w:color="555555" w:sz="4"/>
-            </w:tcBorders>
-            <w:tcMar>
-              <w:top w:type="dxa" w:w="30"/>
-              <w:left w:type="dxa" w:w="60"/>
-              <w:bottom w:type="dxa" w:w="30"/>
-              <w:right w:type="dxa" w:w="60"/>
-            </w:tcMar>
-            <w:vAlign w:val="center"/>
-          </w:tcPr>
-          <w:p>
-            <w:pPr>
-              <w:spacing w:after="0" w:before="0"/>
-            </w:pPr>
-            <w:r>
-              <w:rPr>
-                <w:rFonts w:ascii="Arial" w:cs="Arial" w:eastAsia="Arial" w:hAnsi="Arial"/>
-                <w:sz w:val="18"/>
-                <w:szCs w:val="18"/>
-              </w:rPr>
-              <w:t xml:space="preserve"/>
-            </w:r>
-          </w:p>
-        </w:tc>
-        <w:tc>
-          <w:tcPr>
-            <w:tcW w:type="dxa" w:w="1350"/>
-            <w:tcBorders>
-              <w:top w:val="single" w:color="555555" w:sz="4"/>
-              <w:left w:val="single" w:color="555555" w:sz="4"/>
-              <w:bottom w:val="single" w:color="555555" w:sz="4"/>
-              <w:right w:val="single" w:color="555555" w:sz="4"/>
-            </w:tcBorders>
-            <w:tcMar>
-              <w:top w:type="dxa" w:w="30"/>
-              <w:left w:type="dxa" w:w="60"/>
-              <w:bottom w:type="dxa" w:w="30"/>
-              <w:right w:type="dxa" w:w="60"/>
-            </w:tcMar>
-            <w:vAlign w:val="center"/>
-          </w:tcPr>
-          <w:p>
-            <w:pPr>
-              <w:spacing w:after="0" w:before="0"/>
-            </w:pPr>
-            <w:r>
-              <w:rPr>
-                <w:rFonts w:ascii="Arial" w:cs="Arial" w:eastAsia="Arial" w:hAnsi="Arial"/>
-                <w:sz w:val="18"/>
-                <w:szCs w:val="18"/>
-              </w:rPr>
-              <w:t xml:space="preserve"/>
-            </w:r>
-          </w:p>
-        </w:tc>
-        <w:tc>
-          <w:tcPr>
-            <w:tcW w:type="dxa" w:w="1200"/>
-            <w:tcBorders>
-              <w:top w:val="single" w:color="555555" w:sz="4"/>
-              <w:left w:val="single" w:color="555555" w:sz="4"/>
-              <w:bottom w:val="single" w:color="555555" w:sz="4"/>
-              <w:right w:val="single" w:color="555555" w:sz="4"/>
-            </w:tcBorders>
-            <w:tcMar>
-              <w:top w:type="dxa" w:w="30"/>
-              <w:left w:type="dxa" w:w="60"/>
-              <w:bottom w:type="dxa" w:w="30"/>
-              <w:right w:type="dxa" w:w="60"/>
-            </w:tcMar>
-            <w:vAlign w:val="center"/>
-          </w:tcPr>
-          <w:p>
-            <w:pPr>
-              <w:spacing w:after="0" w:before="0"/>
-            </w:pPr>
-            <w:r>
-              <w:rPr>
-                <w:rFonts w:ascii="Arial" w:cs="Arial" w:eastAsia="Arial" w:hAnsi="Arial"/>
-                <w:sz w:val="18"/>
-                <w:szCs w:val="18"/>
-              </w:rPr>
-              <w:t xml:space="preserve"/>
-            </w:r>
-          </w:p>
-        </w:tc>
-        <w:tc>
-          <w:tcPr>
-            <w:tcW w:type="dxa" w:w="1500"/>
+              <w:t xml:space="preserve">m lineal</w:t>
+            </w:r>
+          </w:p>
+        </w:tc>
+        <w:tc>
+          <w:tcPr>
+            <w:tcW w:type="dxa" w:w="1600"/>
+            <w:tcBorders>
+              <w:top w:val="single" w:color="555555" w:sz="4"/>
+              <w:left w:val="single" w:color="555555" w:sz="4"/>
+              <w:bottom w:val="single" w:color="555555" w:sz="4"/>
+              <w:right w:val="single" w:color="555555" w:sz="4"/>
+            </w:tcBorders>
+            <w:tcMar>
+              <w:top w:type="dxa" w:w="30"/>
+              <w:left w:type="dxa" w:w="60"/>
+              <w:bottom w:type="dxa" w:w="30"/>
+              <w:right w:type="dxa" w:w="60"/>
+            </w:tcMar>
+            <w:vAlign w:val="center"/>
+          </w:tcPr>
+          <w:p>
+            <w:pPr>
+              <w:spacing w:after="0" w:before="0"/>
+            </w:pPr>
+            <w:r>
+              <w:rPr>
+                <w:rFonts w:ascii="Arial" w:cs="Arial" w:eastAsia="Arial" w:hAnsi="Arial"/>
+                <w:sz w:val="18"/>
+                <w:szCs w:val="18"/>
+              </w:rPr>
+              <w:t xml:space="preserve"/>
+            </w:r>
+          </w:p>
+        </w:tc>
+        <w:tc>
+          <w:tcPr>
+            <w:tcW w:type="dxa" w:w="1600"/>
+            <w:tcBorders>
+              <w:top w:val="single" w:color="555555" w:sz="4"/>
+              <w:left w:val="single" w:color="555555" w:sz="4"/>
+              <w:bottom w:val="single" w:color="555555" w:sz="4"/>
+              <w:right w:val="single" w:color="555555" w:sz="4"/>
+            </w:tcBorders>
+            <w:tcMar>
+              <w:top w:type="dxa" w:w="30"/>
+              <w:left w:type="dxa" w:w="60"/>
+              <w:bottom w:type="dxa" w:w="30"/>
+              <w:right w:type="dxa" w:w="60"/>
+            </w:tcMar>
+            <w:vAlign w:val="center"/>
+          </w:tcPr>
+          <w:p>
+            <w:pPr>
+              <w:spacing w:after="0" w:before="0"/>
+            </w:pPr>
+            <w:r>
+              <w:rPr>
+                <w:rFonts w:ascii="Arial" w:cs="Arial" w:eastAsia="Arial" w:hAnsi="Arial"/>
+                <w:sz w:val="18"/>
+                <w:szCs w:val="18"/>
+              </w:rPr>
+              <w:t xml:space="preserve"/>
+            </w:r>
+          </w:p>
+        </w:tc>
+        <w:tc>
+          <w:tcPr>
+            <w:tcW w:type="dxa" w:w="1400"/>
+            <w:tcBorders>
+              <w:top w:val="single" w:color="555555" w:sz="4"/>
+              <w:left w:val="single" w:color="555555" w:sz="4"/>
+              <w:bottom w:val="single" w:color="555555" w:sz="4"/>
+              <w:right w:val="single" w:color="555555" w:sz="4"/>
+            </w:tcBorders>
+            <w:tcMar>
+              <w:top w:type="dxa" w:w="30"/>
+              <w:left w:type="dxa" w:w="60"/>
+              <w:bottom w:type="dxa" w:w="30"/>
+              <w:right w:type="dxa" w:w="60"/>
+            </w:tcMar>
+            <w:vAlign w:val="center"/>
+          </w:tcPr>
+          <w:p>
+            <w:pPr>
+              <w:spacing w:after="0" w:before="0"/>
+            </w:pPr>
+            <w:r>
+              <w:rPr>
+                <w:rFonts w:ascii="Arial" w:cs="Arial" w:eastAsia="Arial" w:hAnsi="Arial"/>
+                <w:sz w:val="18"/>
+                <w:szCs w:val="18"/>
+              </w:rPr>
+              <w:t xml:space="preserve"/>
+            </w:r>
+          </w:p>
+        </w:tc>
+        <w:tc>
+          <w:tcPr>
+            <w:tcW w:type="dxa" w:w="1700"/>
             <w:tcBorders>
               <w:top w:val="single" w:color="555555" w:sz="4"/>
               <w:left w:val="single" w:color="555555" w:sz="4"/>
@@ -2848,7 +2719,7 @@
         </w:trPr>
         <w:tc>
           <w:tcPr>
-            <w:tcW w:type="dxa" w:w="3420"/>
+            <w:tcW w:type="dxa" w:w="3920"/>
             <w:tcBorders>
               <w:top w:val="single" w:color="555555" w:sz="4"/>
               <w:left w:val="single" w:color="555555" w:sz="4"/>
@@ -2879,7 +2750,7 @@
         </w:tc>
         <w:tc>
           <w:tcPr>
-            <w:tcW w:type="dxa" w:w="1200"/>
+            <w:tcW w:type="dxa" w:w="1300"/>
             <w:tcBorders>
               <w:top w:val="single" w:color="555555" w:sz="4"/>
               <w:left w:val="single" w:color="555555" w:sz="4"/>
@@ -2905,137 +2776,106 @@
                 <w:sz w:val="18"/>
                 <w:szCs w:val="18"/>
               </w:rPr>
-              <w:t xml:space="preserve">m</w:t>
-            </w:r>
-          </w:p>
-        </w:tc>
-        <w:tc>
-          <w:tcPr>
-            <w:tcW w:type="dxa" w:w="1500"/>
-            <w:tcBorders>
-              <w:top w:val="single" w:color="555555" w:sz="4"/>
-              <w:left w:val="single" w:color="555555" w:sz="4"/>
-              <w:bottom w:val="single" w:color="555555" w:sz="4"/>
-              <w:right w:val="single" w:color="555555" w:sz="4"/>
-            </w:tcBorders>
-            <w:tcMar>
-              <w:top w:type="dxa" w:w="30"/>
-              <w:left w:type="dxa" w:w="60"/>
-              <w:bottom w:type="dxa" w:w="30"/>
-              <w:right w:type="dxa" w:w="60"/>
-            </w:tcMar>
-            <w:vAlign w:val="center"/>
-          </w:tcPr>
-          <w:p>
-            <w:pPr>
-              <w:spacing w:after="0" w:before="0"/>
-            </w:pPr>
-            <w:r>
-              <w:rPr>
-                <w:rFonts w:ascii="Arial" w:cs="Arial" w:eastAsia="Arial" w:hAnsi="Arial"/>
-                <w:sz w:val="18"/>
-                <w:szCs w:val="18"/>
-              </w:rPr>
-              <w:t xml:space="preserve"/>
-            </w:r>
-          </w:p>
-        </w:tc>
-        <w:tc>
-          <w:tcPr>
-            <w:tcW w:type="dxa" w:w="1350"/>
-            <w:tcBorders>
-              <w:top w:val="single" w:color="555555" w:sz="4"/>
-              <w:left w:val="single" w:color="555555" w:sz="4"/>
-              <w:bottom w:val="single" w:color="555555" w:sz="4"/>
-              <w:right w:val="single" w:color="555555" w:sz="4"/>
-            </w:tcBorders>
-            <w:tcMar>
-              <w:top w:type="dxa" w:w="30"/>
-              <w:left w:type="dxa" w:w="60"/>
-              <w:bottom w:type="dxa" w:w="30"/>
-              <w:right w:type="dxa" w:w="60"/>
-            </w:tcMar>
-            <w:vAlign w:val="center"/>
-          </w:tcPr>
-          <w:p>
-            <w:pPr>
-              <w:spacing w:after="0" w:before="0"/>
-            </w:pPr>
-            <w:r>
-              <w:rPr>
-                <w:rFonts w:ascii="Arial" w:cs="Arial" w:eastAsia="Arial" w:hAnsi="Arial"/>
-                <w:sz w:val="18"/>
-                <w:szCs w:val="18"/>
-              </w:rPr>
-              <w:t xml:space="preserve"/>
-            </w:r>
-          </w:p>
-        </w:tc>
-        <w:tc>
-          <w:tcPr>
-            <w:tcW w:type="dxa" w:w="1350"/>
-            <w:tcBorders>
-              <w:top w:val="single" w:color="555555" w:sz="4"/>
-              <w:left w:val="single" w:color="555555" w:sz="4"/>
-              <w:bottom w:val="single" w:color="555555" w:sz="4"/>
-              <w:right w:val="single" w:color="555555" w:sz="4"/>
-            </w:tcBorders>
-            <w:tcMar>
-              <w:top w:type="dxa" w:w="30"/>
-              <w:left w:type="dxa" w:w="60"/>
-              <w:bottom w:type="dxa" w:w="30"/>
-              <w:right w:type="dxa" w:w="60"/>
-            </w:tcMar>
-            <w:vAlign w:val="center"/>
-          </w:tcPr>
-          <w:p>
-            <w:pPr>
-              <w:spacing w:after="0" w:before="0"/>
-            </w:pPr>
-            <w:r>
-              <w:rPr>
-                <w:rFonts w:ascii="Arial" w:cs="Arial" w:eastAsia="Arial" w:hAnsi="Arial"/>
-                <w:sz w:val="18"/>
-                <w:szCs w:val="18"/>
-              </w:rPr>
-              <w:t xml:space="preserve"/>
-            </w:r>
-          </w:p>
-        </w:tc>
-        <w:tc>
-          <w:tcPr>
-            <w:tcW w:type="dxa" w:w="1200"/>
-            <w:tcBorders>
-              <w:top w:val="single" w:color="555555" w:sz="4"/>
-              <w:left w:val="single" w:color="555555" w:sz="4"/>
-              <w:bottom w:val="single" w:color="555555" w:sz="4"/>
-              <w:right w:val="single" w:color="555555" w:sz="4"/>
-            </w:tcBorders>
-            <w:tcMar>
-              <w:top w:type="dxa" w:w="30"/>
-              <w:left w:type="dxa" w:w="60"/>
-              <w:bottom w:type="dxa" w:w="30"/>
-              <w:right w:type="dxa" w:w="60"/>
-            </w:tcMar>
-            <w:vAlign w:val="center"/>
-          </w:tcPr>
-          <w:p>
-            <w:pPr>
-              <w:spacing w:after="0" w:before="0"/>
-            </w:pPr>
-            <w:r>
-              <w:rPr>
-                <w:rFonts w:ascii="Arial" w:cs="Arial" w:eastAsia="Arial" w:hAnsi="Arial"/>
-                <w:sz w:val="18"/>
-                <w:szCs w:val="18"/>
-              </w:rPr>
-              <w:t xml:space="preserve"/>
-            </w:r>
-          </w:p>
-        </w:tc>
-        <w:tc>
-          <w:tcPr>
-            <w:tcW w:type="dxa" w:w="1500"/>
+              <w:t xml:space="preserve">m lineal</w:t>
+            </w:r>
+          </w:p>
+        </w:tc>
+        <w:tc>
+          <w:tcPr>
+            <w:tcW w:type="dxa" w:w="1600"/>
+            <w:tcBorders>
+              <w:top w:val="single" w:color="555555" w:sz="4"/>
+              <w:left w:val="single" w:color="555555" w:sz="4"/>
+              <w:bottom w:val="single" w:color="555555" w:sz="4"/>
+              <w:right w:val="single" w:color="555555" w:sz="4"/>
+            </w:tcBorders>
+            <w:tcMar>
+              <w:top w:type="dxa" w:w="30"/>
+              <w:left w:type="dxa" w:w="60"/>
+              <w:bottom w:type="dxa" w:w="30"/>
+              <w:right w:type="dxa" w:w="60"/>
+            </w:tcMar>
+            <w:vAlign w:val="center"/>
+          </w:tcPr>
+          <w:p>
+            <w:pPr>
+              <w:spacing w:after="0" w:before="0"/>
+            </w:pPr>
+            <w:r>
+              <w:rPr>
+                <w:rFonts w:ascii="Arial" w:cs="Arial" w:eastAsia="Arial" w:hAnsi="Arial"/>
+                <w:sz w:val="18"/>
+                <w:szCs w:val="18"/>
+              </w:rPr>
+              <w:t xml:space="preserve"/>
+            </w:r>
+          </w:p>
+        </w:tc>
+        <w:tc>
+          <w:tcPr>
+            <w:tcW w:type="dxa" w:w="1600"/>
+            <w:tcBorders>
+              <w:top w:val="single" w:color="555555" w:sz="4"/>
+              <w:left w:val="single" w:color="555555" w:sz="4"/>
+              <w:bottom w:val="single" w:color="555555" w:sz="4"/>
+              <w:right w:val="single" w:color="555555" w:sz="4"/>
+            </w:tcBorders>
+            <w:tcMar>
+              <w:top w:type="dxa" w:w="30"/>
+              <w:left w:type="dxa" w:w="60"/>
+              <w:bottom w:type="dxa" w:w="30"/>
+              <w:right w:type="dxa" w:w="60"/>
+            </w:tcMar>
+            <w:vAlign w:val="center"/>
+          </w:tcPr>
+          <w:p>
+            <w:pPr>
+              <w:spacing w:after="0" w:before="0"/>
+            </w:pPr>
+            <w:r>
+              <w:rPr>
+                <w:rFonts w:ascii="Arial" w:cs="Arial" w:eastAsia="Arial" w:hAnsi="Arial"/>
+                <w:sz w:val="18"/>
+                <w:szCs w:val="18"/>
+              </w:rPr>
+              <w:t xml:space="preserve"/>
+            </w:r>
+          </w:p>
+        </w:tc>
+        <w:tc>
+          <w:tcPr>
+            <w:tcW w:type="dxa" w:w="1400"/>
+            <w:tcBorders>
+              <w:top w:val="single" w:color="555555" w:sz="4"/>
+              <w:left w:val="single" w:color="555555" w:sz="4"/>
+              <w:bottom w:val="single" w:color="555555" w:sz="4"/>
+              <w:right w:val="single" w:color="555555" w:sz="4"/>
+            </w:tcBorders>
+            <w:tcMar>
+              <w:top w:type="dxa" w:w="30"/>
+              <w:left w:type="dxa" w:w="60"/>
+              <w:bottom w:type="dxa" w:w="30"/>
+              <w:right w:type="dxa" w:w="60"/>
+            </w:tcMar>
+            <w:vAlign w:val="center"/>
+          </w:tcPr>
+          <w:p>
+            <w:pPr>
+              <w:spacing w:after="0" w:before="0"/>
+            </w:pPr>
+            <w:r>
+              <w:rPr>
+                <w:rFonts w:ascii="Arial" w:cs="Arial" w:eastAsia="Arial" w:hAnsi="Arial"/>
+                <w:sz w:val="18"/>
+                <w:szCs w:val="18"/>
+              </w:rPr>
+              <w:t xml:space="preserve"/>
+            </w:r>
+          </w:p>
+        </w:tc>
+        <w:tc>
+          <w:tcPr>
+            <w:tcW w:type="dxa" w:w="1700"/>
             <w:tcBorders>
               <w:top w:val="single" w:color="555555" w:sz="4"/>
               <w:left w:val="single" w:color="555555" w:sz="4"/>
@@ -3071,7 +2911,7 @@
         </w:trPr>
         <w:tc>
           <w:tcPr>
-            <w:tcW w:type="dxa" w:w="3420"/>
+            <w:tcW w:type="dxa" w:w="3920"/>
             <w:tcBorders>
               <w:top w:val="single" w:color="555555" w:sz="4"/>
               <w:left w:val="single" w:color="555555" w:sz="4"/>
@@ -3102,7 +2942,7 @@
         </w:tc>
         <w:tc>
           <w:tcPr>
-            <w:tcW w:type="dxa" w:w="1200"/>
+            <w:tcW w:type="dxa" w:w="1300"/>
             <w:tcBorders>
               <w:top w:val="single" w:color="555555" w:sz="4"/>
               <w:left w:val="single" w:color="555555" w:sz="4"/>
@@ -3128,137 +2968,106 @@
                 <w:sz w:val="18"/>
                 <w:szCs w:val="18"/>
               </w:rPr>
-              <w:t xml:space="preserve">m³ / bolsas</w:t>
-            </w:r>
-          </w:p>
-        </w:tc>
-        <w:tc>
-          <w:tcPr>
-            <w:tcW w:type="dxa" w:w="1500"/>
-            <w:tcBorders>
-              <w:top w:val="single" w:color="555555" w:sz="4"/>
-              <w:left w:val="single" w:color="555555" w:sz="4"/>
-              <w:bottom w:val="single" w:color="555555" w:sz="4"/>
-              <w:right w:val="single" w:color="555555" w:sz="4"/>
-            </w:tcBorders>
-            <w:tcMar>
-              <w:top w:type="dxa" w:w="30"/>
-              <w:left w:type="dxa" w:w="60"/>
-              <w:bottom w:type="dxa" w:w="30"/>
-              <w:right w:type="dxa" w:w="60"/>
-            </w:tcMar>
-            <w:vAlign w:val="center"/>
-          </w:tcPr>
-          <w:p>
-            <w:pPr>
-              <w:spacing w:after="0" w:before="0"/>
-            </w:pPr>
-            <w:r>
-              <w:rPr>
-                <w:rFonts w:ascii="Arial" w:cs="Arial" w:eastAsia="Arial" w:hAnsi="Arial"/>
-                <w:sz w:val="18"/>
-                <w:szCs w:val="18"/>
-              </w:rPr>
-              <w:t xml:space="preserve"/>
-            </w:r>
-          </w:p>
-        </w:tc>
-        <w:tc>
-          <w:tcPr>
-            <w:tcW w:type="dxa" w:w="1350"/>
-            <w:tcBorders>
-              <w:top w:val="single" w:color="555555" w:sz="4"/>
-              <w:left w:val="single" w:color="555555" w:sz="4"/>
-              <w:bottom w:val="single" w:color="555555" w:sz="4"/>
-              <w:right w:val="single" w:color="555555" w:sz="4"/>
-            </w:tcBorders>
-            <w:tcMar>
-              <w:top w:type="dxa" w:w="30"/>
-              <w:left w:type="dxa" w:w="60"/>
-              <w:bottom w:type="dxa" w:w="30"/>
-              <w:right w:type="dxa" w:w="60"/>
-            </w:tcMar>
-            <w:vAlign w:val="center"/>
-          </w:tcPr>
-          <w:p>
-            <w:pPr>
-              <w:spacing w:after="0" w:before="0"/>
-            </w:pPr>
-            <w:r>
-              <w:rPr>
-                <w:rFonts w:ascii="Arial" w:cs="Arial" w:eastAsia="Arial" w:hAnsi="Arial"/>
-                <w:sz w:val="18"/>
-                <w:szCs w:val="18"/>
-              </w:rPr>
-              <w:t xml:space="preserve"/>
-            </w:r>
-          </w:p>
-        </w:tc>
-        <w:tc>
-          <w:tcPr>
-            <w:tcW w:type="dxa" w:w="1350"/>
-            <w:tcBorders>
-              <w:top w:val="single" w:color="555555" w:sz="4"/>
-              <w:left w:val="single" w:color="555555" w:sz="4"/>
-              <w:bottom w:val="single" w:color="555555" w:sz="4"/>
-              <w:right w:val="single" w:color="555555" w:sz="4"/>
-            </w:tcBorders>
-            <w:tcMar>
-              <w:top w:type="dxa" w:w="30"/>
-              <w:left w:type="dxa" w:w="60"/>
-              <w:bottom w:type="dxa" w:w="30"/>
-              <w:right w:type="dxa" w:w="60"/>
-            </w:tcMar>
-            <w:vAlign w:val="center"/>
-          </w:tcPr>
-          <w:p>
-            <w:pPr>
-              <w:spacing w:after="0" w:before="0"/>
-            </w:pPr>
-            <w:r>
-              <w:rPr>
-                <w:rFonts w:ascii="Arial" w:cs="Arial" w:eastAsia="Arial" w:hAnsi="Arial"/>
-                <w:sz w:val="18"/>
-                <w:szCs w:val="18"/>
-              </w:rPr>
-              <w:t xml:space="preserve"/>
-            </w:r>
-          </w:p>
-        </w:tc>
-        <w:tc>
-          <w:tcPr>
-            <w:tcW w:type="dxa" w:w="1200"/>
-            <w:tcBorders>
-              <w:top w:val="single" w:color="555555" w:sz="4"/>
-              <w:left w:val="single" w:color="555555" w:sz="4"/>
-              <w:bottom w:val="single" w:color="555555" w:sz="4"/>
-              <w:right w:val="single" w:color="555555" w:sz="4"/>
-            </w:tcBorders>
-            <w:tcMar>
-              <w:top w:type="dxa" w:w="30"/>
-              <w:left w:type="dxa" w:w="60"/>
-              <w:bottom w:type="dxa" w:w="30"/>
-              <w:right w:type="dxa" w:w="60"/>
-            </w:tcMar>
-            <w:vAlign w:val="center"/>
-          </w:tcPr>
-          <w:p>
-            <w:pPr>
-              <w:spacing w:after="0" w:before="0"/>
-            </w:pPr>
-            <w:r>
-              <w:rPr>
-                <w:rFonts w:ascii="Arial" w:cs="Arial" w:eastAsia="Arial" w:hAnsi="Arial"/>
-                <w:sz w:val="18"/>
-                <w:szCs w:val="18"/>
-              </w:rPr>
-              <w:t xml:space="preserve"/>
-            </w:r>
-          </w:p>
-        </w:tc>
-        <w:tc>
-          <w:tcPr>
-            <w:tcW w:type="dxa" w:w="1500"/>
+              <w:t xml:space="preserve">bolsas / viajes</w:t>
+            </w:r>
+          </w:p>
+        </w:tc>
+        <w:tc>
+          <w:tcPr>
+            <w:tcW w:type="dxa" w:w="1600"/>
+            <w:tcBorders>
+              <w:top w:val="single" w:color="555555" w:sz="4"/>
+              <w:left w:val="single" w:color="555555" w:sz="4"/>
+              <w:bottom w:val="single" w:color="555555" w:sz="4"/>
+              <w:right w:val="single" w:color="555555" w:sz="4"/>
+            </w:tcBorders>
+            <w:tcMar>
+              <w:top w:type="dxa" w:w="30"/>
+              <w:left w:type="dxa" w:w="60"/>
+              <w:bottom w:type="dxa" w:w="30"/>
+              <w:right w:type="dxa" w:w="60"/>
+            </w:tcMar>
+            <w:vAlign w:val="center"/>
+          </w:tcPr>
+          <w:p>
+            <w:pPr>
+              <w:spacing w:after="0" w:before="0"/>
+            </w:pPr>
+            <w:r>
+              <w:rPr>
+                <w:rFonts w:ascii="Arial" w:cs="Arial" w:eastAsia="Arial" w:hAnsi="Arial"/>
+                <w:sz w:val="18"/>
+                <w:szCs w:val="18"/>
+              </w:rPr>
+              <w:t xml:space="preserve"/>
+            </w:r>
+          </w:p>
+        </w:tc>
+        <w:tc>
+          <w:tcPr>
+            <w:tcW w:type="dxa" w:w="1600"/>
+            <w:tcBorders>
+              <w:top w:val="single" w:color="555555" w:sz="4"/>
+              <w:left w:val="single" w:color="555555" w:sz="4"/>
+              <w:bottom w:val="single" w:color="555555" w:sz="4"/>
+              <w:right w:val="single" w:color="555555" w:sz="4"/>
+            </w:tcBorders>
+            <w:tcMar>
+              <w:top w:type="dxa" w:w="30"/>
+              <w:left w:type="dxa" w:w="60"/>
+              <w:bottom w:type="dxa" w:w="30"/>
+              <w:right w:type="dxa" w:w="60"/>
+            </w:tcMar>
+            <w:vAlign w:val="center"/>
+          </w:tcPr>
+          <w:p>
+            <w:pPr>
+              <w:spacing w:after="0" w:before="0"/>
+            </w:pPr>
+            <w:r>
+              <w:rPr>
+                <w:rFonts w:ascii="Arial" w:cs="Arial" w:eastAsia="Arial" w:hAnsi="Arial"/>
+                <w:sz w:val="18"/>
+                <w:szCs w:val="18"/>
+              </w:rPr>
+              <w:t xml:space="preserve"/>
+            </w:r>
+          </w:p>
+        </w:tc>
+        <w:tc>
+          <w:tcPr>
+            <w:tcW w:type="dxa" w:w="1400"/>
+            <w:tcBorders>
+              <w:top w:val="single" w:color="555555" w:sz="4"/>
+              <w:left w:val="single" w:color="555555" w:sz="4"/>
+              <w:bottom w:val="single" w:color="555555" w:sz="4"/>
+              <w:right w:val="single" w:color="555555" w:sz="4"/>
+            </w:tcBorders>
+            <w:tcMar>
+              <w:top w:type="dxa" w:w="30"/>
+              <w:left w:type="dxa" w:w="60"/>
+              <w:bottom w:type="dxa" w:w="30"/>
+              <w:right w:type="dxa" w:w="60"/>
+            </w:tcMar>
+            <w:vAlign w:val="center"/>
+          </w:tcPr>
+          <w:p>
+            <w:pPr>
+              <w:spacing w:after="0" w:before="0"/>
+            </w:pPr>
+            <w:r>
+              <w:rPr>
+                <w:rFonts w:ascii="Arial" w:cs="Arial" w:eastAsia="Arial" w:hAnsi="Arial"/>
+                <w:sz w:val="18"/>
+                <w:szCs w:val="18"/>
+              </w:rPr>
+              <w:t xml:space="preserve"/>
+            </w:r>
+          </w:p>
+        </w:tc>
+        <w:tc>
+          <w:tcPr>
+            <w:tcW w:type="dxa" w:w="1700"/>
             <w:tcBorders>
               <w:top w:val="single" w:color="555555" w:sz="4"/>
               <w:left w:val="single" w:color="555555" w:sz="4"/>
@@ -3294,7 +3103,7 @@
         </w:trPr>
         <w:tc>
           <w:tcPr>
-            <w:tcW w:type="dxa" w:w="3420"/>
+            <w:tcW w:type="dxa" w:w="3920"/>
             <w:tcBorders>
               <w:top w:val="single" w:color="555555" w:sz="4"/>
               <w:left w:val="single" w:color="555555" w:sz="4"/>
@@ -3325,7 +3134,7 @@
         </w:tc>
         <w:tc>
           <w:tcPr>
-            <w:tcW w:type="dxa" w:w="1200"/>
+            <w:tcW w:type="dxa" w:w="1300"/>
             <w:tcBorders>
               <w:top w:val="single" w:color="555555" w:sz="4"/>
               <w:left w:val="single" w:color="555555" w:sz="4"/>
@@ -3351,137 +3160,106 @@
                 <w:sz w:val="18"/>
                 <w:szCs w:val="18"/>
               </w:rPr>
-              <w:t xml:space="preserve">m³ / bolsas</w:t>
-            </w:r>
-          </w:p>
-        </w:tc>
-        <w:tc>
-          <w:tcPr>
-            <w:tcW w:type="dxa" w:w="1500"/>
-            <w:tcBorders>
-              <w:top w:val="single" w:color="555555" w:sz="4"/>
-              <w:left w:val="single" w:color="555555" w:sz="4"/>
-              <w:bottom w:val="single" w:color="555555" w:sz="4"/>
-              <w:right w:val="single" w:color="555555" w:sz="4"/>
-            </w:tcBorders>
-            <w:tcMar>
-              <w:top w:type="dxa" w:w="30"/>
-              <w:left w:type="dxa" w:w="60"/>
-              <w:bottom w:type="dxa" w:w="30"/>
-              <w:right w:type="dxa" w:w="60"/>
-            </w:tcMar>
-            <w:vAlign w:val="center"/>
-          </w:tcPr>
-          <w:p>
-            <w:pPr>
-              <w:spacing w:after="0" w:before="0"/>
-            </w:pPr>
-            <w:r>
-              <w:rPr>
-                <w:rFonts w:ascii="Arial" w:cs="Arial" w:eastAsia="Arial" w:hAnsi="Arial"/>
-                <w:sz w:val="18"/>
-                <w:szCs w:val="18"/>
-              </w:rPr>
-              <w:t xml:space="preserve"/>
-            </w:r>
-          </w:p>
-        </w:tc>
-        <w:tc>
-          <w:tcPr>
-            <w:tcW w:type="dxa" w:w="1350"/>
-            <w:tcBorders>
-              <w:top w:val="single" w:color="555555" w:sz="4"/>
-              <w:left w:val="single" w:color="555555" w:sz="4"/>
-              <w:bottom w:val="single" w:color="555555" w:sz="4"/>
-              <w:right w:val="single" w:color="555555" w:sz="4"/>
-            </w:tcBorders>
-            <w:tcMar>
-              <w:top w:type="dxa" w:w="30"/>
-              <w:left w:type="dxa" w:w="60"/>
-              <w:bottom w:type="dxa" w:w="30"/>
-              <w:right w:type="dxa" w:w="60"/>
-            </w:tcMar>
-            <w:vAlign w:val="center"/>
-          </w:tcPr>
-          <w:p>
-            <w:pPr>
-              <w:spacing w:after="0" w:before="0"/>
-            </w:pPr>
-            <w:r>
-              <w:rPr>
-                <w:rFonts w:ascii="Arial" w:cs="Arial" w:eastAsia="Arial" w:hAnsi="Arial"/>
-                <w:sz w:val="18"/>
-                <w:szCs w:val="18"/>
-              </w:rPr>
-              <w:t xml:space="preserve"/>
-            </w:r>
-          </w:p>
-        </w:tc>
-        <w:tc>
-          <w:tcPr>
-            <w:tcW w:type="dxa" w:w="1350"/>
-            <w:tcBorders>
-              <w:top w:val="single" w:color="555555" w:sz="4"/>
-              <w:left w:val="single" w:color="555555" w:sz="4"/>
-              <w:bottom w:val="single" w:color="555555" w:sz="4"/>
-              <w:right w:val="single" w:color="555555" w:sz="4"/>
-            </w:tcBorders>
-            <w:tcMar>
-              <w:top w:type="dxa" w:w="30"/>
-              <w:left w:type="dxa" w:w="60"/>
-              <w:bottom w:type="dxa" w:w="30"/>
-              <w:right w:type="dxa" w:w="60"/>
-            </w:tcMar>
-            <w:vAlign w:val="center"/>
-          </w:tcPr>
-          <w:p>
-            <w:pPr>
-              <w:spacing w:after="0" w:before="0"/>
-            </w:pPr>
-            <w:r>
-              <w:rPr>
-                <w:rFonts w:ascii="Arial" w:cs="Arial" w:eastAsia="Arial" w:hAnsi="Arial"/>
-                <w:sz w:val="18"/>
-                <w:szCs w:val="18"/>
-              </w:rPr>
-              <w:t xml:space="preserve"/>
-            </w:r>
-          </w:p>
-        </w:tc>
-        <w:tc>
-          <w:tcPr>
-            <w:tcW w:type="dxa" w:w="1200"/>
-            <w:tcBorders>
-              <w:top w:val="single" w:color="555555" w:sz="4"/>
-              <w:left w:val="single" w:color="555555" w:sz="4"/>
-              <w:bottom w:val="single" w:color="555555" w:sz="4"/>
-              <w:right w:val="single" w:color="555555" w:sz="4"/>
-            </w:tcBorders>
-            <w:tcMar>
-              <w:top w:type="dxa" w:w="30"/>
-              <w:left w:type="dxa" w:w="60"/>
-              <w:bottom w:type="dxa" w:w="30"/>
-              <w:right w:type="dxa" w:w="60"/>
-            </w:tcMar>
-            <w:vAlign w:val="center"/>
-          </w:tcPr>
-          <w:p>
-            <w:pPr>
-              <w:spacing w:after="0" w:before="0"/>
-            </w:pPr>
-            <w:r>
-              <w:rPr>
-                <w:rFonts w:ascii="Arial" w:cs="Arial" w:eastAsia="Arial" w:hAnsi="Arial"/>
-                <w:sz w:val="18"/>
-                <w:szCs w:val="18"/>
-              </w:rPr>
-              <w:t xml:space="preserve"/>
-            </w:r>
-          </w:p>
-        </w:tc>
-        <w:tc>
-          <w:tcPr>
-            <w:tcW w:type="dxa" w:w="1500"/>
+              <w:t xml:space="preserve">bolsas / viajes</w:t>
+            </w:r>
+          </w:p>
+        </w:tc>
+        <w:tc>
+          <w:tcPr>
+            <w:tcW w:type="dxa" w:w="1600"/>
+            <w:tcBorders>
+              <w:top w:val="single" w:color="555555" w:sz="4"/>
+              <w:left w:val="single" w:color="555555" w:sz="4"/>
+              <w:bottom w:val="single" w:color="555555" w:sz="4"/>
+              <w:right w:val="single" w:color="555555" w:sz="4"/>
+            </w:tcBorders>
+            <w:tcMar>
+              <w:top w:type="dxa" w:w="30"/>
+              <w:left w:type="dxa" w:w="60"/>
+              <w:bottom w:type="dxa" w:w="30"/>
+              <w:right w:type="dxa" w:w="60"/>
+            </w:tcMar>
+            <w:vAlign w:val="center"/>
+          </w:tcPr>
+          <w:p>
+            <w:pPr>
+              <w:spacing w:after="0" w:before="0"/>
+            </w:pPr>
+            <w:r>
+              <w:rPr>
+                <w:rFonts w:ascii="Arial" w:cs="Arial" w:eastAsia="Arial" w:hAnsi="Arial"/>
+                <w:sz w:val="18"/>
+                <w:szCs w:val="18"/>
+              </w:rPr>
+              <w:t xml:space="preserve"/>
+            </w:r>
+          </w:p>
+        </w:tc>
+        <w:tc>
+          <w:tcPr>
+            <w:tcW w:type="dxa" w:w="1600"/>
+            <w:tcBorders>
+              <w:top w:val="single" w:color="555555" w:sz="4"/>
+              <w:left w:val="single" w:color="555555" w:sz="4"/>
+              <w:bottom w:val="single" w:color="555555" w:sz="4"/>
+              <w:right w:val="single" w:color="555555" w:sz="4"/>
+            </w:tcBorders>
+            <w:tcMar>
+              <w:top w:type="dxa" w:w="30"/>
+              <w:left w:type="dxa" w:w="60"/>
+              <w:bottom w:type="dxa" w:w="30"/>
+              <w:right w:type="dxa" w:w="60"/>
+            </w:tcMar>
+            <w:vAlign w:val="center"/>
+          </w:tcPr>
+          <w:p>
+            <w:pPr>
+              <w:spacing w:after="0" w:before="0"/>
+            </w:pPr>
+            <w:r>
+              <w:rPr>
+                <w:rFonts w:ascii="Arial" w:cs="Arial" w:eastAsia="Arial" w:hAnsi="Arial"/>
+                <w:sz w:val="18"/>
+                <w:szCs w:val="18"/>
+              </w:rPr>
+              <w:t xml:space="preserve"/>
+            </w:r>
+          </w:p>
+        </w:tc>
+        <w:tc>
+          <w:tcPr>
+            <w:tcW w:type="dxa" w:w="1400"/>
+            <w:tcBorders>
+              <w:top w:val="single" w:color="555555" w:sz="4"/>
+              <w:left w:val="single" w:color="555555" w:sz="4"/>
+              <w:bottom w:val="single" w:color="555555" w:sz="4"/>
+              <w:right w:val="single" w:color="555555" w:sz="4"/>
+            </w:tcBorders>
+            <w:tcMar>
+              <w:top w:type="dxa" w:w="30"/>
+              <w:left w:type="dxa" w:w="60"/>
+              <w:bottom w:type="dxa" w:w="30"/>
+              <w:right w:type="dxa" w:w="60"/>
+            </w:tcMar>
+            <w:vAlign w:val="center"/>
+          </w:tcPr>
+          <w:p>
+            <w:pPr>
+              <w:spacing w:after="0" w:before="0"/>
+            </w:pPr>
+            <w:r>
+              <w:rPr>
+                <w:rFonts w:ascii="Arial" w:cs="Arial" w:eastAsia="Arial" w:hAnsi="Arial"/>
+                <w:sz w:val="18"/>
+                <w:szCs w:val="18"/>
+              </w:rPr>
+              <w:t xml:space="preserve"/>
+            </w:r>
+          </w:p>
+        </w:tc>
+        <w:tc>
+          <w:tcPr>
+            <w:tcW w:type="dxa" w:w="1700"/>
             <w:tcBorders>
               <w:top w:val="single" w:color="555555" w:sz="4"/>
               <w:left w:val="single" w:color="555555" w:sz="4"/>
@@ -3517,7 +3295,7 @@
         </w:trPr>
         <w:tc>
           <w:tcPr>
-            <w:tcW w:type="dxa" w:w="3420"/>
+            <w:tcW w:type="dxa" w:w="3920"/>
             <w:tcBorders>
               <w:top w:val="single" w:color="555555" w:sz="4"/>
               <w:left w:val="single" w:color="555555" w:sz="4"/>
@@ -3548,7 +3326,7 @@
         </w:tc>
         <w:tc>
           <w:tcPr>
-            <w:tcW w:type="dxa" w:w="1200"/>
+            <w:tcW w:type="dxa" w:w="1300"/>
             <w:tcBorders>
               <w:top w:val="single" w:color="555555" w:sz="4"/>
               <w:left w:val="single" w:color="555555" w:sz="4"/>
@@ -3580,131 +3358,100 @@
         </w:tc>
         <w:tc>
           <w:tcPr>
-            <w:tcW w:type="dxa" w:w="1500"/>
-            <w:tcBorders>
-              <w:top w:val="single" w:color="555555" w:sz="4"/>
-              <w:left w:val="single" w:color="555555" w:sz="4"/>
-              <w:bottom w:val="single" w:color="555555" w:sz="4"/>
-              <w:right w:val="single" w:color="555555" w:sz="4"/>
-            </w:tcBorders>
-            <w:tcMar>
-              <w:top w:type="dxa" w:w="30"/>
-              <w:left w:type="dxa" w:w="60"/>
-              <w:bottom w:type="dxa" w:w="30"/>
-              <w:right w:type="dxa" w:w="60"/>
-            </w:tcMar>
-            <w:vAlign w:val="center"/>
-          </w:tcPr>
-          <w:p>
-            <w:pPr>
-              <w:spacing w:after="0" w:before="0"/>
-            </w:pPr>
-            <w:r>
-              <w:rPr>
-                <w:rFonts w:ascii="Arial" w:cs="Arial" w:eastAsia="Arial" w:hAnsi="Arial"/>
-                <w:sz w:val="18"/>
-                <w:szCs w:val="18"/>
-              </w:rPr>
-              <w:t xml:space="preserve"/>
-            </w:r>
-          </w:p>
-        </w:tc>
-        <w:tc>
-          <w:tcPr>
-            <w:tcW w:type="dxa" w:w="1350"/>
-            <w:tcBorders>
-              <w:top w:val="single" w:color="555555" w:sz="4"/>
-              <w:left w:val="single" w:color="555555" w:sz="4"/>
-              <w:bottom w:val="single" w:color="555555" w:sz="4"/>
-              <w:right w:val="single" w:color="555555" w:sz="4"/>
-            </w:tcBorders>
-            <w:tcMar>
-              <w:top w:type="dxa" w:w="30"/>
-              <w:left w:type="dxa" w:w="60"/>
-              <w:bottom w:type="dxa" w:w="30"/>
-              <w:right w:type="dxa" w:w="60"/>
-            </w:tcMar>
-            <w:vAlign w:val="center"/>
-          </w:tcPr>
-          <w:p>
-            <w:pPr>
-              <w:spacing w:after="0" w:before="0"/>
-            </w:pPr>
-            <w:r>
-              <w:rPr>
-                <w:rFonts w:ascii="Arial" w:cs="Arial" w:eastAsia="Arial" w:hAnsi="Arial"/>
-                <w:sz w:val="18"/>
-                <w:szCs w:val="18"/>
-              </w:rPr>
-              <w:t xml:space="preserve"/>
-            </w:r>
-          </w:p>
-        </w:tc>
-        <w:tc>
-          <w:tcPr>
-            <w:tcW w:type="dxa" w:w="1350"/>
-            <w:tcBorders>
-              <w:top w:val="single" w:color="555555" w:sz="4"/>
-              <w:left w:val="single" w:color="555555" w:sz="4"/>
-              <w:bottom w:val="single" w:color="555555" w:sz="4"/>
-              <w:right w:val="single" w:color="555555" w:sz="4"/>
-            </w:tcBorders>
-            <w:tcMar>
-              <w:top w:type="dxa" w:w="30"/>
-              <w:left w:type="dxa" w:w="60"/>
-              <w:bottom w:type="dxa" w:w="30"/>
-              <w:right w:type="dxa" w:w="60"/>
-            </w:tcMar>
-            <w:vAlign w:val="center"/>
-          </w:tcPr>
-          <w:p>
-            <w:pPr>
-              <w:spacing w:after="0" w:before="0"/>
-            </w:pPr>
-            <w:r>
-              <w:rPr>
-                <w:rFonts w:ascii="Arial" w:cs="Arial" w:eastAsia="Arial" w:hAnsi="Arial"/>
-                <w:sz w:val="18"/>
-                <w:szCs w:val="18"/>
-              </w:rPr>
-              <w:t xml:space="preserve"/>
-            </w:r>
-          </w:p>
-        </w:tc>
-        <w:tc>
-          <w:tcPr>
-            <w:tcW w:type="dxa" w:w="1200"/>
-            <w:tcBorders>
-              <w:top w:val="single" w:color="555555" w:sz="4"/>
-              <w:left w:val="single" w:color="555555" w:sz="4"/>
-              <w:bottom w:val="single" w:color="555555" w:sz="4"/>
-              <w:right w:val="single" w:color="555555" w:sz="4"/>
-            </w:tcBorders>
-            <w:tcMar>
-              <w:top w:type="dxa" w:w="30"/>
-              <w:left w:type="dxa" w:w="60"/>
-              <w:bottom w:type="dxa" w:w="30"/>
-              <w:right w:type="dxa" w:w="60"/>
-            </w:tcMar>
-            <w:vAlign w:val="center"/>
-          </w:tcPr>
-          <w:p>
-            <w:pPr>
-              <w:spacing w:after="0" w:before="0"/>
-            </w:pPr>
-            <w:r>
-              <w:rPr>
-                <w:rFonts w:ascii="Arial" w:cs="Arial" w:eastAsia="Arial" w:hAnsi="Arial"/>
-                <w:sz w:val="18"/>
-                <w:szCs w:val="18"/>
-              </w:rPr>
-              <w:t xml:space="preserve"/>
-            </w:r>
-          </w:p>
-        </w:tc>
-        <w:tc>
-          <w:tcPr>
-            <w:tcW w:type="dxa" w:w="1500"/>
+            <w:tcW w:type="dxa" w:w="1600"/>
+            <w:tcBorders>
+              <w:top w:val="single" w:color="555555" w:sz="4"/>
+              <w:left w:val="single" w:color="555555" w:sz="4"/>
+              <w:bottom w:val="single" w:color="555555" w:sz="4"/>
+              <w:right w:val="single" w:color="555555" w:sz="4"/>
+            </w:tcBorders>
+            <w:tcMar>
+              <w:top w:type="dxa" w:w="30"/>
+              <w:left w:type="dxa" w:w="60"/>
+              <w:bottom w:type="dxa" w:w="30"/>
+              <w:right w:type="dxa" w:w="60"/>
+            </w:tcMar>
+            <w:vAlign w:val="center"/>
+          </w:tcPr>
+          <w:p>
+            <w:pPr>
+              <w:spacing w:after="0" w:before="0"/>
+            </w:pPr>
+            <w:r>
+              <w:rPr>
+                <w:rFonts w:ascii="Arial" w:cs="Arial" w:eastAsia="Arial" w:hAnsi="Arial"/>
+                <w:sz w:val="18"/>
+                <w:szCs w:val="18"/>
+              </w:rPr>
+              <w:t xml:space="preserve"/>
+            </w:r>
+          </w:p>
+        </w:tc>
+        <w:tc>
+          <w:tcPr>
+            <w:tcW w:type="dxa" w:w="1600"/>
+            <w:tcBorders>
+              <w:top w:val="single" w:color="555555" w:sz="4"/>
+              <w:left w:val="single" w:color="555555" w:sz="4"/>
+              <w:bottom w:val="single" w:color="555555" w:sz="4"/>
+              <w:right w:val="single" w:color="555555" w:sz="4"/>
+            </w:tcBorders>
+            <w:tcMar>
+              <w:top w:type="dxa" w:w="30"/>
+              <w:left w:type="dxa" w:w="60"/>
+              <w:bottom w:type="dxa" w:w="30"/>
+              <w:right w:type="dxa" w:w="60"/>
+            </w:tcMar>
+            <w:vAlign w:val="center"/>
+          </w:tcPr>
+          <w:p>
+            <w:pPr>
+              <w:spacing w:after="0" w:before="0"/>
+            </w:pPr>
+            <w:r>
+              <w:rPr>
+                <w:rFonts w:ascii="Arial" w:cs="Arial" w:eastAsia="Arial" w:hAnsi="Arial"/>
+                <w:sz w:val="18"/>
+                <w:szCs w:val="18"/>
+              </w:rPr>
+              <w:t xml:space="preserve"/>
+            </w:r>
+          </w:p>
+        </w:tc>
+        <w:tc>
+          <w:tcPr>
+            <w:tcW w:type="dxa" w:w="1400"/>
+            <w:tcBorders>
+              <w:top w:val="single" w:color="555555" w:sz="4"/>
+              <w:left w:val="single" w:color="555555" w:sz="4"/>
+              <w:bottom w:val="single" w:color="555555" w:sz="4"/>
+              <w:right w:val="single" w:color="555555" w:sz="4"/>
+            </w:tcBorders>
+            <w:tcMar>
+              <w:top w:type="dxa" w:w="30"/>
+              <w:left w:type="dxa" w:w="60"/>
+              <w:bottom w:type="dxa" w:w="30"/>
+              <w:right w:type="dxa" w:w="60"/>
+            </w:tcMar>
+            <w:vAlign w:val="center"/>
+          </w:tcPr>
+          <w:p>
+            <w:pPr>
+              <w:spacing w:after="0" w:before="0"/>
+            </w:pPr>
+            <w:r>
+              <w:rPr>
+                <w:rFonts w:ascii="Arial" w:cs="Arial" w:eastAsia="Arial" w:hAnsi="Arial"/>
+                <w:sz w:val="18"/>
+                <w:szCs w:val="18"/>
+              </w:rPr>
+              <w:t xml:space="preserve"/>
+            </w:r>
+          </w:p>
+        </w:tc>
+        <w:tc>
+          <w:tcPr>
+            <w:tcW w:type="dxa" w:w="1700"/>
             <w:tcBorders>
               <w:top w:val="single" w:color="555555" w:sz="4"/>
               <w:left w:val="single" w:color="555555" w:sz="4"/>
@@ -3740,7 +3487,7 @@
         </w:trPr>
         <w:tc>
           <w:tcPr>
-            <w:tcW w:type="dxa" w:w="3420"/>
+            <w:tcW w:type="dxa" w:w="3920"/>
             <w:tcBorders>
               <w:top w:val="single" w:color="555555" w:sz="4"/>
               <w:left w:val="single" w:color="555555" w:sz="4"/>
@@ -3771,7 +3518,7 @@
         </w:tc>
         <w:tc>
           <w:tcPr>
-            <w:tcW w:type="dxa" w:w="1200"/>
+            <w:tcW w:type="dxa" w:w="1300"/>
             <w:tcBorders>
               <w:top w:val="single" w:color="555555" w:sz="4"/>
               <w:left w:val="single" w:color="555555" w:sz="4"/>
@@ -3803,131 +3550,100 @@
         </w:tc>
         <w:tc>
           <w:tcPr>
-            <w:tcW w:type="dxa" w:w="1500"/>
-            <w:tcBorders>
-              <w:top w:val="single" w:color="555555" w:sz="4"/>
-              <w:left w:val="single" w:color="555555" w:sz="4"/>
-              <w:bottom w:val="single" w:color="555555" w:sz="4"/>
-              <w:right w:val="single" w:color="555555" w:sz="4"/>
-            </w:tcBorders>
-            <w:tcMar>
-              <w:top w:type="dxa" w:w="30"/>
-              <w:left w:type="dxa" w:w="60"/>
-              <w:bottom w:type="dxa" w:w="30"/>
-              <w:right w:type="dxa" w:w="60"/>
-            </w:tcMar>
-            <w:vAlign w:val="center"/>
-          </w:tcPr>
-          <w:p>
-            <w:pPr>
-              <w:spacing w:after="0" w:before="0"/>
-            </w:pPr>
-            <w:r>
-              <w:rPr>
-                <w:rFonts w:ascii="Arial" w:cs="Arial" w:eastAsia="Arial" w:hAnsi="Arial"/>
-                <w:sz w:val="18"/>
-                <w:szCs w:val="18"/>
-              </w:rPr>
-              <w:t xml:space="preserve"/>
-            </w:r>
-          </w:p>
-        </w:tc>
-        <w:tc>
-          <w:tcPr>
-            <w:tcW w:type="dxa" w:w="1350"/>
-            <w:tcBorders>
-              <w:top w:val="single" w:color="555555" w:sz="4"/>
-              <w:left w:val="single" w:color="555555" w:sz="4"/>
-              <w:bottom w:val="single" w:color="555555" w:sz="4"/>
-              <w:right w:val="single" w:color="555555" w:sz="4"/>
-            </w:tcBorders>
-            <w:tcMar>
-              <w:top w:type="dxa" w:w="30"/>
-              <w:left w:type="dxa" w:w="60"/>
-              <w:bottom w:type="dxa" w:w="30"/>
-              <w:right w:type="dxa" w:w="60"/>
-            </w:tcMar>
-            <w:vAlign w:val="center"/>
-          </w:tcPr>
-          <w:p>
-            <w:pPr>
-              <w:spacing w:after="0" w:before="0"/>
-            </w:pPr>
-            <w:r>
-              <w:rPr>
-                <w:rFonts w:ascii="Arial" w:cs="Arial" w:eastAsia="Arial" w:hAnsi="Arial"/>
-                <w:sz w:val="18"/>
-                <w:szCs w:val="18"/>
-              </w:rPr>
-              <w:t xml:space="preserve"/>
-            </w:r>
-          </w:p>
-        </w:tc>
-        <w:tc>
-          <w:tcPr>
-            <w:tcW w:type="dxa" w:w="1350"/>
-            <w:tcBorders>
-              <w:top w:val="single" w:color="555555" w:sz="4"/>
-              <w:left w:val="single" w:color="555555" w:sz="4"/>
-              <w:bottom w:val="single" w:color="555555" w:sz="4"/>
-              <w:right w:val="single" w:color="555555" w:sz="4"/>
-            </w:tcBorders>
-            <w:tcMar>
-              <w:top w:type="dxa" w:w="30"/>
-              <w:left w:type="dxa" w:w="60"/>
-              <w:bottom w:type="dxa" w:w="30"/>
-              <w:right w:type="dxa" w:w="60"/>
-            </w:tcMar>
-            <w:vAlign w:val="center"/>
-          </w:tcPr>
-          <w:p>
-            <w:pPr>
-              <w:spacing w:after="0" w:before="0"/>
-            </w:pPr>
-            <w:r>
-              <w:rPr>
-                <w:rFonts w:ascii="Arial" w:cs="Arial" w:eastAsia="Arial" w:hAnsi="Arial"/>
-                <w:sz w:val="18"/>
-                <w:szCs w:val="18"/>
-              </w:rPr>
-              <w:t xml:space="preserve"/>
-            </w:r>
-          </w:p>
-        </w:tc>
-        <w:tc>
-          <w:tcPr>
-            <w:tcW w:type="dxa" w:w="1200"/>
-            <w:tcBorders>
-              <w:top w:val="single" w:color="555555" w:sz="4"/>
-              <w:left w:val="single" w:color="555555" w:sz="4"/>
-              <w:bottom w:val="single" w:color="555555" w:sz="4"/>
-              <w:right w:val="single" w:color="555555" w:sz="4"/>
-            </w:tcBorders>
-            <w:tcMar>
-              <w:top w:type="dxa" w:w="30"/>
-              <w:left w:type="dxa" w:w="60"/>
-              <w:bottom w:type="dxa" w:w="30"/>
-              <w:right w:type="dxa" w:w="60"/>
-            </w:tcMar>
-            <w:vAlign w:val="center"/>
-          </w:tcPr>
-          <w:p>
-            <w:pPr>
-              <w:spacing w:after="0" w:before="0"/>
-            </w:pPr>
-            <w:r>
-              <w:rPr>
-                <w:rFonts w:ascii="Arial" w:cs="Arial" w:eastAsia="Arial" w:hAnsi="Arial"/>
-                <w:sz w:val="18"/>
-                <w:szCs w:val="18"/>
-              </w:rPr>
-              <w:t xml:space="preserve"/>
-            </w:r>
-          </w:p>
-        </w:tc>
-        <w:tc>
-          <w:tcPr>
-            <w:tcW w:type="dxa" w:w="1500"/>
+            <w:tcW w:type="dxa" w:w="1600"/>
+            <w:tcBorders>
+              <w:top w:val="single" w:color="555555" w:sz="4"/>
+              <w:left w:val="single" w:color="555555" w:sz="4"/>
+              <w:bottom w:val="single" w:color="555555" w:sz="4"/>
+              <w:right w:val="single" w:color="555555" w:sz="4"/>
+            </w:tcBorders>
+            <w:tcMar>
+              <w:top w:type="dxa" w:w="30"/>
+              <w:left w:type="dxa" w:w="60"/>
+              <w:bottom w:type="dxa" w:w="30"/>
+              <w:right w:type="dxa" w:w="60"/>
+            </w:tcMar>
+            <w:vAlign w:val="center"/>
+          </w:tcPr>
+          <w:p>
+            <w:pPr>
+              <w:spacing w:after="0" w:before="0"/>
+            </w:pPr>
+            <w:r>
+              <w:rPr>
+                <w:rFonts w:ascii="Arial" w:cs="Arial" w:eastAsia="Arial" w:hAnsi="Arial"/>
+                <w:sz w:val="18"/>
+                <w:szCs w:val="18"/>
+              </w:rPr>
+              <w:t xml:space="preserve"/>
+            </w:r>
+          </w:p>
+        </w:tc>
+        <w:tc>
+          <w:tcPr>
+            <w:tcW w:type="dxa" w:w="1600"/>
+            <w:tcBorders>
+              <w:top w:val="single" w:color="555555" w:sz="4"/>
+              <w:left w:val="single" w:color="555555" w:sz="4"/>
+              <w:bottom w:val="single" w:color="555555" w:sz="4"/>
+              <w:right w:val="single" w:color="555555" w:sz="4"/>
+            </w:tcBorders>
+            <w:tcMar>
+              <w:top w:type="dxa" w:w="30"/>
+              <w:left w:type="dxa" w:w="60"/>
+              <w:bottom w:type="dxa" w:w="30"/>
+              <w:right w:type="dxa" w:w="60"/>
+            </w:tcMar>
+            <w:vAlign w:val="center"/>
+          </w:tcPr>
+          <w:p>
+            <w:pPr>
+              <w:spacing w:after="0" w:before="0"/>
+            </w:pPr>
+            <w:r>
+              <w:rPr>
+                <w:rFonts w:ascii="Arial" w:cs="Arial" w:eastAsia="Arial" w:hAnsi="Arial"/>
+                <w:sz w:val="18"/>
+                <w:szCs w:val="18"/>
+              </w:rPr>
+              <w:t xml:space="preserve"/>
+            </w:r>
+          </w:p>
+        </w:tc>
+        <w:tc>
+          <w:tcPr>
+            <w:tcW w:type="dxa" w:w="1400"/>
+            <w:tcBorders>
+              <w:top w:val="single" w:color="555555" w:sz="4"/>
+              <w:left w:val="single" w:color="555555" w:sz="4"/>
+              <w:bottom w:val="single" w:color="555555" w:sz="4"/>
+              <w:right w:val="single" w:color="555555" w:sz="4"/>
+            </w:tcBorders>
+            <w:tcMar>
+              <w:top w:type="dxa" w:w="30"/>
+              <w:left w:type="dxa" w:w="60"/>
+              <w:bottom w:type="dxa" w:w="30"/>
+              <w:right w:type="dxa" w:w="60"/>
+            </w:tcMar>
+            <w:vAlign w:val="center"/>
+          </w:tcPr>
+          <w:p>
+            <w:pPr>
+              <w:spacing w:after="0" w:before="0"/>
+            </w:pPr>
+            <w:r>
+              <w:rPr>
+                <w:rFonts w:ascii="Arial" w:cs="Arial" w:eastAsia="Arial" w:hAnsi="Arial"/>
+                <w:sz w:val="18"/>
+                <w:szCs w:val="18"/>
+              </w:rPr>
+              <w:t xml:space="preserve"/>
+            </w:r>
+          </w:p>
+        </w:tc>
+        <w:tc>
+          <w:tcPr>
+            <w:tcW w:type="dxa" w:w="1700"/>
             <w:tcBorders>
               <w:top w:val="single" w:color="555555" w:sz="4"/>
               <w:left w:val="single" w:color="555555" w:sz="4"/>

</xml_diff>

<commit_message>
Hoja de campo: avance solo con actividad, unidad y cantidad
Co-Authored-By: Claude Opus 5.5 <noreply@anthropic.com>
Claude-Session: https://claude.ai/code/session_01FfUnftB8faW5Tj1T7jUfMj
</commit_message>
<xml_diff>
--- a/Hoja_Campo_Limpieza_Roceria_Comuna2.docx
+++ b/Hoja_Campo_Limpieza_Roceria_Comuna2.docx
@@ -1888,19 +1888,6 @@
         <w:t xml:space="preserve">3. AVANCE DIARIO POR ACTIVIDAD</w:t>
       </w:r>
     </w:p>
-    <w:p>
-      <w:pPr>
-        <w:spacing w:after="20" w:before="40"/>
-      </w:pPr>
-      <w:r>
-        <w:rPr>
-          <w:rFonts w:ascii="Arial" w:cs="Arial" w:eastAsia="Arial" w:hAnsi="Arial"/>
-          <w:sz w:val="15"/>
-          <w:szCs w:val="15"/>
-        </w:rPr>
-        <w:t xml:space="preserve">Todas las actividades se miden sobre el tramo del día (ej.: de abscisa 0 a 55 = 55 metros lineales). Rend. (%) = Ejecutado ÷ Programado × 100. Acumulado = total desde el inicio.</w:t>
-      </w:r>
-    </w:p>
     <w:tbl>
       <w:tblPr>
         <w:tblW w:type="dxa" w:w="11520"/>
@@ -1915,12 +1902,9 @@
         <w:tblLayout w:type="fixed"/>
       </w:tblPr>
       <w:tblGrid>
-        <w:gridCol w:w="3920"/>
-        <w:gridCol w:w="1300"/>
-        <w:gridCol w:w="1600"/>
-        <w:gridCol w:w="1600"/>
-        <w:gridCol w:w="1400"/>
-        <w:gridCol w:w="1700"/>
+        <w:gridCol w:w="6720"/>
+        <w:gridCol w:w="2400"/>
+        <w:gridCol w:w="2400"/>
       </w:tblGrid>
       <w:tr>
         <w:trPr>
@@ -1928,7 +1912,7 @@
         </w:trPr>
         <w:tc>
           <w:tcPr>
-            <w:tcW w:type="dxa" w:w="3920"/>
+            <w:tcW w:type="dxa" w:w="6720"/>
             <w:tcBorders>
               <w:top w:val="single" w:color="555555" w:sz="4"/>
               <w:left w:val="single" w:color="555555" w:sz="4"/>
@@ -1963,7 +1947,7 @@
         </w:tc>
         <w:tc>
           <w:tcPr>
-            <w:tcW w:type="dxa" w:w="1300"/>
+            <w:tcW w:type="dxa" w:w="2400"/>
             <w:tcBorders>
               <w:top w:val="single" w:color="555555" w:sz="4"/>
               <w:left w:val="single" w:color="555555" w:sz="4"/>
@@ -1998,7 +1982,7 @@
         </w:tc>
         <w:tc>
           <w:tcPr>
-            <w:tcW w:type="dxa" w:w="1600"/>
+            <w:tcW w:type="dxa" w:w="2400"/>
             <w:tcBorders>
               <w:top w:val="single" w:color="555555" w:sz="4"/>
               <w:left w:val="single" w:color="555555" w:sz="4"/>
@@ -2027,123 +2011,18 @@
                 <w:sz w:val="18"/>
                 <w:szCs w:val="18"/>
               </w:rPr>
-              <w:t xml:space="preserve">Programado hoy</w:t>
-            </w:r>
-          </w:p>
-        </w:tc>
-        <w:tc>
-          <w:tcPr>
-            <w:tcW w:type="dxa" w:w="1600"/>
-            <w:tcBorders>
-              <w:top w:val="single" w:color="555555" w:sz="4"/>
-              <w:left w:val="single" w:color="555555" w:sz="4"/>
-              <w:bottom w:val="single" w:color="555555" w:sz="4"/>
-              <w:right w:val="single" w:color="555555" w:sz="4"/>
-            </w:tcBorders>
-            <w:shd w:fill="D9E2D0" w:color="auto" w:val="clear"/>
-            <w:tcMar>
-              <w:top w:type="dxa" w:w="30"/>
-              <w:left w:type="dxa" w:w="60"/>
-              <w:bottom w:type="dxa" w:w="30"/>
-              <w:right w:type="dxa" w:w="60"/>
-            </w:tcMar>
-            <w:vAlign w:val="center"/>
-          </w:tcPr>
-          <w:p>
-            <w:pPr>
-              <w:spacing w:after="0" w:before="0"/>
-              <w:jc w:val="center"/>
-            </w:pPr>
-            <w:r>
-              <w:rPr>
-                <w:rFonts w:ascii="Arial" w:cs="Arial" w:eastAsia="Arial" w:hAnsi="Arial"/>
-                <w:b/>
-                <w:bCs/>
-                <w:sz w:val="18"/>
-                <w:szCs w:val="18"/>
-              </w:rPr>
-              <w:t xml:space="preserve">Ejecutado hoy</w:t>
-            </w:r>
-          </w:p>
-        </w:tc>
-        <w:tc>
-          <w:tcPr>
-            <w:tcW w:type="dxa" w:w="1400"/>
-            <w:tcBorders>
-              <w:top w:val="single" w:color="555555" w:sz="4"/>
-              <w:left w:val="single" w:color="555555" w:sz="4"/>
-              <w:bottom w:val="single" w:color="555555" w:sz="4"/>
-              <w:right w:val="single" w:color="555555" w:sz="4"/>
-            </w:tcBorders>
-            <w:shd w:fill="D9E2D0" w:color="auto" w:val="clear"/>
-            <w:tcMar>
-              <w:top w:type="dxa" w:w="30"/>
-              <w:left w:type="dxa" w:w="60"/>
-              <w:bottom w:type="dxa" w:w="30"/>
-              <w:right w:type="dxa" w:w="60"/>
-            </w:tcMar>
-            <w:vAlign w:val="center"/>
-          </w:tcPr>
-          <w:p>
-            <w:pPr>
-              <w:spacing w:after="0" w:before="0"/>
-              <w:jc w:val="center"/>
-            </w:pPr>
-            <w:r>
-              <w:rPr>
-                <w:rFonts w:ascii="Arial" w:cs="Arial" w:eastAsia="Arial" w:hAnsi="Arial"/>
-                <w:b/>
-                <w:bCs/>
-                <w:sz w:val="18"/>
-                <w:szCs w:val="18"/>
-              </w:rPr>
-              <w:t xml:space="preserve">Rend. (%)</w:t>
-            </w:r>
-          </w:p>
-        </w:tc>
-        <w:tc>
-          <w:tcPr>
-            <w:tcW w:type="dxa" w:w="1700"/>
-            <w:tcBorders>
-              <w:top w:val="single" w:color="555555" w:sz="4"/>
-              <w:left w:val="single" w:color="555555" w:sz="4"/>
-              <w:bottom w:val="single" w:color="555555" w:sz="4"/>
-              <w:right w:val="single" w:color="555555" w:sz="4"/>
-            </w:tcBorders>
-            <w:shd w:fill="D9E2D0" w:color="auto" w:val="clear"/>
-            <w:tcMar>
-              <w:top w:type="dxa" w:w="30"/>
-              <w:left w:type="dxa" w:w="60"/>
-              <w:bottom w:type="dxa" w:w="30"/>
-              <w:right w:type="dxa" w:w="60"/>
-            </w:tcMar>
-            <w:vAlign w:val="center"/>
-          </w:tcPr>
-          <w:p>
-            <w:pPr>
-              <w:spacing w:after="0" w:before="0"/>
-              <w:jc w:val="center"/>
-            </w:pPr>
-            <w:r>
-              <w:rPr>
-                <w:rFonts w:ascii="Arial" w:cs="Arial" w:eastAsia="Arial" w:hAnsi="Arial"/>
-                <w:b/>
-                <w:bCs/>
-                <w:sz w:val="18"/>
-                <w:szCs w:val="18"/>
-              </w:rPr>
-              <w:t xml:space="preserve">Acumulado</w:t>
+              <w:t xml:space="preserve">Cantidad</w:t>
             </w:r>
           </w:p>
         </w:tc>
       </w:tr>
       <w:tr>
         <w:trPr>
-          <w:trHeight w:val="420" w:hRule="atLeast"/>
+          <w:trHeight w:val="440" w:hRule="atLeast"/>
         </w:trPr>
         <w:tc>
           <w:tcPr>
-            <w:tcW w:type="dxa" w:w="3920"/>
+            <w:tcW w:type="dxa" w:w="6720"/>
             <w:tcBorders>
               <w:top w:val="single" w:color="555555" w:sz="4"/>
               <w:left w:val="single" w:color="555555" w:sz="4"/>
@@ -2174,7 +2053,7 @@
         </w:tc>
         <w:tc>
           <w:tcPr>
-            <w:tcW w:type="dxa" w:w="1300"/>
+            <w:tcW w:type="dxa" w:w="2400"/>
             <w:tcBorders>
               <w:top w:val="single" w:color="555555" w:sz="4"/>
               <w:left w:val="single" w:color="555555" w:sz="4"/>
@@ -2206,117 +2085,25 @@
         </w:tc>
         <w:tc>
           <w:tcPr>
-            <w:tcW w:type="dxa" w:w="1600"/>
-            <w:tcBorders>
-              <w:top w:val="single" w:color="555555" w:sz="4"/>
-              <w:left w:val="single" w:color="555555" w:sz="4"/>
-              <w:bottom w:val="single" w:color="555555" w:sz="4"/>
-              <w:right w:val="single" w:color="555555" w:sz="4"/>
-            </w:tcBorders>
-            <w:tcMar>
-              <w:top w:type="dxa" w:w="30"/>
-              <w:left w:type="dxa" w:w="60"/>
-              <w:bottom w:type="dxa" w:w="30"/>
-              <w:right w:type="dxa" w:w="60"/>
-            </w:tcMar>
-            <w:vAlign w:val="center"/>
-          </w:tcPr>
-          <w:p>
-            <w:pPr>
-              <w:spacing w:after="0" w:before="0"/>
-            </w:pPr>
-            <w:r>
-              <w:rPr>
-                <w:rFonts w:ascii="Arial" w:cs="Arial" w:eastAsia="Arial" w:hAnsi="Arial"/>
-                <w:sz w:val="18"/>
-                <w:szCs w:val="18"/>
-              </w:rPr>
-              <w:t xml:space="preserve"/>
-            </w:r>
-          </w:p>
-        </w:tc>
-        <w:tc>
-          <w:tcPr>
-            <w:tcW w:type="dxa" w:w="1600"/>
-            <w:tcBorders>
-              <w:top w:val="single" w:color="555555" w:sz="4"/>
-              <w:left w:val="single" w:color="555555" w:sz="4"/>
-              <w:bottom w:val="single" w:color="555555" w:sz="4"/>
-              <w:right w:val="single" w:color="555555" w:sz="4"/>
-            </w:tcBorders>
-            <w:tcMar>
-              <w:top w:type="dxa" w:w="30"/>
-              <w:left w:type="dxa" w:w="60"/>
-              <w:bottom w:type="dxa" w:w="30"/>
-              <w:right w:type="dxa" w:w="60"/>
-            </w:tcMar>
-            <w:vAlign w:val="center"/>
-          </w:tcPr>
-          <w:p>
-            <w:pPr>
-              <w:spacing w:after="0" w:before="0"/>
-            </w:pPr>
-            <w:r>
-              <w:rPr>
-                <w:rFonts w:ascii="Arial" w:cs="Arial" w:eastAsia="Arial" w:hAnsi="Arial"/>
-                <w:sz w:val="18"/>
-                <w:szCs w:val="18"/>
-              </w:rPr>
-              <w:t xml:space="preserve"/>
-            </w:r>
-          </w:p>
-        </w:tc>
-        <w:tc>
-          <w:tcPr>
-            <w:tcW w:type="dxa" w:w="1400"/>
-            <w:tcBorders>
-              <w:top w:val="single" w:color="555555" w:sz="4"/>
-              <w:left w:val="single" w:color="555555" w:sz="4"/>
-              <w:bottom w:val="single" w:color="555555" w:sz="4"/>
-              <w:right w:val="single" w:color="555555" w:sz="4"/>
-            </w:tcBorders>
-            <w:tcMar>
-              <w:top w:type="dxa" w:w="30"/>
-              <w:left w:type="dxa" w:w="60"/>
-              <w:bottom w:type="dxa" w:w="30"/>
-              <w:right w:type="dxa" w:w="60"/>
-            </w:tcMar>
-            <w:vAlign w:val="center"/>
-          </w:tcPr>
-          <w:p>
-            <w:pPr>
-              <w:spacing w:after="0" w:before="0"/>
-            </w:pPr>
-            <w:r>
-              <w:rPr>
-                <w:rFonts w:ascii="Arial" w:cs="Arial" w:eastAsia="Arial" w:hAnsi="Arial"/>
-                <w:sz w:val="18"/>
-                <w:szCs w:val="18"/>
-              </w:rPr>
-              <w:t xml:space="preserve"/>
-            </w:r>
-          </w:p>
-        </w:tc>
-        <w:tc>
-          <w:tcPr>
-            <w:tcW w:type="dxa" w:w="1700"/>
-            <w:tcBorders>
-              <w:top w:val="single" w:color="555555" w:sz="4"/>
-              <w:left w:val="single" w:color="555555" w:sz="4"/>
-              <w:bottom w:val="single" w:color="555555" w:sz="4"/>
-              <w:right w:val="single" w:color="555555" w:sz="4"/>
-            </w:tcBorders>
-            <w:tcMar>
-              <w:top w:type="dxa" w:w="30"/>
-              <w:left w:type="dxa" w:w="60"/>
-              <w:bottom w:type="dxa" w:w="30"/>
-              <w:right w:type="dxa" w:w="60"/>
-            </w:tcMar>
-            <w:vAlign w:val="center"/>
-          </w:tcPr>
-          <w:p>
-            <w:pPr>
-              <w:spacing w:after="0" w:before="0"/>
+            <w:tcW w:type="dxa" w:w="2400"/>
+            <w:tcBorders>
+              <w:top w:val="single" w:color="555555" w:sz="4"/>
+              <w:left w:val="single" w:color="555555" w:sz="4"/>
+              <w:bottom w:val="single" w:color="555555" w:sz="4"/>
+              <w:right w:val="single" w:color="555555" w:sz="4"/>
+            </w:tcBorders>
+            <w:tcMar>
+              <w:top w:type="dxa" w:w="30"/>
+              <w:left w:type="dxa" w:w="60"/>
+              <w:bottom w:type="dxa" w:w="30"/>
+              <w:right w:type="dxa" w:w="60"/>
+            </w:tcMar>
+            <w:vAlign w:val="center"/>
+          </w:tcPr>
+          <w:p>
+            <w:pPr>
+              <w:spacing w:after="0" w:before="0"/>
+              <w:jc w:val="center"/>
             </w:pPr>
             <w:r>
               <w:rPr>
@@ -2331,11 +2118,11 @@
       </w:tr>
       <w:tr>
         <w:trPr>
-          <w:trHeight w:val="420" w:hRule="atLeast"/>
+          <w:trHeight w:val="440" w:hRule="atLeast"/>
         </w:trPr>
         <w:tc>
           <w:tcPr>
-            <w:tcW w:type="dxa" w:w="3920"/>
+            <w:tcW w:type="dxa" w:w="6720"/>
             <w:tcBorders>
               <w:top w:val="single" w:color="555555" w:sz="4"/>
               <w:left w:val="single" w:color="555555" w:sz="4"/>
@@ -2366,7 +2153,7 @@
         </w:tc>
         <w:tc>
           <w:tcPr>
-            <w:tcW w:type="dxa" w:w="1300"/>
+            <w:tcW w:type="dxa" w:w="2400"/>
             <w:tcBorders>
               <w:top w:val="single" w:color="555555" w:sz="4"/>
               <w:left w:val="single" w:color="555555" w:sz="4"/>
@@ -2398,117 +2185,25 @@
         </w:tc>
         <w:tc>
           <w:tcPr>
-            <w:tcW w:type="dxa" w:w="1600"/>
-            <w:tcBorders>
-              <w:top w:val="single" w:color="555555" w:sz="4"/>
-              <w:left w:val="single" w:color="555555" w:sz="4"/>
-              <w:bottom w:val="single" w:color="555555" w:sz="4"/>
-              <w:right w:val="single" w:color="555555" w:sz="4"/>
-            </w:tcBorders>
-            <w:tcMar>
-              <w:top w:type="dxa" w:w="30"/>
-              <w:left w:type="dxa" w:w="60"/>
-              <w:bottom w:type="dxa" w:w="30"/>
-              <w:right w:type="dxa" w:w="60"/>
-            </w:tcMar>
-            <w:vAlign w:val="center"/>
-          </w:tcPr>
-          <w:p>
-            <w:pPr>
-              <w:spacing w:after="0" w:before="0"/>
-            </w:pPr>
-            <w:r>
-              <w:rPr>
-                <w:rFonts w:ascii="Arial" w:cs="Arial" w:eastAsia="Arial" w:hAnsi="Arial"/>
-                <w:sz w:val="18"/>
-                <w:szCs w:val="18"/>
-              </w:rPr>
-              <w:t xml:space="preserve"/>
-            </w:r>
-          </w:p>
-        </w:tc>
-        <w:tc>
-          <w:tcPr>
-            <w:tcW w:type="dxa" w:w="1600"/>
-            <w:tcBorders>
-              <w:top w:val="single" w:color="555555" w:sz="4"/>
-              <w:left w:val="single" w:color="555555" w:sz="4"/>
-              <w:bottom w:val="single" w:color="555555" w:sz="4"/>
-              <w:right w:val="single" w:color="555555" w:sz="4"/>
-            </w:tcBorders>
-            <w:tcMar>
-              <w:top w:type="dxa" w:w="30"/>
-              <w:left w:type="dxa" w:w="60"/>
-              <w:bottom w:type="dxa" w:w="30"/>
-              <w:right w:type="dxa" w:w="60"/>
-            </w:tcMar>
-            <w:vAlign w:val="center"/>
-          </w:tcPr>
-          <w:p>
-            <w:pPr>
-              <w:spacing w:after="0" w:before="0"/>
-            </w:pPr>
-            <w:r>
-              <w:rPr>
-                <w:rFonts w:ascii="Arial" w:cs="Arial" w:eastAsia="Arial" w:hAnsi="Arial"/>
-                <w:sz w:val="18"/>
-                <w:szCs w:val="18"/>
-              </w:rPr>
-              <w:t xml:space="preserve"/>
-            </w:r>
-          </w:p>
-        </w:tc>
-        <w:tc>
-          <w:tcPr>
-            <w:tcW w:type="dxa" w:w="1400"/>
-            <w:tcBorders>
-              <w:top w:val="single" w:color="555555" w:sz="4"/>
-              <w:left w:val="single" w:color="555555" w:sz="4"/>
-              <w:bottom w:val="single" w:color="555555" w:sz="4"/>
-              <w:right w:val="single" w:color="555555" w:sz="4"/>
-            </w:tcBorders>
-            <w:tcMar>
-              <w:top w:type="dxa" w:w="30"/>
-              <w:left w:type="dxa" w:w="60"/>
-              <w:bottom w:type="dxa" w:w="30"/>
-              <w:right w:type="dxa" w:w="60"/>
-            </w:tcMar>
-            <w:vAlign w:val="center"/>
-          </w:tcPr>
-          <w:p>
-            <w:pPr>
-              <w:spacing w:after="0" w:before="0"/>
-            </w:pPr>
-            <w:r>
-              <w:rPr>
-                <w:rFonts w:ascii="Arial" w:cs="Arial" w:eastAsia="Arial" w:hAnsi="Arial"/>
-                <w:sz w:val="18"/>
-                <w:szCs w:val="18"/>
-              </w:rPr>
-              <w:t xml:space="preserve"/>
-            </w:r>
-          </w:p>
-        </w:tc>
-        <w:tc>
-          <w:tcPr>
-            <w:tcW w:type="dxa" w:w="1700"/>
-            <w:tcBorders>
-              <w:top w:val="single" w:color="555555" w:sz="4"/>
-              <w:left w:val="single" w:color="555555" w:sz="4"/>
-              <w:bottom w:val="single" w:color="555555" w:sz="4"/>
-              <w:right w:val="single" w:color="555555" w:sz="4"/>
-            </w:tcBorders>
-            <w:tcMar>
-              <w:top w:type="dxa" w:w="30"/>
-              <w:left w:type="dxa" w:w="60"/>
-              <w:bottom w:type="dxa" w:w="30"/>
-              <w:right w:type="dxa" w:w="60"/>
-            </w:tcMar>
-            <w:vAlign w:val="center"/>
-          </w:tcPr>
-          <w:p>
-            <w:pPr>
-              <w:spacing w:after="0" w:before="0"/>
+            <w:tcW w:type="dxa" w:w="2400"/>
+            <w:tcBorders>
+              <w:top w:val="single" w:color="555555" w:sz="4"/>
+              <w:left w:val="single" w:color="555555" w:sz="4"/>
+              <w:bottom w:val="single" w:color="555555" w:sz="4"/>
+              <w:right w:val="single" w:color="555555" w:sz="4"/>
+            </w:tcBorders>
+            <w:tcMar>
+              <w:top w:type="dxa" w:w="30"/>
+              <w:left w:type="dxa" w:w="60"/>
+              <w:bottom w:type="dxa" w:w="30"/>
+              <w:right w:type="dxa" w:w="60"/>
+            </w:tcMar>
+            <w:vAlign w:val="center"/>
+          </w:tcPr>
+          <w:p>
+            <w:pPr>
+              <w:spacing w:after="0" w:before="0"/>
+              <w:jc w:val="center"/>
             </w:pPr>
             <w:r>
               <w:rPr>
@@ -2523,11 +2218,11 @@
       </w:tr>
       <w:tr>
         <w:trPr>
-          <w:trHeight w:val="420" w:hRule="atLeast"/>
+          <w:trHeight w:val="440" w:hRule="atLeast"/>
         </w:trPr>
         <w:tc>
           <w:tcPr>
-            <w:tcW w:type="dxa" w:w="3920"/>
+            <w:tcW w:type="dxa" w:w="6720"/>
             <w:tcBorders>
               <w:top w:val="single" w:color="555555" w:sz="4"/>
               <w:left w:val="single" w:color="555555" w:sz="4"/>
@@ -2558,7 +2253,7 @@
         </w:tc>
         <w:tc>
           <w:tcPr>
-            <w:tcW w:type="dxa" w:w="1300"/>
+            <w:tcW w:type="dxa" w:w="2400"/>
             <w:tcBorders>
               <w:top w:val="single" w:color="555555" w:sz="4"/>
               <w:left w:val="single" w:color="555555" w:sz="4"/>
@@ -2590,117 +2285,25 @@
         </w:tc>
         <w:tc>
           <w:tcPr>
-            <w:tcW w:type="dxa" w:w="1600"/>
-            <w:tcBorders>
-              <w:top w:val="single" w:color="555555" w:sz="4"/>
-              <w:left w:val="single" w:color="555555" w:sz="4"/>
-              <w:bottom w:val="single" w:color="555555" w:sz="4"/>
-              <w:right w:val="single" w:color="555555" w:sz="4"/>
-            </w:tcBorders>
-            <w:tcMar>
-              <w:top w:type="dxa" w:w="30"/>
-              <w:left w:type="dxa" w:w="60"/>
-              <w:bottom w:type="dxa" w:w="30"/>
-              <w:right w:type="dxa" w:w="60"/>
-            </w:tcMar>
-            <w:vAlign w:val="center"/>
-          </w:tcPr>
-          <w:p>
-            <w:pPr>
-              <w:spacing w:after="0" w:before="0"/>
-            </w:pPr>
-            <w:r>
-              <w:rPr>
-                <w:rFonts w:ascii="Arial" w:cs="Arial" w:eastAsia="Arial" w:hAnsi="Arial"/>
-                <w:sz w:val="18"/>
-                <w:szCs w:val="18"/>
-              </w:rPr>
-              <w:t xml:space="preserve"/>
-            </w:r>
-          </w:p>
-        </w:tc>
-        <w:tc>
-          <w:tcPr>
-            <w:tcW w:type="dxa" w:w="1600"/>
-            <w:tcBorders>
-              <w:top w:val="single" w:color="555555" w:sz="4"/>
-              <w:left w:val="single" w:color="555555" w:sz="4"/>
-              <w:bottom w:val="single" w:color="555555" w:sz="4"/>
-              <w:right w:val="single" w:color="555555" w:sz="4"/>
-            </w:tcBorders>
-            <w:tcMar>
-              <w:top w:type="dxa" w:w="30"/>
-              <w:left w:type="dxa" w:w="60"/>
-              <w:bottom w:type="dxa" w:w="30"/>
-              <w:right w:type="dxa" w:w="60"/>
-            </w:tcMar>
-            <w:vAlign w:val="center"/>
-          </w:tcPr>
-          <w:p>
-            <w:pPr>
-              <w:spacing w:after="0" w:before="0"/>
-            </w:pPr>
-            <w:r>
-              <w:rPr>
-                <w:rFonts w:ascii="Arial" w:cs="Arial" w:eastAsia="Arial" w:hAnsi="Arial"/>
-                <w:sz w:val="18"/>
-                <w:szCs w:val="18"/>
-              </w:rPr>
-              <w:t xml:space="preserve"/>
-            </w:r>
-          </w:p>
-        </w:tc>
-        <w:tc>
-          <w:tcPr>
-            <w:tcW w:type="dxa" w:w="1400"/>
-            <w:tcBorders>
-              <w:top w:val="single" w:color="555555" w:sz="4"/>
-              <w:left w:val="single" w:color="555555" w:sz="4"/>
-              <w:bottom w:val="single" w:color="555555" w:sz="4"/>
-              <w:right w:val="single" w:color="555555" w:sz="4"/>
-            </w:tcBorders>
-            <w:tcMar>
-              <w:top w:type="dxa" w:w="30"/>
-              <w:left w:type="dxa" w:w="60"/>
-              <w:bottom w:type="dxa" w:w="30"/>
-              <w:right w:type="dxa" w:w="60"/>
-            </w:tcMar>
-            <w:vAlign w:val="center"/>
-          </w:tcPr>
-          <w:p>
-            <w:pPr>
-              <w:spacing w:after="0" w:before="0"/>
-            </w:pPr>
-            <w:r>
-              <w:rPr>
-                <w:rFonts w:ascii="Arial" w:cs="Arial" w:eastAsia="Arial" w:hAnsi="Arial"/>
-                <w:sz w:val="18"/>
-                <w:szCs w:val="18"/>
-              </w:rPr>
-              <w:t xml:space="preserve"/>
-            </w:r>
-          </w:p>
-        </w:tc>
-        <w:tc>
-          <w:tcPr>
-            <w:tcW w:type="dxa" w:w="1700"/>
-            <w:tcBorders>
-              <w:top w:val="single" w:color="555555" w:sz="4"/>
-              <w:left w:val="single" w:color="555555" w:sz="4"/>
-              <w:bottom w:val="single" w:color="555555" w:sz="4"/>
-              <w:right w:val="single" w:color="555555" w:sz="4"/>
-            </w:tcBorders>
-            <w:tcMar>
-              <w:top w:type="dxa" w:w="30"/>
-              <w:left w:type="dxa" w:w="60"/>
-              <w:bottom w:type="dxa" w:w="30"/>
-              <w:right w:type="dxa" w:w="60"/>
-            </w:tcMar>
-            <w:vAlign w:val="center"/>
-          </w:tcPr>
-          <w:p>
-            <w:pPr>
-              <w:spacing w:after="0" w:before="0"/>
+            <w:tcW w:type="dxa" w:w="2400"/>
+            <w:tcBorders>
+              <w:top w:val="single" w:color="555555" w:sz="4"/>
+              <w:left w:val="single" w:color="555555" w:sz="4"/>
+              <w:bottom w:val="single" w:color="555555" w:sz="4"/>
+              <w:right w:val="single" w:color="555555" w:sz="4"/>
+            </w:tcBorders>
+            <w:tcMar>
+              <w:top w:type="dxa" w:w="30"/>
+              <w:left w:type="dxa" w:w="60"/>
+              <w:bottom w:type="dxa" w:w="30"/>
+              <w:right w:type="dxa" w:w="60"/>
+            </w:tcMar>
+            <w:vAlign w:val="center"/>
+          </w:tcPr>
+          <w:p>
+            <w:pPr>
+              <w:spacing w:after="0" w:before="0"/>
+              <w:jc w:val="center"/>
             </w:pPr>
             <w:r>
               <w:rPr>
@@ -2715,11 +2318,11 @@
       </w:tr>
       <w:tr>
         <w:trPr>
-          <w:trHeight w:val="420" w:hRule="atLeast"/>
+          <w:trHeight w:val="440" w:hRule="atLeast"/>
         </w:trPr>
         <w:tc>
           <w:tcPr>
-            <w:tcW w:type="dxa" w:w="3920"/>
+            <w:tcW w:type="dxa" w:w="6720"/>
             <w:tcBorders>
               <w:top w:val="single" w:color="555555" w:sz="4"/>
               <w:left w:val="single" w:color="555555" w:sz="4"/>
@@ -2750,7 +2353,7 @@
         </w:tc>
         <w:tc>
           <w:tcPr>
-            <w:tcW w:type="dxa" w:w="1300"/>
+            <w:tcW w:type="dxa" w:w="2400"/>
             <w:tcBorders>
               <w:top w:val="single" w:color="555555" w:sz="4"/>
               <w:left w:val="single" w:color="555555" w:sz="4"/>
@@ -2782,117 +2385,25 @@
         </w:tc>
         <w:tc>
           <w:tcPr>
-            <w:tcW w:type="dxa" w:w="1600"/>
-            <w:tcBorders>
-              <w:top w:val="single" w:color="555555" w:sz="4"/>
-              <w:left w:val="single" w:color="555555" w:sz="4"/>
-              <w:bottom w:val="single" w:color="555555" w:sz="4"/>
-              <w:right w:val="single" w:color="555555" w:sz="4"/>
-            </w:tcBorders>
-            <w:tcMar>
-              <w:top w:type="dxa" w:w="30"/>
-              <w:left w:type="dxa" w:w="60"/>
-              <w:bottom w:type="dxa" w:w="30"/>
-              <w:right w:type="dxa" w:w="60"/>
-            </w:tcMar>
-            <w:vAlign w:val="center"/>
-          </w:tcPr>
-          <w:p>
-            <w:pPr>
-              <w:spacing w:after="0" w:before="0"/>
-            </w:pPr>
-            <w:r>
-              <w:rPr>
-                <w:rFonts w:ascii="Arial" w:cs="Arial" w:eastAsia="Arial" w:hAnsi="Arial"/>
-                <w:sz w:val="18"/>
-                <w:szCs w:val="18"/>
-              </w:rPr>
-              <w:t xml:space="preserve"/>
-            </w:r>
-          </w:p>
-        </w:tc>
-        <w:tc>
-          <w:tcPr>
-            <w:tcW w:type="dxa" w:w="1600"/>
-            <w:tcBorders>
-              <w:top w:val="single" w:color="555555" w:sz="4"/>
-              <w:left w:val="single" w:color="555555" w:sz="4"/>
-              <w:bottom w:val="single" w:color="555555" w:sz="4"/>
-              <w:right w:val="single" w:color="555555" w:sz="4"/>
-            </w:tcBorders>
-            <w:tcMar>
-              <w:top w:type="dxa" w:w="30"/>
-              <w:left w:type="dxa" w:w="60"/>
-              <w:bottom w:type="dxa" w:w="30"/>
-              <w:right w:type="dxa" w:w="60"/>
-            </w:tcMar>
-            <w:vAlign w:val="center"/>
-          </w:tcPr>
-          <w:p>
-            <w:pPr>
-              <w:spacing w:after="0" w:before="0"/>
-            </w:pPr>
-            <w:r>
-              <w:rPr>
-                <w:rFonts w:ascii="Arial" w:cs="Arial" w:eastAsia="Arial" w:hAnsi="Arial"/>
-                <w:sz w:val="18"/>
-                <w:szCs w:val="18"/>
-              </w:rPr>
-              <w:t xml:space="preserve"/>
-            </w:r>
-          </w:p>
-        </w:tc>
-        <w:tc>
-          <w:tcPr>
-            <w:tcW w:type="dxa" w:w="1400"/>
-            <w:tcBorders>
-              <w:top w:val="single" w:color="555555" w:sz="4"/>
-              <w:left w:val="single" w:color="555555" w:sz="4"/>
-              <w:bottom w:val="single" w:color="555555" w:sz="4"/>
-              <w:right w:val="single" w:color="555555" w:sz="4"/>
-            </w:tcBorders>
-            <w:tcMar>
-              <w:top w:type="dxa" w:w="30"/>
-              <w:left w:type="dxa" w:w="60"/>
-              <w:bottom w:type="dxa" w:w="30"/>
-              <w:right w:type="dxa" w:w="60"/>
-            </w:tcMar>
-            <w:vAlign w:val="center"/>
-          </w:tcPr>
-          <w:p>
-            <w:pPr>
-              <w:spacing w:after="0" w:before="0"/>
-            </w:pPr>
-            <w:r>
-              <w:rPr>
-                <w:rFonts w:ascii="Arial" w:cs="Arial" w:eastAsia="Arial" w:hAnsi="Arial"/>
-                <w:sz w:val="18"/>
-                <w:szCs w:val="18"/>
-              </w:rPr>
-              <w:t xml:space="preserve"/>
-            </w:r>
-          </w:p>
-        </w:tc>
-        <w:tc>
-          <w:tcPr>
-            <w:tcW w:type="dxa" w:w="1700"/>
-            <w:tcBorders>
-              <w:top w:val="single" w:color="555555" w:sz="4"/>
-              <w:left w:val="single" w:color="555555" w:sz="4"/>
-              <w:bottom w:val="single" w:color="555555" w:sz="4"/>
-              <w:right w:val="single" w:color="555555" w:sz="4"/>
-            </w:tcBorders>
-            <w:tcMar>
-              <w:top w:type="dxa" w:w="30"/>
-              <w:left w:type="dxa" w:w="60"/>
-              <w:bottom w:type="dxa" w:w="30"/>
-              <w:right w:type="dxa" w:w="60"/>
-            </w:tcMar>
-            <w:vAlign w:val="center"/>
-          </w:tcPr>
-          <w:p>
-            <w:pPr>
-              <w:spacing w:after="0" w:before="0"/>
+            <w:tcW w:type="dxa" w:w="2400"/>
+            <w:tcBorders>
+              <w:top w:val="single" w:color="555555" w:sz="4"/>
+              <w:left w:val="single" w:color="555555" w:sz="4"/>
+              <w:bottom w:val="single" w:color="555555" w:sz="4"/>
+              <w:right w:val="single" w:color="555555" w:sz="4"/>
+            </w:tcBorders>
+            <w:tcMar>
+              <w:top w:type="dxa" w:w="30"/>
+              <w:left w:type="dxa" w:w="60"/>
+              <w:bottom w:type="dxa" w:w="30"/>
+              <w:right w:type="dxa" w:w="60"/>
+            </w:tcMar>
+            <w:vAlign w:val="center"/>
+          </w:tcPr>
+          <w:p>
+            <w:pPr>
+              <w:spacing w:after="0" w:before="0"/>
+              <w:jc w:val="center"/>
             </w:pPr>
             <w:r>
               <w:rPr>
@@ -2907,11 +2418,11 @@
       </w:tr>
       <w:tr>
         <w:trPr>
-          <w:trHeight w:val="420" w:hRule="atLeast"/>
+          <w:trHeight w:val="440" w:hRule="atLeast"/>
         </w:trPr>
         <w:tc>
           <w:tcPr>
-            <w:tcW w:type="dxa" w:w="3920"/>
+            <w:tcW w:type="dxa" w:w="6720"/>
             <w:tcBorders>
               <w:top w:val="single" w:color="555555" w:sz="4"/>
               <w:left w:val="single" w:color="555555" w:sz="4"/>
@@ -2942,149 +2453,57 @@
         </w:tc>
         <w:tc>
           <w:tcPr>
-            <w:tcW w:type="dxa" w:w="1300"/>
-            <w:tcBorders>
-              <w:top w:val="single" w:color="555555" w:sz="4"/>
-              <w:left w:val="single" w:color="555555" w:sz="4"/>
-              <w:bottom w:val="single" w:color="555555" w:sz="4"/>
-              <w:right w:val="single" w:color="555555" w:sz="4"/>
-            </w:tcBorders>
-            <w:tcMar>
-              <w:top w:type="dxa" w:w="30"/>
-              <w:left w:type="dxa" w:w="60"/>
-              <w:bottom w:type="dxa" w:w="30"/>
-              <w:right w:type="dxa" w:w="60"/>
-            </w:tcMar>
-            <w:vAlign w:val="center"/>
-          </w:tcPr>
-          <w:p>
-            <w:pPr>
-              <w:spacing w:after="0" w:before="0"/>
-              <w:jc w:val="center"/>
-            </w:pPr>
-            <w:r>
-              <w:rPr>
-                <w:rFonts w:ascii="Arial" w:cs="Arial" w:eastAsia="Arial" w:hAnsi="Arial"/>
-                <w:sz w:val="18"/>
-                <w:szCs w:val="18"/>
-              </w:rPr>
-              <w:t xml:space="preserve">bolsas / viajes</w:t>
-            </w:r>
-          </w:p>
-        </w:tc>
-        <w:tc>
-          <w:tcPr>
-            <w:tcW w:type="dxa" w:w="1600"/>
-            <w:tcBorders>
-              <w:top w:val="single" w:color="555555" w:sz="4"/>
-              <w:left w:val="single" w:color="555555" w:sz="4"/>
-              <w:bottom w:val="single" w:color="555555" w:sz="4"/>
-              <w:right w:val="single" w:color="555555" w:sz="4"/>
-            </w:tcBorders>
-            <w:tcMar>
-              <w:top w:type="dxa" w:w="30"/>
-              <w:left w:type="dxa" w:w="60"/>
-              <w:bottom w:type="dxa" w:w="30"/>
-              <w:right w:type="dxa" w:w="60"/>
-            </w:tcMar>
-            <w:vAlign w:val="center"/>
-          </w:tcPr>
-          <w:p>
-            <w:pPr>
-              <w:spacing w:after="0" w:before="0"/>
-            </w:pPr>
-            <w:r>
-              <w:rPr>
-                <w:rFonts w:ascii="Arial" w:cs="Arial" w:eastAsia="Arial" w:hAnsi="Arial"/>
-                <w:sz w:val="18"/>
-                <w:szCs w:val="18"/>
-              </w:rPr>
-              <w:t xml:space="preserve"/>
-            </w:r>
-          </w:p>
-        </w:tc>
-        <w:tc>
-          <w:tcPr>
-            <w:tcW w:type="dxa" w:w="1600"/>
-            <w:tcBorders>
-              <w:top w:val="single" w:color="555555" w:sz="4"/>
-              <w:left w:val="single" w:color="555555" w:sz="4"/>
-              <w:bottom w:val="single" w:color="555555" w:sz="4"/>
-              <w:right w:val="single" w:color="555555" w:sz="4"/>
-            </w:tcBorders>
-            <w:tcMar>
-              <w:top w:type="dxa" w:w="30"/>
-              <w:left w:type="dxa" w:w="60"/>
-              <w:bottom w:type="dxa" w:w="30"/>
-              <w:right w:type="dxa" w:w="60"/>
-            </w:tcMar>
-            <w:vAlign w:val="center"/>
-          </w:tcPr>
-          <w:p>
-            <w:pPr>
-              <w:spacing w:after="0" w:before="0"/>
-            </w:pPr>
-            <w:r>
-              <w:rPr>
-                <w:rFonts w:ascii="Arial" w:cs="Arial" w:eastAsia="Arial" w:hAnsi="Arial"/>
-                <w:sz w:val="18"/>
-                <w:szCs w:val="18"/>
-              </w:rPr>
-              <w:t xml:space="preserve"/>
-            </w:r>
-          </w:p>
-        </w:tc>
-        <w:tc>
-          <w:tcPr>
-            <w:tcW w:type="dxa" w:w="1400"/>
-            <w:tcBorders>
-              <w:top w:val="single" w:color="555555" w:sz="4"/>
-              <w:left w:val="single" w:color="555555" w:sz="4"/>
-              <w:bottom w:val="single" w:color="555555" w:sz="4"/>
-              <w:right w:val="single" w:color="555555" w:sz="4"/>
-            </w:tcBorders>
-            <w:tcMar>
-              <w:top w:type="dxa" w:w="30"/>
-              <w:left w:type="dxa" w:w="60"/>
-              <w:bottom w:type="dxa" w:w="30"/>
-              <w:right w:type="dxa" w:w="60"/>
-            </w:tcMar>
-            <w:vAlign w:val="center"/>
-          </w:tcPr>
-          <w:p>
-            <w:pPr>
-              <w:spacing w:after="0" w:before="0"/>
-            </w:pPr>
-            <w:r>
-              <w:rPr>
-                <w:rFonts w:ascii="Arial" w:cs="Arial" w:eastAsia="Arial" w:hAnsi="Arial"/>
-                <w:sz w:val="18"/>
-                <w:szCs w:val="18"/>
-              </w:rPr>
-              <w:t xml:space="preserve"/>
-            </w:r>
-          </w:p>
-        </w:tc>
-        <w:tc>
-          <w:tcPr>
-            <w:tcW w:type="dxa" w:w="1700"/>
-            <w:tcBorders>
-              <w:top w:val="single" w:color="555555" w:sz="4"/>
-              <w:left w:val="single" w:color="555555" w:sz="4"/>
-              <w:bottom w:val="single" w:color="555555" w:sz="4"/>
-              <w:right w:val="single" w:color="555555" w:sz="4"/>
-            </w:tcBorders>
-            <w:tcMar>
-              <w:top w:type="dxa" w:w="30"/>
-              <w:left w:type="dxa" w:w="60"/>
-              <w:bottom w:type="dxa" w:w="30"/>
-              <w:right w:type="dxa" w:w="60"/>
-            </w:tcMar>
-            <w:vAlign w:val="center"/>
-          </w:tcPr>
-          <w:p>
-            <w:pPr>
-              <w:spacing w:after="0" w:before="0"/>
+            <w:tcW w:type="dxa" w:w="2400"/>
+            <w:tcBorders>
+              <w:top w:val="single" w:color="555555" w:sz="4"/>
+              <w:left w:val="single" w:color="555555" w:sz="4"/>
+              <w:bottom w:val="single" w:color="555555" w:sz="4"/>
+              <w:right w:val="single" w:color="555555" w:sz="4"/>
+            </w:tcBorders>
+            <w:tcMar>
+              <w:top w:type="dxa" w:w="30"/>
+              <w:left w:type="dxa" w:w="60"/>
+              <w:bottom w:type="dxa" w:w="30"/>
+              <w:right w:type="dxa" w:w="60"/>
+            </w:tcMar>
+            <w:vAlign w:val="center"/>
+          </w:tcPr>
+          <w:p>
+            <w:pPr>
+              <w:spacing w:after="0" w:before="0"/>
+              <w:jc w:val="center"/>
+            </w:pPr>
+            <w:r>
+              <w:rPr>
+                <w:rFonts w:ascii="Arial" w:cs="Arial" w:eastAsia="Arial" w:hAnsi="Arial"/>
+                <w:sz w:val="18"/>
+                <w:szCs w:val="18"/>
+              </w:rPr>
+              <w:t xml:space="preserve">bolsas</w:t>
+            </w:r>
+          </w:p>
+        </w:tc>
+        <w:tc>
+          <w:tcPr>
+            <w:tcW w:type="dxa" w:w="2400"/>
+            <w:tcBorders>
+              <w:top w:val="single" w:color="555555" w:sz="4"/>
+              <w:left w:val="single" w:color="555555" w:sz="4"/>
+              <w:bottom w:val="single" w:color="555555" w:sz="4"/>
+              <w:right w:val="single" w:color="555555" w:sz="4"/>
+            </w:tcBorders>
+            <w:tcMar>
+              <w:top w:type="dxa" w:w="30"/>
+              <w:left w:type="dxa" w:w="60"/>
+              <w:bottom w:type="dxa" w:w="30"/>
+              <w:right w:type="dxa" w:w="60"/>
+            </w:tcMar>
+            <w:vAlign w:val="center"/>
+          </w:tcPr>
+          <w:p>
+            <w:pPr>
+              <w:spacing w:after="0" w:before="0"/>
+              <w:jc w:val="center"/>
             </w:pPr>
             <w:r>
               <w:rPr>
@@ -3099,11 +2518,11 @@
       </w:tr>
       <w:tr>
         <w:trPr>
-          <w:trHeight w:val="420" w:hRule="atLeast"/>
+          <w:trHeight w:val="440" w:hRule="atLeast"/>
         </w:trPr>
         <w:tc>
           <w:tcPr>
-            <w:tcW w:type="dxa" w:w="3920"/>
+            <w:tcW w:type="dxa" w:w="6720"/>
             <w:tcBorders>
               <w:top w:val="single" w:color="555555" w:sz="4"/>
               <w:left w:val="single" w:color="555555" w:sz="4"/>
@@ -3134,149 +2553,57 @@
         </w:tc>
         <w:tc>
           <w:tcPr>
-            <w:tcW w:type="dxa" w:w="1300"/>
-            <w:tcBorders>
-              <w:top w:val="single" w:color="555555" w:sz="4"/>
-              <w:left w:val="single" w:color="555555" w:sz="4"/>
-              <w:bottom w:val="single" w:color="555555" w:sz="4"/>
-              <w:right w:val="single" w:color="555555" w:sz="4"/>
-            </w:tcBorders>
-            <w:tcMar>
-              <w:top w:type="dxa" w:w="30"/>
-              <w:left w:type="dxa" w:w="60"/>
-              <w:bottom w:type="dxa" w:w="30"/>
-              <w:right w:type="dxa" w:w="60"/>
-            </w:tcMar>
-            <w:vAlign w:val="center"/>
-          </w:tcPr>
-          <w:p>
-            <w:pPr>
-              <w:spacing w:after="0" w:before="0"/>
-              <w:jc w:val="center"/>
-            </w:pPr>
-            <w:r>
-              <w:rPr>
-                <w:rFonts w:ascii="Arial" w:cs="Arial" w:eastAsia="Arial" w:hAnsi="Arial"/>
-                <w:sz w:val="18"/>
-                <w:szCs w:val="18"/>
-              </w:rPr>
-              <w:t xml:space="preserve">bolsas / viajes</w:t>
-            </w:r>
-          </w:p>
-        </w:tc>
-        <w:tc>
-          <w:tcPr>
-            <w:tcW w:type="dxa" w:w="1600"/>
-            <w:tcBorders>
-              <w:top w:val="single" w:color="555555" w:sz="4"/>
-              <w:left w:val="single" w:color="555555" w:sz="4"/>
-              <w:bottom w:val="single" w:color="555555" w:sz="4"/>
-              <w:right w:val="single" w:color="555555" w:sz="4"/>
-            </w:tcBorders>
-            <w:tcMar>
-              <w:top w:type="dxa" w:w="30"/>
-              <w:left w:type="dxa" w:w="60"/>
-              <w:bottom w:type="dxa" w:w="30"/>
-              <w:right w:type="dxa" w:w="60"/>
-            </w:tcMar>
-            <w:vAlign w:val="center"/>
-          </w:tcPr>
-          <w:p>
-            <w:pPr>
-              <w:spacing w:after="0" w:before="0"/>
-            </w:pPr>
-            <w:r>
-              <w:rPr>
-                <w:rFonts w:ascii="Arial" w:cs="Arial" w:eastAsia="Arial" w:hAnsi="Arial"/>
-                <w:sz w:val="18"/>
-                <w:szCs w:val="18"/>
-              </w:rPr>
-              <w:t xml:space="preserve"/>
-            </w:r>
-          </w:p>
-        </w:tc>
-        <w:tc>
-          <w:tcPr>
-            <w:tcW w:type="dxa" w:w="1600"/>
-            <w:tcBorders>
-              <w:top w:val="single" w:color="555555" w:sz="4"/>
-              <w:left w:val="single" w:color="555555" w:sz="4"/>
-              <w:bottom w:val="single" w:color="555555" w:sz="4"/>
-              <w:right w:val="single" w:color="555555" w:sz="4"/>
-            </w:tcBorders>
-            <w:tcMar>
-              <w:top w:type="dxa" w:w="30"/>
-              <w:left w:type="dxa" w:w="60"/>
-              <w:bottom w:type="dxa" w:w="30"/>
-              <w:right w:type="dxa" w:w="60"/>
-            </w:tcMar>
-            <w:vAlign w:val="center"/>
-          </w:tcPr>
-          <w:p>
-            <w:pPr>
-              <w:spacing w:after="0" w:before="0"/>
-            </w:pPr>
-            <w:r>
-              <w:rPr>
-                <w:rFonts w:ascii="Arial" w:cs="Arial" w:eastAsia="Arial" w:hAnsi="Arial"/>
-                <w:sz w:val="18"/>
-                <w:szCs w:val="18"/>
-              </w:rPr>
-              <w:t xml:space="preserve"/>
-            </w:r>
-          </w:p>
-        </w:tc>
-        <w:tc>
-          <w:tcPr>
-            <w:tcW w:type="dxa" w:w="1400"/>
-            <w:tcBorders>
-              <w:top w:val="single" w:color="555555" w:sz="4"/>
-              <w:left w:val="single" w:color="555555" w:sz="4"/>
-              <w:bottom w:val="single" w:color="555555" w:sz="4"/>
-              <w:right w:val="single" w:color="555555" w:sz="4"/>
-            </w:tcBorders>
-            <w:tcMar>
-              <w:top w:type="dxa" w:w="30"/>
-              <w:left w:type="dxa" w:w="60"/>
-              <w:bottom w:type="dxa" w:w="30"/>
-              <w:right w:type="dxa" w:w="60"/>
-            </w:tcMar>
-            <w:vAlign w:val="center"/>
-          </w:tcPr>
-          <w:p>
-            <w:pPr>
-              <w:spacing w:after="0" w:before="0"/>
-            </w:pPr>
-            <w:r>
-              <w:rPr>
-                <w:rFonts w:ascii="Arial" w:cs="Arial" w:eastAsia="Arial" w:hAnsi="Arial"/>
-                <w:sz w:val="18"/>
-                <w:szCs w:val="18"/>
-              </w:rPr>
-              <w:t xml:space="preserve"/>
-            </w:r>
-          </w:p>
-        </w:tc>
-        <w:tc>
-          <w:tcPr>
-            <w:tcW w:type="dxa" w:w="1700"/>
-            <w:tcBorders>
-              <w:top w:val="single" w:color="555555" w:sz="4"/>
-              <w:left w:val="single" w:color="555555" w:sz="4"/>
-              <w:bottom w:val="single" w:color="555555" w:sz="4"/>
-              <w:right w:val="single" w:color="555555" w:sz="4"/>
-            </w:tcBorders>
-            <w:tcMar>
-              <w:top w:type="dxa" w:w="30"/>
-              <w:left w:type="dxa" w:w="60"/>
-              <w:bottom w:type="dxa" w:w="30"/>
-              <w:right w:type="dxa" w:w="60"/>
-            </w:tcMar>
-            <w:vAlign w:val="center"/>
-          </w:tcPr>
-          <w:p>
-            <w:pPr>
-              <w:spacing w:after="0" w:before="0"/>
+            <w:tcW w:type="dxa" w:w="2400"/>
+            <w:tcBorders>
+              <w:top w:val="single" w:color="555555" w:sz="4"/>
+              <w:left w:val="single" w:color="555555" w:sz="4"/>
+              <w:bottom w:val="single" w:color="555555" w:sz="4"/>
+              <w:right w:val="single" w:color="555555" w:sz="4"/>
+            </w:tcBorders>
+            <w:tcMar>
+              <w:top w:type="dxa" w:w="30"/>
+              <w:left w:type="dxa" w:w="60"/>
+              <w:bottom w:type="dxa" w:w="30"/>
+              <w:right w:type="dxa" w:w="60"/>
+            </w:tcMar>
+            <w:vAlign w:val="center"/>
+          </w:tcPr>
+          <w:p>
+            <w:pPr>
+              <w:spacing w:after="0" w:before="0"/>
+              <w:jc w:val="center"/>
+            </w:pPr>
+            <w:r>
+              <w:rPr>
+                <w:rFonts w:ascii="Arial" w:cs="Arial" w:eastAsia="Arial" w:hAnsi="Arial"/>
+                <w:sz w:val="18"/>
+                <w:szCs w:val="18"/>
+              </w:rPr>
+              <w:t xml:space="preserve">bolsas</w:t>
+            </w:r>
+          </w:p>
+        </w:tc>
+        <w:tc>
+          <w:tcPr>
+            <w:tcW w:type="dxa" w:w="2400"/>
+            <w:tcBorders>
+              <w:top w:val="single" w:color="555555" w:sz="4"/>
+              <w:left w:val="single" w:color="555555" w:sz="4"/>
+              <w:bottom w:val="single" w:color="555555" w:sz="4"/>
+              <w:right w:val="single" w:color="555555" w:sz="4"/>
+            </w:tcBorders>
+            <w:tcMar>
+              <w:top w:type="dxa" w:w="30"/>
+              <w:left w:type="dxa" w:w="60"/>
+              <w:bottom w:type="dxa" w:w="30"/>
+              <w:right w:type="dxa" w:w="60"/>
+            </w:tcMar>
+            <w:vAlign w:val="center"/>
+          </w:tcPr>
+          <w:p>
+            <w:pPr>
+              <w:spacing w:after="0" w:before="0"/>
+              <w:jc w:val="center"/>
             </w:pPr>
             <w:r>
               <w:rPr>
@@ -3291,203 +2618,11 @@
       </w:tr>
       <w:tr>
         <w:trPr>
-          <w:trHeight w:val="420" w:hRule="atLeast"/>
+          <w:trHeight w:val="440" w:hRule="atLeast"/>
         </w:trPr>
         <w:tc>
           <w:tcPr>
-            <w:tcW w:type="dxa" w:w="3920"/>
-            <w:tcBorders>
-              <w:top w:val="single" w:color="555555" w:sz="4"/>
-              <w:left w:val="single" w:color="555555" w:sz="4"/>
-              <w:bottom w:val="single" w:color="555555" w:sz="4"/>
-              <w:right w:val="single" w:color="555555" w:sz="4"/>
-            </w:tcBorders>
-            <w:tcMar>
-              <w:top w:type="dxa" w:w="30"/>
-              <w:left w:type="dxa" w:w="60"/>
-              <w:bottom w:type="dxa" w:w="30"/>
-              <w:right w:type="dxa" w:w="60"/>
-            </w:tcMar>
-            <w:vAlign w:val="center"/>
-          </w:tcPr>
-          <w:p>
-            <w:pPr>
-              <w:spacing w:after="0" w:before="0"/>
-            </w:pPr>
-            <w:r>
-              <w:rPr>
-                <w:rFonts w:ascii="Arial" w:cs="Arial" w:eastAsia="Arial" w:hAnsi="Arial"/>
-                <w:sz w:val="18"/>
-                <w:szCs w:val="18"/>
-              </w:rPr>
-              <w:t xml:space="preserve">Destape de alcantarillas, box o tuberías</w:t>
-            </w:r>
-          </w:p>
-        </w:tc>
-        <w:tc>
-          <w:tcPr>
-            <w:tcW w:type="dxa" w:w="1300"/>
-            <w:tcBorders>
-              <w:top w:val="single" w:color="555555" w:sz="4"/>
-              <w:left w:val="single" w:color="555555" w:sz="4"/>
-              <w:bottom w:val="single" w:color="555555" w:sz="4"/>
-              <w:right w:val="single" w:color="555555" w:sz="4"/>
-            </w:tcBorders>
-            <w:tcMar>
-              <w:top w:type="dxa" w:w="30"/>
-              <w:left w:type="dxa" w:w="60"/>
-              <w:bottom w:type="dxa" w:w="30"/>
-              <w:right w:type="dxa" w:w="60"/>
-            </w:tcMar>
-            <w:vAlign w:val="center"/>
-          </w:tcPr>
-          <w:p>
-            <w:pPr>
-              <w:spacing w:after="0" w:before="0"/>
-              <w:jc w:val="center"/>
-            </w:pPr>
-            <w:r>
-              <w:rPr>
-                <w:rFonts w:ascii="Arial" w:cs="Arial" w:eastAsia="Arial" w:hAnsi="Arial"/>
-                <w:sz w:val="18"/>
-                <w:szCs w:val="18"/>
-              </w:rPr>
-              <w:t xml:space="preserve">und</w:t>
-            </w:r>
-          </w:p>
-        </w:tc>
-        <w:tc>
-          <w:tcPr>
-            <w:tcW w:type="dxa" w:w="1600"/>
-            <w:tcBorders>
-              <w:top w:val="single" w:color="555555" w:sz="4"/>
-              <w:left w:val="single" w:color="555555" w:sz="4"/>
-              <w:bottom w:val="single" w:color="555555" w:sz="4"/>
-              <w:right w:val="single" w:color="555555" w:sz="4"/>
-            </w:tcBorders>
-            <w:tcMar>
-              <w:top w:type="dxa" w:w="30"/>
-              <w:left w:type="dxa" w:w="60"/>
-              <w:bottom w:type="dxa" w:w="30"/>
-              <w:right w:type="dxa" w:w="60"/>
-            </w:tcMar>
-            <w:vAlign w:val="center"/>
-          </w:tcPr>
-          <w:p>
-            <w:pPr>
-              <w:spacing w:after="0" w:before="0"/>
-            </w:pPr>
-            <w:r>
-              <w:rPr>
-                <w:rFonts w:ascii="Arial" w:cs="Arial" w:eastAsia="Arial" w:hAnsi="Arial"/>
-                <w:sz w:val="18"/>
-                <w:szCs w:val="18"/>
-              </w:rPr>
-              <w:t xml:space="preserve"/>
-            </w:r>
-          </w:p>
-        </w:tc>
-        <w:tc>
-          <w:tcPr>
-            <w:tcW w:type="dxa" w:w="1600"/>
-            <w:tcBorders>
-              <w:top w:val="single" w:color="555555" w:sz="4"/>
-              <w:left w:val="single" w:color="555555" w:sz="4"/>
-              <w:bottom w:val="single" w:color="555555" w:sz="4"/>
-              <w:right w:val="single" w:color="555555" w:sz="4"/>
-            </w:tcBorders>
-            <w:tcMar>
-              <w:top w:type="dxa" w:w="30"/>
-              <w:left w:type="dxa" w:w="60"/>
-              <w:bottom w:type="dxa" w:w="30"/>
-              <w:right w:type="dxa" w:w="60"/>
-            </w:tcMar>
-            <w:vAlign w:val="center"/>
-          </w:tcPr>
-          <w:p>
-            <w:pPr>
-              <w:spacing w:after="0" w:before="0"/>
-            </w:pPr>
-            <w:r>
-              <w:rPr>
-                <w:rFonts w:ascii="Arial" w:cs="Arial" w:eastAsia="Arial" w:hAnsi="Arial"/>
-                <w:sz w:val="18"/>
-                <w:szCs w:val="18"/>
-              </w:rPr>
-              <w:t xml:space="preserve"/>
-            </w:r>
-          </w:p>
-        </w:tc>
-        <w:tc>
-          <w:tcPr>
-            <w:tcW w:type="dxa" w:w="1400"/>
-            <w:tcBorders>
-              <w:top w:val="single" w:color="555555" w:sz="4"/>
-              <w:left w:val="single" w:color="555555" w:sz="4"/>
-              <w:bottom w:val="single" w:color="555555" w:sz="4"/>
-              <w:right w:val="single" w:color="555555" w:sz="4"/>
-            </w:tcBorders>
-            <w:tcMar>
-              <w:top w:type="dxa" w:w="30"/>
-              <w:left w:type="dxa" w:w="60"/>
-              <w:bottom w:type="dxa" w:w="30"/>
-              <w:right w:type="dxa" w:w="60"/>
-            </w:tcMar>
-            <w:vAlign w:val="center"/>
-          </w:tcPr>
-          <w:p>
-            <w:pPr>
-              <w:spacing w:after="0" w:before="0"/>
-            </w:pPr>
-            <w:r>
-              <w:rPr>
-                <w:rFonts w:ascii="Arial" w:cs="Arial" w:eastAsia="Arial" w:hAnsi="Arial"/>
-                <w:sz w:val="18"/>
-                <w:szCs w:val="18"/>
-              </w:rPr>
-              <w:t xml:space="preserve"/>
-            </w:r>
-          </w:p>
-        </w:tc>
-        <w:tc>
-          <w:tcPr>
-            <w:tcW w:type="dxa" w:w="1700"/>
-            <w:tcBorders>
-              <w:top w:val="single" w:color="555555" w:sz="4"/>
-              <w:left w:val="single" w:color="555555" w:sz="4"/>
-              <w:bottom w:val="single" w:color="555555" w:sz="4"/>
-              <w:right w:val="single" w:color="555555" w:sz="4"/>
-            </w:tcBorders>
-            <w:tcMar>
-              <w:top w:type="dxa" w:w="30"/>
-              <w:left w:type="dxa" w:w="60"/>
-              <w:bottom w:type="dxa" w:w="30"/>
-              <w:right w:type="dxa" w:w="60"/>
-            </w:tcMar>
-            <w:vAlign w:val="center"/>
-          </w:tcPr>
-          <w:p>
-            <w:pPr>
-              <w:spacing w:after="0" w:before="0"/>
-            </w:pPr>
-            <w:r>
-              <w:rPr>
-                <w:rFonts w:ascii="Arial" w:cs="Arial" w:eastAsia="Arial" w:hAnsi="Arial"/>
-                <w:sz w:val="18"/>
-                <w:szCs w:val="18"/>
-              </w:rPr>
-              <w:t xml:space="preserve"/>
-            </w:r>
-          </w:p>
-        </w:tc>
-      </w:tr>
-      <w:tr>
-        <w:trPr>
-          <w:trHeight w:val="420" w:hRule="atLeast"/>
-        </w:trPr>
-        <w:tc>
-          <w:tcPr>
-            <w:tcW w:type="dxa" w:w="3920"/>
+            <w:tcW w:type="dxa" w:w="6720"/>
             <w:tcBorders>
               <w:top w:val="single" w:color="555555" w:sz="4"/>
               <w:left w:val="single" w:color="555555" w:sz="4"/>
@@ -3518,149 +2653,57 @@
         </w:tc>
         <w:tc>
           <w:tcPr>
-            <w:tcW w:type="dxa" w:w="1300"/>
-            <w:tcBorders>
-              <w:top w:val="single" w:color="555555" w:sz="4"/>
-              <w:left w:val="single" w:color="555555" w:sz="4"/>
-              <w:bottom w:val="single" w:color="555555" w:sz="4"/>
-              <w:right w:val="single" w:color="555555" w:sz="4"/>
-            </w:tcBorders>
-            <w:tcMar>
-              <w:top w:type="dxa" w:w="30"/>
-              <w:left w:type="dxa" w:w="60"/>
-              <w:bottom w:type="dxa" w:w="30"/>
-              <w:right w:type="dxa" w:w="60"/>
-            </w:tcMar>
-            <w:vAlign w:val="center"/>
-          </w:tcPr>
-          <w:p>
-            <w:pPr>
-              <w:spacing w:after="0" w:before="0"/>
-              <w:jc w:val="center"/>
-            </w:pPr>
-            <w:r>
-              <w:rPr>
-                <w:rFonts w:ascii="Arial" w:cs="Arial" w:eastAsia="Arial" w:hAnsi="Arial"/>
-                <w:sz w:val="18"/>
-                <w:szCs w:val="18"/>
-              </w:rPr>
-              <w:t xml:space="preserve"/>
-            </w:r>
-          </w:p>
-        </w:tc>
-        <w:tc>
-          <w:tcPr>
-            <w:tcW w:type="dxa" w:w="1600"/>
-            <w:tcBorders>
-              <w:top w:val="single" w:color="555555" w:sz="4"/>
-              <w:left w:val="single" w:color="555555" w:sz="4"/>
-              <w:bottom w:val="single" w:color="555555" w:sz="4"/>
-              <w:right w:val="single" w:color="555555" w:sz="4"/>
-            </w:tcBorders>
-            <w:tcMar>
-              <w:top w:type="dxa" w:w="30"/>
-              <w:left w:type="dxa" w:w="60"/>
-              <w:bottom w:type="dxa" w:w="30"/>
-              <w:right w:type="dxa" w:w="60"/>
-            </w:tcMar>
-            <w:vAlign w:val="center"/>
-          </w:tcPr>
-          <w:p>
-            <w:pPr>
-              <w:spacing w:after="0" w:before="0"/>
-            </w:pPr>
-            <w:r>
-              <w:rPr>
-                <w:rFonts w:ascii="Arial" w:cs="Arial" w:eastAsia="Arial" w:hAnsi="Arial"/>
-                <w:sz w:val="18"/>
-                <w:szCs w:val="18"/>
-              </w:rPr>
-              <w:t xml:space="preserve"/>
-            </w:r>
-          </w:p>
-        </w:tc>
-        <w:tc>
-          <w:tcPr>
-            <w:tcW w:type="dxa" w:w="1600"/>
-            <w:tcBorders>
-              <w:top w:val="single" w:color="555555" w:sz="4"/>
-              <w:left w:val="single" w:color="555555" w:sz="4"/>
-              <w:bottom w:val="single" w:color="555555" w:sz="4"/>
-              <w:right w:val="single" w:color="555555" w:sz="4"/>
-            </w:tcBorders>
-            <w:tcMar>
-              <w:top w:type="dxa" w:w="30"/>
-              <w:left w:type="dxa" w:w="60"/>
-              <w:bottom w:type="dxa" w:w="30"/>
-              <w:right w:type="dxa" w:w="60"/>
-            </w:tcMar>
-            <w:vAlign w:val="center"/>
-          </w:tcPr>
-          <w:p>
-            <w:pPr>
-              <w:spacing w:after="0" w:before="0"/>
-            </w:pPr>
-            <w:r>
-              <w:rPr>
-                <w:rFonts w:ascii="Arial" w:cs="Arial" w:eastAsia="Arial" w:hAnsi="Arial"/>
-                <w:sz w:val="18"/>
-                <w:szCs w:val="18"/>
-              </w:rPr>
-              <w:t xml:space="preserve"/>
-            </w:r>
-          </w:p>
-        </w:tc>
-        <w:tc>
-          <w:tcPr>
-            <w:tcW w:type="dxa" w:w="1400"/>
-            <w:tcBorders>
-              <w:top w:val="single" w:color="555555" w:sz="4"/>
-              <w:left w:val="single" w:color="555555" w:sz="4"/>
-              <w:bottom w:val="single" w:color="555555" w:sz="4"/>
-              <w:right w:val="single" w:color="555555" w:sz="4"/>
-            </w:tcBorders>
-            <w:tcMar>
-              <w:top w:type="dxa" w:w="30"/>
-              <w:left w:type="dxa" w:w="60"/>
-              <w:bottom w:type="dxa" w:w="30"/>
-              <w:right w:type="dxa" w:w="60"/>
-            </w:tcMar>
-            <w:vAlign w:val="center"/>
-          </w:tcPr>
-          <w:p>
-            <w:pPr>
-              <w:spacing w:after="0" w:before="0"/>
-            </w:pPr>
-            <w:r>
-              <w:rPr>
-                <w:rFonts w:ascii="Arial" w:cs="Arial" w:eastAsia="Arial" w:hAnsi="Arial"/>
-                <w:sz w:val="18"/>
-                <w:szCs w:val="18"/>
-              </w:rPr>
-              <w:t xml:space="preserve"/>
-            </w:r>
-          </w:p>
-        </w:tc>
-        <w:tc>
-          <w:tcPr>
-            <w:tcW w:type="dxa" w:w="1700"/>
-            <w:tcBorders>
-              <w:top w:val="single" w:color="555555" w:sz="4"/>
-              <w:left w:val="single" w:color="555555" w:sz="4"/>
-              <w:bottom w:val="single" w:color="555555" w:sz="4"/>
-              <w:right w:val="single" w:color="555555" w:sz="4"/>
-            </w:tcBorders>
-            <w:tcMar>
-              <w:top w:type="dxa" w:w="30"/>
-              <w:left w:type="dxa" w:w="60"/>
-              <w:bottom w:type="dxa" w:w="30"/>
-              <w:right w:type="dxa" w:w="60"/>
-            </w:tcMar>
-            <w:vAlign w:val="center"/>
-          </w:tcPr>
-          <w:p>
-            <w:pPr>
-              <w:spacing w:after="0" w:before="0"/>
+            <w:tcW w:type="dxa" w:w="2400"/>
+            <w:tcBorders>
+              <w:top w:val="single" w:color="555555" w:sz="4"/>
+              <w:left w:val="single" w:color="555555" w:sz="4"/>
+              <w:bottom w:val="single" w:color="555555" w:sz="4"/>
+              <w:right w:val="single" w:color="555555" w:sz="4"/>
+            </w:tcBorders>
+            <w:tcMar>
+              <w:top w:type="dxa" w:w="30"/>
+              <w:left w:type="dxa" w:w="60"/>
+              <w:bottom w:type="dxa" w:w="30"/>
+              <w:right w:type="dxa" w:w="60"/>
+            </w:tcMar>
+            <w:vAlign w:val="center"/>
+          </w:tcPr>
+          <w:p>
+            <w:pPr>
+              <w:spacing w:after="0" w:before="0"/>
+              <w:jc w:val="center"/>
+            </w:pPr>
+            <w:r>
+              <w:rPr>
+                <w:rFonts w:ascii="Arial" w:cs="Arial" w:eastAsia="Arial" w:hAnsi="Arial"/>
+                <w:sz w:val="18"/>
+                <w:szCs w:val="18"/>
+              </w:rPr>
+              <w:t xml:space="preserve"/>
+            </w:r>
+          </w:p>
+        </w:tc>
+        <w:tc>
+          <w:tcPr>
+            <w:tcW w:type="dxa" w:w="2400"/>
+            <w:tcBorders>
+              <w:top w:val="single" w:color="555555" w:sz="4"/>
+              <w:left w:val="single" w:color="555555" w:sz="4"/>
+              <w:bottom w:val="single" w:color="555555" w:sz="4"/>
+              <w:right w:val="single" w:color="555555" w:sz="4"/>
+            </w:tcBorders>
+            <w:tcMar>
+              <w:top w:type="dxa" w:w="30"/>
+              <w:left w:type="dxa" w:w="60"/>
+              <w:bottom w:type="dxa" w:w="30"/>
+              <w:right w:type="dxa" w:w="60"/>
+            </w:tcMar>
+            <w:vAlign w:val="center"/>
+          </w:tcPr>
+          <w:p>
+            <w:pPr>
+              <w:spacing w:after="0" w:before="0"/>
+              <w:jc w:val="center"/>
             </w:pPr>
             <w:r>
               <w:rPr>
@@ -3674,19 +2717,6 @@
         </w:tc>
       </w:tr>
     </w:tbl>
-    <w:p>
-      <w:pPr>
-        <w:spacing w:after="20" w:before="40"/>
-      </w:pPr>
-      <w:r>
-        <w:rPr>
-          <w:rFonts w:ascii="Arial" w:cs="Arial" w:eastAsia="Arial" w:hAnsi="Arial"/>
-          <w:sz w:val="15"/>
-          <w:szCs w:val="15"/>
-        </w:rPr>
-        <w:t xml:space="preserve">¿Se cumplió la meta del día?  Sí ☐  No ☐   ¿Por qué no?: ____________________________________________________________</w:t>
-      </w:r>
-    </w:p>
     <w:p>
       <w:pPr>
         <w:shd w:fill="2E5E3E" w:color="auto" w:val="clear"/>

</xml_diff>

<commit_message>
Hoja de campo: distancia del caño, días programados y columnas de realizado/observación
Co-Authored-By: Claude Opus 5.5 <noreply@anthropic.com>
Claude-Session: https://claude.ai/code/session_01FfUnftB8faW5Tj1T7jUfMj
</commit_message>
<xml_diff>
--- a/Hoja_Campo_Limpieza_Roceria_Comuna2.docx
+++ b/Hoja_Campo_Limpieza_Roceria_Comuna2.docx
@@ -451,7 +451,7 @@
                 <w:sz w:val="18"/>
                 <w:szCs w:val="18"/>
               </w:rPr>
-              <w:t xml:space="preserve">Tramo del día (abscisa de – a)</w:t>
+              <w:t xml:space="preserve">Distancia del caño</w:t>
             </w:r>
           </w:p>
         </w:tc>
@@ -484,7 +484,7 @@
                 <w:sz w:val="18"/>
                 <w:szCs w:val="18"/>
               </w:rPr>
-              <w:t xml:space="preserve">de ________ a ________</w:t>
+              <w:t xml:space="preserve">__________ m</w:t>
             </w:r>
           </w:p>
         </w:tc>
@@ -624,6 +624,94 @@
                 <w:szCs w:val="18"/>
               </w:rPr>
               <w:t xml:space="preserve">Sol ☐   Nublado ☐   Lluvia ☐</w:t>
+            </w:r>
+          </w:p>
+        </w:tc>
+      </w:tr>
+    </w:tbl>
+    <w:tbl>
+      <w:tblPr>
+        <w:tblW w:type="dxa" w:w="11520"/>
+        <w:tblBorders>
+          <w:top w:val="single" w:color="auto" w:sz="4"/>
+          <w:left w:val="single" w:color="auto" w:sz="4"/>
+          <w:bottom w:val="single" w:color="auto" w:sz="4"/>
+          <w:right w:val="single" w:color="auto" w:sz="4"/>
+          <w:insideH w:val="single" w:color="auto" w:sz="4"/>
+          <w:insideV w:val="single" w:color="auto" w:sz="4"/>
+        </w:tblBorders>
+        <w:tblLayout w:type="fixed"/>
+      </w:tblPr>
+      <w:tblGrid>
+        <w:gridCol w:w="4600"/>
+        <w:gridCol w:w="6920"/>
+      </w:tblGrid>
+      <w:tr>
+        <w:trPr>
+          <w:trHeight w:val="420" w:hRule="atLeast"/>
+        </w:trPr>
+        <w:tc>
+          <w:tcPr>
+            <w:tcW w:type="dxa" w:w="4600"/>
+            <w:tcBorders>
+              <w:top w:val="single" w:color="555555" w:sz="4"/>
+              <w:left w:val="single" w:color="555555" w:sz="4"/>
+              <w:bottom w:val="single" w:color="555555" w:sz="4"/>
+              <w:right w:val="single" w:color="555555" w:sz="4"/>
+            </w:tcBorders>
+            <w:shd w:fill="F2F2F2" w:color="auto" w:val="clear"/>
+            <w:tcMar>
+              <w:top w:type="dxa" w:w="30"/>
+              <w:left w:type="dxa" w:w="60"/>
+              <w:bottom w:type="dxa" w:w="30"/>
+              <w:right w:type="dxa" w:w="60"/>
+            </w:tcMar>
+            <w:vAlign w:val="center"/>
+          </w:tcPr>
+          <w:p>
+            <w:pPr>
+              <w:spacing w:after="0" w:before="0"/>
+            </w:pPr>
+            <w:r>
+              <w:rPr>
+                <w:rFonts w:ascii="Arial" w:cs="Arial" w:eastAsia="Arial" w:hAnsi="Arial"/>
+                <w:b/>
+                <w:bCs/>
+                <w:sz w:val="18"/>
+                <w:szCs w:val="18"/>
+              </w:rPr>
+              <w:t xml:space="preserve">Días de ejecución programados para el caño</w:t>
+            </w:r>
+          </w:p>
+        </w:tc>
+        <w:tc>
+          <w:tcPr>
+            <w:tcW w:type="dxa" w:w="6920"/>
+            <w:tcBorders>
+              <w:top w:val="single" w:color="555555" w:sz="4"/>
+              <w:left w:val="single" w:color="555555" w:sz="4"/>
+              <w:bottom w:val="single" w:color="555555" w:sz="4"/>
+              <w:right w:val="single" w:color="555555" w:sz="4"/>
+            </w:tcBorders>
+            <w:tcMar>
+              <w:top w:type="dxa" w:w="30"/>
+              <w:left w:type="dxa" w:w="60"/>
+              <w:bottom w:type="dxa" w:w="30"/>
+              <w:right w:type="dxa" w:w="60"/>
+            </w:tcMar>
+            <w:vAlign w:val="center"/>
+          </w:tcPr>
+          <w:p>
+            <w:pPr>
+              <w:spacing w:after="0" w:before="0"/>
+            </w:pPr>
+            <w:r>
+              <w:rPr>
+                <w:rFonts w:ascii="Arial" w:cs="Arial" w:eastAsia="Arial" w:hAnsi="Arial"/>
+                <w:sz w:val="18"/>
+                <w:szCs w:val="18"/>
+              </w:rPr>
+              <w:t xml:space="preserve">__________ días</w:t>
             </w:r>
           </w:p>
         </w:tc>
@@ -1902,9 +1990,11 @@
         <w:tblLayout w:type="fixed"/>
       </w:tblPr>
       <w:tblGrid>
-        <w:gridCol w:w="6720"/>
-        <w:gridCol w:w="2400"/>
-        <w:gridCol w:w="2400"/>
+        <w:gridCol w:w="4120"/>
+        <w:gridCol w:w="1250"/>
+        <w:gridCol w:w="1250"/>
+        <w:gridCol w:w="1300"/>
+        <w:gridCol w:w="3600"/>
       </w:tblGrid>
       <w:tr>
         <w:trPr>
@@ -1912,7 +2002,7 @@
         </w:trPr>
         <w:tc>
           <w:tcPr>
-            <w:tcW w:type="dxa" w:w="6720"/>
+            <w:tcW w:type="dxa" w:w="4120"/>
             <w:tcBorders>
               <w:top w:val="single" w:color="555555" w:sz="4"/>
               <w:left w:val="single" w:color="555555" w:sz="4"/>
@@ -1947,7 +2037,7 @@
         </w:tc>
         <w:tc>
           <w:tcPr>
-            <w:tcW w:type="dxa" w:w="2400"/>
+            <w:tcW w:type="dxa" w:w="1250"/>
             <w:tcBorders>
               <w:top w:val="single" w:color="555555" w:sz="4"/>
               <w:left w:val="single" w:color="555555" w:sz="4"/>
@@ -1982,7 +2072,7 @@
         </w:tc>
         <w:tc>
           <w:tcPr>
-            <w:tcW w:type="dxa" w:w="2400"/>
+            <w:tcW w:type="dxa" w:w="1250"/>
             <w:tcBorders>
               <w:top w:val="single" w:color="555555" w:sz="4"/>
               <w:left w:val="single" w:color="555555" w:sz="4"/>
@@ -2012,6 +2102,76 @@
                 <w:szCs w:val="18"/>
               </w:rPr>
               <w:t xml:space="preserve">Cantidad</w:t>
+            </w:r>
+          </w:p>
+        </w:tc>
+        <w:tc>
+          <w:tcPr>
+            <w:tcW w:type="dxa" w:w="1300"/>
+            <w:tcBorders>
+              <w:top w:val="single" w:color="555555" w:sz="4"/>
+              <w:left w:val="single" w:color="555555" w:sz="4"/>
+              <w:bottom w:val="single" w:color="555555" w:sz="4"/>
+              <w:right w:val="single" w:color="555555" w:sz="4"/>
+            </w:tcBorders>
+            <w:shd w:fill="D9E2D0" w:color="auto" w:val="clear"/>
+            <w:tcMar>
+              <w:top w:type="dxa" w:w="30"/>
+              <w:left w:type="dxa" w:w="60"/>
+              <w:bottom w:type="dxa" w:w="30"/>
+              <w:right w:type="dxa" w:w="60"/>
+            </w:tcMar>
+            <w:vAlign w:val="center"/>
+          </w:tcPr>
+          <w:p>
+            <w:pPr>
+              <w:spacing w:after="0" w:before="0"/>
+              <w:jc w:val="center"/>
+            </w:pPr>
+            <w:r>
+              <w:rPr>
+                <w:rFonts w:ascii="Arial" w:cs="Arial" w:eastAsia="Arial" w:hAnsi="Arial"/>
+                <w:b/>
+                <w:bCs/>
+                <w:sz w:val="18"/>
+                <w:szCs w:val="18"/>
+              </w:rPr>
+              <w:t xml:space="preserve">¿Se realizó? (Sí / No)</w:t>
+            </w:r>
+          </w:p>
+        </w:tc>
+        <w:tc>
+          <w:tcPr>
+            <w:tcW w:type="dxa" w:w="3600"/>
+            <w:tcBorders>
+              <w:top w:val="single" w:color="555555" w:sz="4"/>
+              <w:left w:val="single" w:color="555555" w:sz="4"/>
+              <w:bottom w:val="single" w:color="555555" w:sz="4"/>
+              <w:right w:val="single" w:color="555555" w:sz="4"/>
+            </w:tcBorders>
+            <w:shd w:fill="D9E2D0" w:color="auto" w:val="clear"/>
+            <w:tcMar>
+              <w:top w:type="dxa" w:w="30"/>
+              <w:left w:type="dxa" w:w="60"/>
+              <w:bottom w:type="dxa" w:w="30"/>
+              <w:right w:type="dxa" w:w="60"/>
+            </w:tcMar>
+            <w:vAlign w:val="center"/>
+          </w:tcPr>
+          <w:p>
+            <w:pPr>
+              <w:spacing w:after="0" w:before="0"/>
+              <w:jc w:val="center"/>
+            </w:pPr>
+            <w:r>
+              <w:rPr>
+                <w:rFonts w:ascii="Arial" w:cs="Arial" w:eastAsia="Arial" w:hAnsi="Arial"/>
+                <w:b/>
+                <w:bCs/>
+                <w:sz w:val="18"/>
+                <w:szCs w:val="18"/>
+              </w:rPr>
+              <w:t xml:space="preserve">Si no se realizó, ¿por qué?</w:t>
             </w:r>
           </w:p>
         </w:tc>
@@ -2022,7 +2182,7 @@
         </w:trPr>
         <w:tc>
           <w:tcPr>
-            <w:tcW w:type="dxa" w:w="6720"/>
+            <w:tcW w:type="dxa" w:w="4120"/>
             <w:tcBorders>
               <w:top w:val="single" w:color="555555" w:sz="4"/>
               <w:left w:val="single" w:color="555555" w:sz="4"/>
@@ -2053,7 +2213,7 @@
         </w:tc>
         <w:tc>
           <w:tcPr>
-            <w:tcW w:type="dxa" w:w="2400"/>
+            <w:tcW w:type="dxa" w:w="1250"/>
             <w:tcBorders>
               <w:top w:val="single" w:color="555555" w:sz="4"/>
               <w:left w:val="single" w:color="555555" w:sz="4"/>
@@ -2085,25 +2245,88 @@
         </w:tc>
         <w:tc>
           <w:tcPr>
-            <w:tcW w:type="dxa" w:w="2400"/>
-            <w:tcBorders>
-              <w:top w:val="single" w:color="555555" w:sz="4"/>
-              <w:left w:val="single" w:color="555555" w:sz="4"/>
-              <w:bottom w:val="single" w:color="555555" w:sz="4"/>
-              <w:right w:val="single" w:color="555555" w:sz="4"/>
-            </w:tcBorders>
-            <w:tcMar>
-              <w:top w:type="dxa" w:w="30"/>
-              <w:left w:type="dxa" w:w="60"/>
-              <w:bottom w:type="dxa" w:w="30"/>
-              <w:right w:type="dxa" w:w="60"/>
-            </w:tcMar>
-            <w:vAlign w:val="center"/>
-          </w:tcPr>
-          <w:p>
-            <w:pPr>
-              <w:spacing w:after="0" w:before="0"/>
-              <w:jc w:val="center"/>
+            <w:tcW w:type="dxa" w:w="1250"/>
+            <w:tcBorders>
+              <w:top w:val="single" w:color="555555" w:sz="4"/>
+              <w:left w:val="single" w:color="555555" w:sz="4"/>
+              <w:bottom w:val="single" w:color="555555" w:sz="4"/>
+              <w:right w:val="single" w:color="555555" w:sz="4"/>
+            </w:tcBorders>
+            <w:tcMar>
+              <w:top w:type="dxa" w:w="30"/>
+              <w:left w:type="dxa" w:w="60"/>
+              <w:bottom w:type="dxa" w:w="30"/>
+              <w:right w:type="dxa" w:w="60"/>
+            </w:tcMar>
+            <w:vAlign w:val="center"/>
+          </w:tcPr>
+          <w:p>
+            <w:pPr>
+              <w:spacing w:after="0" w:before="0"/>
+              <w:jc w:val="center"/>
+            </w:pPr>
+            <w:r>
+              <w:rPr>
+                <w:rFonts w:ascii="Arial" w:cs="Arial" w:eastAsia="Arial" w:hAnsi="Arial"/>
+                <w:sz w:val="18"/>
+                <w:szCs w:val="18"/>
+              </w:rPr>
+              <w:t xml:space="preserve"/>
+            </w:r>
+          </w:p>
+        </w:tc>
+        <w:tc>
+          <w:tcPr>
+            <w:tcW w:type="dxa" w:w="1300"/>
+            <w:tcBorders>
+              <w:top w:val="single" w:color="555555" w:sz="4"/>
+              <w:left w:val="single" w:color="555555" w:sz="4"/>
+              <w:bottom w:val="single" w:color="555555" w:sz="4"/>
+              <w:right w:val="single" w:color="555555" w:sz="4"/>
+            </w:tcBorders>
+            <w:tcMar>
+              <w:top w:type="dxa" w:w="30"/>
+              <w:left w:type="dxa" w:w="60"/>
+              <w:bottom w:type="dxa" w:w="30"/>
+              <w:right w:type="dxa" w:w="60"/>
+            </w:tcMar>
+            <w:vAlign w:val="center"/>
+          </w:tcPr>
+          <w:p>
+            <w:pPr>
+              <w:spacing w:after="0" w:before="0"/>
+              <w:jc w:val="center"/>
+            </w:pPr>
+            <w:r>
+              <w:rPr>
+                <w:rFonts w:ascii="Arial" w:cs="Arial" w:eastAsia="Arial" w:hAnsi="Arial"/>
+                <w:sz w:val="18"/>
+                <w:szCs w:val="18"/>
+              </w:rPr>
+              <w:t xml:space="preserve"/>
+            </w:r>
+          </w:p>
+        </w:tc>
+        <w:tc>
+          <w:tcPr>
+            <w:tcW w:type="dxa" w:w="3600"/>
+            <w:tcBorders>
+              <w:top w:val="single" w:color="555555" w:sz="4"/>
+              <w:left w:val="single" w:color="555555" w:sz="4"/>
+              <w:bottom w:val="single" w:color="555555" w:sz="4"/>
+              <w:right w:val="single" w:color="555555" w:sz="4"/>
+            </w:tcBorders>
+            <w:tcMar>
+              <w:top w:type="dxa" w:w="30"/>
+              <w:left w:type="dxa" w:w="60"/>
+              <w:bottom w:type="dxa" w:w="30"/>
+              <w:right w:type="dxa" w:w="60"/>
+            </w:tcMar>
+            <w:vAlign w:val="center"/>
+          </w:tcPr>
+          <w:p>
+            <w:pPr>
+              <w:spacing w:after="0" w:before="0"/>
             </w:pPr>
             <w:r>
               <w:rPr>
@@ -2122,7 +2345,7 @@
         </w:trPr>
         <w:tc>
           <w:tcPr>
-            <w:tcW w:type="dxa" w:w="6720"/>
+            <w:tcW w:type="dxa" w:w="4120"/>
             <w:tcBorders>
               <w:top w:val="single" w:color="555555" w:sz="4"/>
               <w:left w:val="single" w:color="555555" w:sz="4"/>
@@ -2153,7 +2376,7 @@
         </w:tc>
         <w:tc>
           <w:tcPr>
-            <w:tcW w:type="dxa" w:w="2400"/>
+            <w:tcW w:type="dxa" w:w="1250"/>
             <w:tcBorders>
               <w:top w:val="single" w:color="555555" w:sz="4"/>
               <w:left w:val="single" w:color="555555" w:sz="4"/>
@@ -2185,25 +2408,88 @@
         </w:tc>
         <w:tc>
           <w:tcPr>
-            <w:tcW w:type="dxa" w:w="2400"/>
-            <w:tcBorders>
-              <w:top w:val="single" w:color="555555" w:sz="4"/>
-              <w:left w:val="single" w:color="555555" w:sz="4"/>
-              <w:bottom w:val="single" w:color="555555" w:sz="4"/>
-              <w:right w:val="single" w:color="555555" w:sz="4"/>
-            </w:tcBorders>
-            <w:tcMar>
-              <w:top w:type="dxa" w:w="30"/>
-              <w:left w:type="dxa" w:w="60"/>
-              <w:bottom w:type="dxa" w:w="30"/>
-              <w:right w:type="dxa" w:w="60"/>
-            </w:tcMar>
-            <w:vAlign w:val="center"/>
-          </w:tcPr>
-          <w:p>
-            <w:pPr>
-              <w:spacing w:after="0" w:before="0"/>
-              <w:jc w:val="center"/>
+            <w:tcW w:type="dxa" w:w="1250"/>
+            <w:tcBorders>
+              <w:top w:val="single" w:color="555555" w:sz="4"/>
+              <w:left w:val="single" w:color="555555" w:sz="4"/>
+              <w:bottom w:val="single" w:color="555555" w:sz="4"/>
+              <w:right w:val="single" w:color="555555" w:sz="4"/>
+            </w:tcBorders>
+            <w:tcMar>
+              <w:top w:type="dxa" w:w="30"/>
+              <w:left w:type="dxa" w:w="60"/>
+              <w:bottom w:type="dxa" w:w="30"/>
+              <w:right w:type="dxa" w:w="60"/>
+            </w:tcMar>
+            <w:vAlign w:val="center"/>
+          </w:tcPr>
+          <w:p>
+            <w:pPr>
+              <w:spacing w:after="0" w:before="0"/>
+              <w:jc w:val="center"/>
+            </w:pPr>
+            <w:r>
+              <w:rPr>
+                <w:rFonts w:ascii="Arial" w:cs="Arial" w:eastAsia="Arial" w:hAnsi="Arial"/>
+                <w:sz w:val="18"/>
+                <w:szCs w:val="18"/>
+              </w:rPr>
+              <w:t xml:space="preserve"/>
+            </w:r>
+          </w:p>
+        </w:tc>
+        <w:tc>
+          <w:tcPr>
+            <w:tcW w:type="dxa" w:w="1300"/>
+            <w:tcBorders>
+              <w:top w:val="single" w:color="555555" w:sz="4"/>
+              <w:left w:val="single" w:color="555555" w:sz="4"/>
+              <w:bottom w:val="single" w:color="555555" w:sz="4"/>
+              <w:right w:val="single" w:color="555555" w:sz="4"/>
+            </w:tcBorders>
+            <w:tcMar>
+              <w:top w:type="dxa" w:w="30"/>
+              <w:left w:type="dxa" w:w="60"/>
+              <w:bottom w:type="dxa" w:w="30"/>
+              <w:right w:type="dxa" w:w="60"/>
+            </w:tcMar>
+            <w:vAlign w:val="center"/>
+          </w:tcPr>
+          <w:p>
+            <w:pPr>
+              <w:spacing w:after="0" w:before="0"/>
+              <w:jc w:val="center"/>
+            </w:pPr>
+            <w:r>
+              <w:rPr>
+                <w:rFonts w:ascii="Arial" w:cs="Arial" w:eastAsia="Arial" w:hAnsi="Arial"/>
+                <w:sz w:val="18"/>
+                <w:szCs w:val="18"/>
+              </w:rPr>
+              <w:t xml:space="preserve"/>
+            </w:r>
+          </w:p>
+        </w:tc>
+        <w:tc>
+          <w:tcPr>
+            <w:tcW w:type="dxa" w:w="3600"/>
+            <w:tcBorders>
+              <w:top w:val="single" w:color="555555" w:sz="4"/>
+              <w:left w:val="single" w:color="555555" w:sz="4"/>
+              <w:bottom w:val="single" w:color="555555" w:sz="4"/>
+              <w:right w:val="single" w:color="555555" w:sz="4"/>
+            </w:tcBorders>
+            <w:tcMar>
+              <w:top w:type="dxa" w:w="30"/>
+              <w:left w:type="dxa" w:w="60"/>
+              <w:bottom w:type="dxa" w:w="30"/>
+              <w:right w:type="dxa" w:w="60"/>
+            </w:tcMar>
+            <w:vAlign w:val="center"/>
+          </w:tcPr>
+          <w:p>
+            <w:pPr>
+              <w:spacing w:after="0" w:before="0"/>
             </w:pPr>
             <w:r>
               <w:rPr>
@@ -2222,7 +2508,7 @@
         </w:trPr>
         <w:tc>
           <w:tcPr>
-            <w:tcW w:type="dxa" w:w="6720"/>
+            <w:tcW w:type="dxa" w:w="4120"/>
             <w:tcBorders>
               <w:top w:val="single" w:color="555555" w:sz="4"/>
               <w:left w:val="single" w:color="555555" w:sz="4"/>
@@ -2253,7 +2539,7 @@
         </w:tc>
         <w:tc>
           <w:tcPr>
-            <w:tcW w:type="dxa" w:w="2400"/>
+            <w:tcW w:type="dxa" w:w="1250"/>
             <w:tcBorders>
               <w:top w:val="single" w:color="555555" w:sz="4"/>
               <w:left w:val="single" w:color="555555" w:sz="4"/>
@@ -2285,25 +2571,88 @@
         </w:tc>
         <w:tc>
           <w:tcPr>
-            <w:tcW w:type="dxa" w:w="2400"/>
-            <w:tcBorders>
-              <w:top w:val="single" w:color="555555" w:sz="4"/>
-              <w:left w:val="single" w:color="555555" w:sz="4"/>
-              <w:bottom w:val="single" w:color="555555" w:sz="4"/>
-              <w:right w:val="single" w:color="555555" w:sz="4"/>
-            </w:tcBorders>
-            <w:tcMar>
-              <w:top w:type="dxa" w:w="30"/>
-              <w:left w:type="dxa" w:w="60"/>
-              <w:bottom w:type="dxa" w:w="30"/>
-              <w:right w:type="dxa" w:w="60"/>
-            </w:tcMar>
-            <w:vAlign w:val="center"/>
-          </w:tcPr>
-          <w:p>
-            <w:pPr>
-              <w:spacing w:after="0" w:before="0"/>
-              <w:jc w:val="center"/>
+            <w:tcW w:type="dxa" w:w="1250"/>
+            <w:tcBorders>
+              <w:top w:val="single" w:color="555555" w:sz="4"/>
+              <w:left w:val="single" w:color="555555" w:sz="4"/>
+              <w:bottom w:val="single" w:color="555555" w:sz="4"/>
+              <w:right w:val="single" w:color="555555" w:sz="4"/>
+            </w:tcBorders>
+            <w:tcMar>
+              <w:top w:type="dxa" w:w="30"/>
+              <w:left w:type="dxa" w:w="60"/>
+              <w:bottom w:type="dxa" w:w="30"/>
+              <w:right w:type="dxa" w:w="60"/>
+            </w:tcMar>
+            <w:vAlign w:val="center"/>
+          </w:tcPr>
+          <w:p>
+            <w:pPr>
+              <w:spacing w:after="0" w:before="0"/>
+              <w:jc w:val="center"/>
+            </w:pPr>
+            <w:r>
+              <w:rPr>
+                <w:rFonts w:ascii="Arial" w:cs="Arial" w:eastAsia="Arial" w:hAnsi="Arial"/>
+                <w:sz w:val="18"/>
+                <w:szCs w:val="18"/>
+              </w:rPr>
+              <w:t xml:space="preserve"/>
+            </w:r>
+          </w:p>
+        </w:tc>
+        <w:tc>
+          <w:tcPr>
+            <w:tcW w:type="dxa" w:w="1300"/>
+            <w:tcBorders>
+              <w:top w:val="single" w:color="555555" w:sz="4"/>
+              <w:left w:val="single" w:color="555555" w:sz="4"/>
+              <w:bottom w:val="single" w:color="555555" w:sz="4"/>
+              <w:right w:val="single" w:color="555555" w:sz="4"/>
+            </w:tcBorders>
+            <w:tcMar>
+              <w:top w:type="dxa" w:w="30"/>
+              <w:left w:type="dxa" w:w="60"/>
+              <w:bottom w:type="dxa" w:w="30"/>
+              <w:right w:type="dxa" w:w="60"/>
+            </w:tcMar>
+            <w:vAlign w:val="center"/>
+          </w:tcPr>
+          <w:p>
+            <w:pPr>
+              <w:spacing w:after="0" w:before="0"/>
+              <w:jc w:val="center"/>
+            </w:pPr>
+            <w:r>
+              <w:rPr>
+                <w:rFonts w:ascii="Arial" w:cs="Arial" w:eastAsia="Arial" w:hAnsi="Arial"/>
+                <w:sz w:val="18"/>
+                <w:szCs w:val="18"/>
+              </w:rPr>
+              <w:t xml:space="preserve"/>
+            </w:r>
+          </w:p>
+        </w:tc>
+        <w:tc>
+          <w:tcPr>
+            <w:tcW w:type="dxa" w:w="3600"/>
+            <w:tcBorders>
+              <w:top w:val="single" w:color="555555" w:sz="4"/>
+              <w:left w:val="single" w:color="555555" w:sz="4"/>
+              <w:bottom w:val="single" w:color="555555" w:sz="4"/>
+              <w:right w:val="single" w:color="555555" w:sz="4"/>
+            </w:tcBorders>
+            <w:tcMar>
+              <w:top w:type="dxa" w:w="30"/>
+              <w:left w:type="dxa" w:w="60"/>
+              <w:bottom w:type="dxa" w:w="30"/>
+              <w:right w:type="dxa" w:w="60"/>
+            </w:tcMar>
+            <w:vAlign w:val="center"/>
+          </w:tcPr>
+          <w:p>
+            <w:pPr>
+              <w:spacing w:after="0" w:before="0"/>
             </w:pPr>
             <w:r>
               <w:rPr>
@@ -2322,7 +2671,7 @@
         </w:trPr>
         <w:tc>
           <w:tcPr>
-            <w:tcW w:type="dxa" w:w="6720"/>
+            <w:tcW w:type="dxa" w:w="4120"/>
             <w:tcBorders>
               <w:top w:val="single" w:color="555555" w:sz="4"/>
               <w:left w:val="single" w:color="555555" w:sz="4"/>
@@ -2353,7 +2702,7 @@
         </w:tc>
         <w:tc>
           <w:tcPr>
-            <w:tcW w:type="dxa" w:w="2400"/>
+            <w:tcW w:type="dxa" w:w="1250"/>
             <w:tcBorders>
               <w:top w:val="single" w:color="555555" w:sz="4"/>
               <w:left w:val="single" w:color="555555" w:sz="4"/>
@@ -2385,25 +2734,88 @@
         </w:tc>
         <w:tc>
           <w:tcPr>
-            <w:tcW w:type="dxa" w:w="2400"/>
-            <w:tcBorders>
-              <w:top w:val="single" w:color="555555" w:sz="4"/>
-              <w:left w:val="single" w:color="555555" w:sz="4"/>
-              <w:bottom w:val="single" w:color="555555" w:sz="4"/>
-              <w:right w:val="single" w:color="555555" w:sz="4"/>
-            </w:tcBorders>
-            <w:tcMar>
-              <w:top w:type="dxa" w:w="30"/>
-              <w:left w:type="dxa" w:w="60"/>
-              <w:bottom w:type="dxa" w:w="30"/>
-              <w:right w:type="dxa" w:w="60"/>
-            </w:tcMar>
-            <w:vAlign w:val="center"/>
-          </w:tcPr>
-          <w:p>
-            <w:pPr>
-              <w:spacing w:after="0" w:before="0"/>
-              <w:jc w:val="center"/>
+            <w:tcW w:type="dxa" w:w="1250"/>
+            <w:tcBorders>
+              <w:top w:val="single" w:color="555555" w:sz="4"/>
+              <w:left w:val="single" w:color="555555" w:sz="4"/>
+              <w:bottom w:val="single" w:color="555555" w:sz="4"/>
+              <w:right w:val="single" w:color="555555" w:sz="4"/>
+            </w:tcBorders>
+            <w:tcMar>
+              <w:top w:type="dxa" w:w="30"/>
+              <w:left w:type="dxa" w:w="60"/>
+              <w:bottom w:type="dxa" w:w="30"/>
+              <w:right w:type="dxa" w:w="60"/>
+            </w:tcMar>
+            <w:vAlign w:val="center"/>
+          </w:tcPr>
+          <w:p>
+            <w:pPr>
+              <w:spacing w:after="0" w:before="0"/>
+              <w:jc w:val="center"/>
+            </w:pPr>
+            <w:r>
+              <w:rPr>
+                <w:rFonts w:ascii="Arial" w:cs="Arial" w:eastAsia="Arial" w:hAnsi="Arial"/>
+                <w:sz w:val="18"/>
+                <w:szCs w:val="18"/>
+              </w:rPr>
+              <w:t xml:space="preserve"/>
+            </w:r>
+          </w:p>
+        </w:tc>
+        <w:tc>
+          <w:tcPr>
+            <w:tcW w:type="dxa" w:w="1300"/>
+            <w:tcBorders>
+              <w:top w:val="single" w:color="555555" w:sz="4"/>
+              <w:left w:val="single" w:color="555555" w:sz="4"/>
+              <w:bottom w:val="single" w:color="555555" w:sz="4"/>
+              <w:right w:val="single" w:color="555555" w:sz="4"/>
+            </w:tcBorders>
+            <w:tcMar>
+              <w:top w:type="dxa" w:w="30"/>
+              <w:left w:type="dxa" w:w="60"/>
+              <w:bottom w:type="dxa" w:w="30"/>
+              <w:right w:type="dxa" w:w="60"/>
+            </w:tcMar>
+            <w:vAlign w:val="center"/>
+          </w:tcPr>
+          <w:p>
+            <w:pPr>
+              <w:spacing w:after="0" w:before="0"/>
+              <w:jc w:val="center"/>
+            </w:pPr>
+            <w:r>
+              <w:rPr>
+                <w:rFonts w:ascii="Arial" w:cs="Arial" w:eastAsia="Arial" w:hAnsi="Arial"/>
+                <w:sz w:val="18"/>
+                <w:szCs w:val="18"/>
+              </w:rPr>
+              <w:t xml:space="preserve"/>
+            </w:r>
+          </w:p>
+        </w:tc>
+        <w:tc>
+          <w:tcPr>
+            <w:tcW w:type="dxa" w:w="3600"/>
+            <w:tcBorders>
+              <w:top w:val="single" w:color="555555" w:sz="4"/>
+              <w:left w:val="single" w:color="555555" w:sz="4"/>
+              <w:bottom w:val="single" w:color="555555" w:sz="4"/>
+              <w:right w:val="single" w:color="555555" w:sz="4"/>
+            </w:tcBorders>
+            <w:tcMar>
+              <w:top w:type="dxa" w:w="30"/>
+              <w:left w:type="dxa" w:w="60"/>
+              <w:bottom w:type="dxa" w:w="30"/>
+              <w:right w:type="dxa" w:w="60"/>
+            </w:tcMar>
+            <w:vAlign w:val="center"/>
+          </w:tcPr>
+          <w:p>
+            <w:pPr>
+              <w:spacing w:after="0" w:before="0"/>
             </w:pPr>
             <w:r>
               <w:rPr>
@@ -2422,7 +2834,7 @@
         </w:trPr>
         <w:tc>
           <w:tcPr>
-            <w:tcW w:type="dxa" w:w="6720"/>
+            <w:tcW w:type="dxa" w:w="4120"/>
             <w:tcBorders>
               <w:top w:val="single" w:color="555555" w:sz="4"/>
               <w:left w:val="single" w:color="555555" w:sz="4"/>
@@ -2453,7 +2865,7 @@
         </w:tc>
         <w:tc>
           <w:tcPr>
-            <w:tcW w:type="dxa" w:w="2400"/>
+            <w:tcW w:type="dxa" w:w="1250"/>
             <w:tcBorders>
               <w:top w:val="single" w:color="555555" w:sz="4"/>
               <w:left w:val="single" w:color="555555" w:sz="4"/>
@@ -2485,25 +2897,88 @@
         </w:tc>
         <w:tc>
           <w:tcPr>
-            <w:tcW w:type="dxa" w:w="2400"/>
-            <w:tcBorders>
-              <w:top w:val="single" w:color="555555" w:sz="4"/>
-              <w:left w:val="single" w:color="555555" w:sz="4"/>
-              <w:bottom w:val="single" w:color="555555" w:sz="4"/>
-              <w:right w:val="single" w:color="555555" w:sz="4"/>
-            </w:tcBorders>
-            <w:tcMar>
-              <w:top w:type="dxa" w:w="30"/>
-              <w:left w:type="dxa" w:w="60"/>
-              <w:bottom w:type="dxa" w:w="30"/>
-              <w:right w:type="dxa" w:w="60"/>
-            </w:tcMar>
-            <w:vAlign w:val="center"/>
-          </w:tcPr>
-          <w:p>
-            <w:pPr>
-              <w:spacing w:after="0" w:before="0"/>
-              <w:jc w:val="center"/>
+            <w:tcW w:type="dxa" w:w="1250"/>
+            <w:tcBorders>
+              <w:top w:val="single" w:color="555555" w:sz="4"/>
+              <w:left w:val="single" w:color="555555" w:sz="4"/>
+              <w:bottom w:val="single" w:color="555555" w:sz="4"/>
+              <w:right w:val="single" w:color="555555" w:sz="4"/>
+            </w:tcBorders>
+            <w:tcMar>
+              <w:top w:type="dxa" w:w="30"/>
+              <w:left w:type="dxa" w:w="60"/>
+              <w:bottom w:type="dxa" w:w="30"/>
+              <w:right w:type="dxa" w:w="60"/>
+            </w:tcMar>
+            <w:vAlign w:val="center"/>
+          </w:tcPr>
+          <w:p>
+            <w:pPr>
+              <w:spacing w:after="0" w:before="0"/>
+              <w:jc w:val="center"/>
+            </w:pPr>
+            <w:r>
+              <w:rPr>
+                <w:rFonts w:ascii="Arial" w:cs="Arial" w:eastAsia="Arial" w:hAnsi="Arial"/>
+                <w:sz w:val="18"/>
+                <w:szCs w:val="18"/>
+              </w:rPr>
+              <w:t xml:space="preserve"/>
+            </w:r>
+          </w:p>
+        </w:tc>
+        <w:tc>
+          <w:tcPr>
+            <w:tcW w:type="dxa" w:w="1300"/>
+            <w:tcBorders>
+              <w:top w:val="single" w:color="555555" w:sz="4"/>
+              <w:left w:val="single" w:color="555555" w:sz="4"/>
+              <w:bottom w:val="single" w:color="555555" w:sz="4"/>
+              <w:right w:val="single" w:color="555555" w:sz="4"/>
+            </w:tcBorders>
+            <w:tcMar>
+              <w:top w:type="dxa" w:w="30"/>
+              <w:left w:type="dxa" w:w="60"/>
+              <w:bottom w:type="dxa" w:w="30"/>
+              <w:right w:type="dxa" w:w="60"/>
+            </w:tcMar>
+            <w:vAlign w:val="center"/>
+          </w:tcPr>
+          <w:p>
+            <w:pPr>
+              <w:spacing w:after="0" w:before="0"/>
+              <w:jc w:val="center"/>
+            </w:pPr>
+            <w:r>
+              <w:rPr>
+                <w:rFonts w:ascii="Arial" w:cs="Arial" w:eastAsia="Arial" w:hAnsi="Arial"/>
+                <w:sz w:val="18"/>
+                <w:szCs w:val="18"/>
+              </w:rPr>
+              <w:t xml:space="preserve"/>
+            </w:r>
+          </w:p>
+        </w:tc>
+        <w:tc>
+          <w:tcPr>
+            <w:tcW w:type="dxa" w:w="3600"/>
+            <w:tcBorders>
+              <w:top w:val="single" w:color="555555" w:sz="4"/>
+              <w:left w:val="single" w:color="555555" w:sz="4"/>
+              <w:bottom w:val="single" w:color="555555" w:sz="4"/>
+              <w:right w:val="single" w:color="555555" w:sz="4"/>
+            </w:tcBorders>
+            <w:tcMar>
+              <w:top w:type="dxa" w:w="30"/>
+              <w:left w:type="dxa" w:w="60"/>
+              <w:bottom w:type="dxa" w:w="30"/>
+              <w:right w:type="dxa" w:w="60"/>
+            </w:tcMar>
+            <w:vAlign w:val="center"/>
+          </w:tcPr>
+          <w:p>
+            <w:pPr>
+              <w:spacing w:after="0" w:before="0"/>
             </w:pPr>
             <w:r>
               <w:rPr>
@@ -2522,7 +2997,7 @@
         </w:trPr>
         <w:tc>
           <w:tcPr>
-            <w:tcW w:type="dxa" w:w="6720"/>
+            <w:tcW w:type="dxa" w:w="4120"/>
             <w:tcBorders>
               <w:top w:val="single" w:color="555555" w:sz="4"/>
               <w:left w:val="single" w:color="555555" w:sz="4"/>
@@ -2553,7 +3028,7 @@
         </w:tc>
         <w:tc>
           <w:tcPr>
-            <w:tcW w:type="dxa" w:w="2400"/>
+            <w:tcW w:type="dxa" w:w="1250"/>
             <w:tcBorders>
               <w:top w:val="single" w:color="555555" w:sz="4"/>
               <w:left w:val="single" w:color="555555" w:sz="4"/>
@@ -2585,25 +3060,88 @@
         </w:tc>
         <w:tc>
           <w:tcPr>
-            <w:tcW w:type="dxa" w:w="2400"/>
-            <w:tcBorders>
-              <w:top w:val="single" w:color="555555" w:sz="4"/>
-              <w:left w:val="single" w:color="555555" w:sz="4"/>
-              <w:bottom w:val="single" w:color="555555" w:sz="4"/>
-              <w:right w:val="single" w:color="555555" w:sz="4"/>
-            </w:tcBorders>
-            <w:tcMar>
-              <w:top w:type="dxa" w:w="30"/>
-              <w:left w:type="dxa" w:w="60"/>
-              <w:bottom w:type="dxa" w:w="30"/>
-              <w:right w:type="dxa" w:w="60"/>
-            </w:tcMar>
-            <w:vAlign w:val="center"/>
-          </w:tcPr>
-          <w:p>
-            <w:pPr>
-              <w:spacing w:after="0" w:before="0"/>
-              <w:jc w:val="center"/>
+            <w:tcW w:type="dxa" w:w="1250"/>
+            <w:tcBorders>
+              <w:top w:val="single" w:color="555555" w:sz="4"/>
+              <w:left w:val="single" w:color="555555" w:sz="4"/>
+              <w:bottom w:val="single" w:color="555555" w:sz="4"/>
+              <w:right w:val="single" w:color="555555" w:sz="4"/>
+            </w:tcBorders>
+            <w:tcMar>
+              <w:top w:type="dxa" w:w="30"/>
+              <w:left w:type="dxa" w:w="60"/>
+              <w:bottom w:type="dxa" w:w="30"/>
+              <w:right w:type="dxa" w:w="60"/>
+            </w:tcMar>
+            <w:vAlign w:val="center"/>
+          </w:tcPr>
+          <w:p>
+            <w:pPr>
+              <w:spacing w:after="0" w:before="0"/>
+              <w:jc w:val="center"/>
+            </w:pPr>
+            <w:r>
+              <w:rPr>
+                <w:rFonts w:ascii="Arial" w:cs="Arial" w:eastAsia="Arial" w:hAnsi="Arial"/>
+                <w:sz w:val="18"/>
+                <w:szCs w:val="18"/>
+              </w:rPr>
+              <w:t xml:space="preserve"/>
+            </w:r>
+          </w:p>
+        </w:tc>
+        <w:tc>
+          <w:tcPr>
+            <w:tcW w:type="dxa" w:w="1300"/>
+            <w:tcBorders>
+              <w:top w:val="single" w:color="555555" w:sz="4"/>
+              <w:left w:val="single" w:color="555555" w:sz="4"/>
+              <w:bottom w:val="single" w:color="555555" w:sz="4"/>
+              <w:right w:val="single" w:color="555555" w:sz="4"/>
+            </w:tcBorders>
+            <w:tcMar>
+              <w:top w:type="dxa" w:w="30"/>
+              <w:left w:type="dxa" w:w="60"/>
+              <w:bottom w:type="dxa" w:w="30"/>
+              <w:right w:type="dxa" w:w="60"/>
+            </w:tcMar>
+            <w:vAlign w:val="center"/>
+          </w:tcPr>
+          <w:p>
+            <w:pPr>
+              <w:spacing w:after="0" w:before="0"/>
+              <w:jc w:val="center"/>
+            </w:pPr>
+            <w:r>
+              <w:rPr>
+                <w:rFonts w:ascii="Arial" w:cs="Arial" w:eastAsia="Arial" w:hAnsi="Arial"/>
+                <w:sz w:val="18"/>
+                <w:szCs w:val="18"/>
+              </w:rPr>
+              <w:t xml:space="preserve"/>
+            </w:r>
+          </w:p>
+        </w:tc>
+        <w:tc>
+          <w:tcPr>
+            <w:tcW w:type="dxa" w:w="3600"/>
+            <w:tcBorders>
+              <w:top w:val="single" w:color="555555" w:sz="4"/>
+              <w:left w:val="single" w:color="555555" w:sz="4"/>
+              <w:bottom w:val="single" w:color="555555" w:sz="4"/>
+              <w:right w:val="single" w:color="555555" w:sz="4"/>
+            </w:tcBorders>
+            <w:tcMar>
+              <w:top w:type="dxa" w:w="30"/>
+              <w:left w:type="dxa" w:w="60"/>
+              <w:bottom w:type="dxa" w:w="30"/>
+              <w:right w:type="dxa" w:w="60"/>
+            </w:tcMar>
+            <w:vAlign w:val="center"/>
+          </w:tcPr>
+          <w:p>
+            <w:pPr>
+              <w:spacing w:after="0" w:before="0"/>
             </w:pPr>
             <w:r>
               <w:rPr>
@@ -2622,7 +3160,7 @@
         </w:trPr>
         <w:tc>
           <w:tcPr>
-            <w:tcW w:type="dxa" w:w="6720"/>
+            <w:tcW w:type="dxa" w:w="4120"/>
             <w:tcBorders>
               <w:top w:val="single" w:color="555555" w:sz="4"/>
               <w:left w:val="single" w:color="555555" w:sz="4"/>
@@ -2653,57 +3191,120 @@
         </w:tc>
         <w:tc>
           <w:tcPr>
-            <w:tcW w:type="dxa" w:w="2400"/>
-            <w:tcBorders>
-              <w:top w:val="single" w:color="555555" w:sz="4"/>
-              <w:left w:val="single" w:color="555555" w:sz="4"/>
-              <w:bottom w:val="single" w:color="555555" w:sz="4"/>
-              <w:right w:val="single" w:color="555555" w:sz="4"/>
-            </w:tcBorders>
-            <w:tcMar>
-              <w:top w:type="dxa" w:w="30"/>
-              <w:left w:type="dxa" w:w="60"/>
-              <w:bottom w:type="dxa" w:w="30"/>
-              <w:right w:type="dxa" w:w="60"/>
-            </w:tcMar>
-            <w:vAlign w:val="center"/>
-          </w:tcPr>
-          <w:p>
-            <w:pPr>
-              <w:spacing w:after="0" w:before="0"/>
-              <w:jc w:val="center"/>
-            </w:pPr>
-            <w:r>
-              <w:rPr>
-                <w:rFonts w:ascii="Arial" w:cs="Arial" w:eastAsia="Arial" w:hAnsi="Arial"/>
-                <w:sz w:val="18"/>
-                <w:szCs w:val="18"/>
-              </w:rPr>
-              <w:t xml:space="preserve"/>
-            </w:r>
-          </w:p>
-        </w:tc>
-        <w:tc>
-          <w:tcPr>
-            <w:tcW w:type="dxa" w:w="2400"/>
-            <w:tcBorders>
-              <w:top w:val="single" w:color="555555" w:sz="4"/>
-              <w:left w:val="single" w:color="555555" w:sz="4"/>
-              <w:bottom w:val="single" w:color="555555" w:sz="4"/>
-              <w:right w:val="single" w:color="555555" w:sz="4"/>
-            </w:tcBorders>
-            <w:tcMar>
-              <w:top w:type="dxa" w:w="30"/>
-              <w:left w:type="dxa" w:w="60"/>
-              <w:bottom w:type="dxa" w:w="30"/>
-              <w:right w:type="dxa" w:w="60"/>
-            </w:tcMar>
-            <w:vAlign w:val="center"/>
-          </w:tcPr>
-          <w:p>
-            <w:pPr>
-              <w:spacing w:after="0" w:before="0"/>
-              <w:jc w:val="center"/>
+            <w:tcW w:type="dxa" w:w="1250"/>
+            <w:tcBorders>
+              <w:top w:val="single" w:color="555555" w:sz="4"/>
+              <w:left w:val="single" w:color="555555" w:sz="4"/>
+              <w:bottom w:val="single" w:color="555555" w:sz="4"/>
+              <w:right w:val="single" w:color="555555" w:sz="4"/>
+            </w:tcBorders>
+            <w:tcMar>
+              <w:top w:type="dxa" w:w="30"/>
+              <w:left w:type="dxa" w:w="60"/>
+              <w:bottom w:type="dxa" w:w="30"/>
+              <w:right w:type="dxa" w:w="60"/>
+            </w:tcMar>
+            <w:vAlign w:val="center"/>
+          </w:tcPr>
+          <w:p>
+            <w:pPr>
+              <w:spacing w:after="0" w:before="0"/>
+              <w:jc w:val="center"/>
+            </w:pPr>
+            <w:r>
+              <w:rPr>
+                <w:rFonts w:ascii="Arial" w:cs="Arial" w:eastAsia="Arial" w:hAnsi="Arial"/>
+                <w:sz w:val="18"/>
+                <w:szCs w:val="18"/>
+              </w:rPr>
+              <w:t xml:space="preserve"/>
+            </w:r>
+          </w:p>
+        </w:tc>
+        <w:tc>
+          <w:tcPr>
+            <w:tcW w:type="dxa" w:w="1250"/>
+            <w:tcBorders>
+              <w:top w:val="single" w:color="555555" w:sz="4"/>
+              <w:left w:val="single" w:color="555555" w:sz="4"/>
+              <w:bottom w:val="single" w:color="555555" w:sz="4"/>
+              <w:right w:val="single" w:color="555555" w:sz="4"/>
+            </w:tcBorders>
+            <w:tcMar>
+              <w:top w:type="dxa" w:w="30"/>
+              <w:left w:type="dxa" w:w="60"/>
+              <w:bottom w:type="dxa" w:w="30"/>
+              <w:right w:type="dxa" w:w="60"/>
+            </w:tcMar>
+            <w:vAlign w:val="center"/>
+          </w:tcPr>
+          <w:p>
+            <w:pPr>
+              <w:spacing w:after="0" w:before="0"/>
+              <w:jc w:val="center"/>
+            </w:pPr>
+            <w:r>
+              <w:rPr>
+                <w:rFonts w:ascii="Arial" w:cs="Arial" w:eastAsia="Arial" w:hAnsi="Arial"/>
+                <w:sz w:val="18"/>
+                <w:szCs w:val="18"/>
+              </w:rPr>
+              <w:t xml:space="preserve"/>
+            </w:r>
+          </w:p>
+        </w:tc>
+        <w:tc>
+          <w:tcPr>
+            <w:tcW w:type="dxa" w:w="1300"/>
+            <w:tcBorders>
+              <w:top w:val="single" w:color="555555" w:sz="4"/>
+              <w:left w:val="single" w:color="555555" w:sz="4"/>
+              <w:bottom w:val="single" w:color="555555" w:sz="4"/>
+              <w:right w:val="single" w:color="555555" w:sz="4"/>
+            </w:tcBorders>
+            <w:tcMar>
+              <w:top w:type="dxa" w:w="30"/>
+              <w:left w:type="dxa" w:w="60"/>
+              <w:bottom w:type="dxa" w:w="30"/>
+              <w:right w:type="dxa" w:w="60"/>
+            </w:tcMar>
+            <w:vAlign w:val="center"/>
+          </w:tcPr>
+          <w:p>
+            <w:pPr>
+              <w:spacing w:after="0" w:before="0"/>
+              <w:jc w:val="center"/>
+            </w:pPr>
+            <w:r>
+              <w:rPr>
+                <w:rFonts w:ascii="Arial" w:cs="Arial" w:eastAsia="Arial" w:hAnsi="Arial"/>
+                <w:sz w:val="18"/>
+                <w:szCs w:val="18"/>
+              </w:rPr>
+              <w:t xml:space="preserve"/>
+            </w:r>
+          </w:p>
+        </w:tc>
+        <w:tc>
+          <w:tcPr>
+            <w:tcW w:type="dxa" w:w="3600"/>
+            <w:tcBorders>
+              <w:top w:val="single" w:color="555555" w:sz="4"/>
+              <w:left w:val="single" w:color="555555" w:sz="4"/>
+              <w:bottom w:val="single" w:color="555555" w:sz="4"/>
+              <w:right w:val="single" w:color="555555" w:sz="4"/>
+            </w:tcBorders>
+            <w:tcMar>
+              <w:top w:type="dxa" w:w="30"/>
+              <w:left w:type="dxa" w:w="60"/>
+              <w:bottom w:type="dxa" w:w="30"/>
+              <w:right w:type="dxa" w:w="60"/>
+            </w:tcMar>
+            <w:vAlign w:val="center"/>
+          </w:tcPr>
+          <w:p>
+            <w:pPr>
+              <w:spacing w:after="0" w:before="0"/>
             </w:pPr>
             <w:r>
               <w:rPr>

</xml_diff>

<commit_message>
Hoja de campo: márgenes 4 cm superior/inferior y 1 cm laterales
Co-Authored-By: Claude Opus 5.5 <noreply@anthropic.com>
Claude-Session: https://claude.ai/code/session_01FfUnftB8faW5Tj1T7jUfMj
</commit_message>
<xml_diff>
--- a/Hoja_Campo_Limpieza_Roceria_Comuna2.docx
+++ b/Hoja_Campo_Limpieza_Roceria_Comuna2.docx
@@ -4,7 +4,7 @@
   <w:body>
     <w:tbl>
       <w:tblPr>
-        <w:tblW w:type="dxa" w:w="11520"/>
+        <w:tblW w:type="dxa" w:w="11106"/>
         <w:tblBorders>
           <w:top w:val="single" w:color="auto" w:sz="4"/>
           <w:left w:val="single" w:color="auto" w:sz="4"/>
@@ -16,14 +16,14 @@
         <w:tblLayout w:type="fixed"/>
       </w:tblPr>
       <w:tblGrid>
-        <w:gridCol w:w="3000"/>
-        <w:gridCol w:w="5520"/>
-        <w:gridCol w:w="3000"/>
+        <w:gridCol w:w="2892"/>
+        <w:gridCol w:w="5322"/>
+        <w:gridCol w:w="2892"/>
       </w:tblGrid>
       <w:tr>
         <w:tc>
           <w:tcPr>
-            <w:tcW w:type="dxa" w:w="3000"/>
+            <w:tcW w:type="dxa" w:w="2892"/>
             <w:tcBorders>
               <w:top w:val="single" w:color="555555" w:sz="4"/>
               <w:left w:val="single" w:color="555555" w:sz="4"/>
@@ -57,7 +57,7 @@
         </w:tc>
         <w:tc>
           <w:tcPr>
-            <w:tcW w:type="dxa" w:w="5520"/>
+            <w:tcW w:type="dxa" w:w="5322"/>
             <w:tcBorders>
               <w:top w:val="single" w:color="555555" w:sz="4"/>
               <w:left w:val="single" w:color="555555" w:sz="4"/>
@@ -105,7 +105,7 @@
         </w:tc>
         <w:tc>
           <w:tcPr>
-            <w:tcW w:type="dxa" w:w="3000"/>
+            <w:tcW w:type="dxa" w:w="2892"/>
             <w:tcBorders>
               <w:top w:val="single" w:color="555555" w:sz="4"/>
               <w:left w:val="single" w:color="555555" w:sz="4"/>
@@ -194,7 +194,7 @@
     </w:p>
     <w:tbl>
       <w:tblPr>
-        <w:tblW w:type="dxa" w:w="11520"/>
+        <w:tblW w:type="dxa" w:w="11106"/>
         <w:tblBorders>
           <w:top w:val="single" w:color="auto" w:sz="4"/>
           <w:left w:val="single" w:color="auto" w:sz="4"/>
@@ -206,10 +206,10 @@
         <w:tblLayout w:type="fixed"/>
       </w:tblPr>
       <w:tblGrid>
-        <w:gridCol w:w="2300"/>
-        <w:gridCol w:w="3460"/>
-        <w:gridCol w:w="2300"/>
-        <w:gridCol w:w="3460"/>
+        <w:gridCol w:w="2217"/>
+        <w:gridCol w:w="3336"/>
+        <w:gridCol w:w="2217"/>
+        <w:gridCol w:w="3336"/>
       </w:tblGrid>
       <w:tr>
         <w:trPr>
@@ -217,7 +217,7 @@
         </w:trPr>
         <w:tc>
           <w:tcPr>
-            <w:tcW w:type="dxa" w:w="2300"/>
+            <w:tcW w:type="dxa" w:w="2217"/>
             <w:tcBorders>
               <w:top w:val="single" w:color="555555" w:sz="4"/>
               <w:left w:val="single" w:color="555555" w:sz="4"/>
@@ -251,7 +251,7 @@
         </w:tc>
         <w:tc>
           <w:tcPr>
-            <w:tcW w:type="dxa" w:w="3460"/>
+            <w:tcW w:type="dxa" w:w="3336"/>
             <w:tcBorders>
               <w:top w:val="single" w:color="555555" w:sz="4"/>
               <w:left w:val="single" w:color="555555" w:sz="4"/>
@@ -284,7 +284,7 @@
         </w:tc>
         <w:tc>
           <w:tcPr>
-            <w:tcW w:type="dxa" w:w="2300"/>
+            <w:tcW w:type="dxa" w:w="2217"/>
             <w:tcBorders>
               <w:top w:val="single" w:color="555555" w:sz="4"/>
               <w:left w:val="single" w:color="555555" w:sz="4"/>
@@ -318,7 +318,7 @@
         </w:tc>
         <w:tc>
           <w:tcPr>
-            <w:tcW w:type="dxa" w:w="3460"/>
+            <w:tcW w:type="dxa" w:w="3336"/>
             <w:tcBorders>
               <w:top w:val="single" w:color="555555" w:sz="4"/>
               <w:left w:val="single" w:color="555555" w:sz="4"/>
@@ -356,7 +356,7 @@
         </w:trPr>
         <w:tc>
           <w:tcPr>
-            <w:tcW w:type="dxa" w:w="2300"/>
+            <w:tcW w:type="dxa" w:w="2217"/>
             <w:tcBorders>
               <w:top w:val="single" w:color="555555" w:sz="4"/>
               <w:left w:val="single" w:color="555555" w:sz="4"/>
@@ -390,7 +390,7 @@
         </w:tc>
         <w:tc>
           <w:tcPr>
-            <w:tcW w:type="dxa" w:w="3460"/>
+            <w:tcW w:type="dxa" w:w="3336"/>
             <w:tcBorders>
               <w:top w:val="single" w:color="555555" w:sz="4"/>
               <w:left w:val="single" w:color="555555" w:sz="4"/>
@@ -423,7 +423,7 @@
         </w:tc>
         <w:tc>
           <w:tcPr>
-            <w:tcW w:type="dxa" w:w="2300"/>
+            <w:tcW w:type="dxa" w:w="2217"/>
             <w:tcBorders>
               <w:top w:val="single" w:color="555555" w:sz="4"/>
               <w:left w:val="single" w:color="555555" w:sz="4"/>
@@ -457,7 +457,7 @@
         </w:tc>
         <w:tc>
           <w:tcPr>
-            <w:tcW w:type="dxa" w:w="3460"/>
+            <w:tcW w:type="dxa" w:w="3336"/>
             <w:tcBorders>
               <w:top w:val="single" w:color="555555" w:sz="4"/>
               <w:left w:val="single" w:color="555555" w:sz="4"/>
@@ -495,7 +495,7 @@
         </w:trPr>
         <w:tc>
           <w:tcPr>
-            <w:tcW w:type="dxa" w:w="2300"/>
+            <w:tcW w:type="dxa" w:w="2217"/>
             <w:tcBorders>
               <w:top w:val="single" w:color="555555" w:sz="4"/>
               <w:left w:val="single" w:color="555555" w:sz="4"/>
@@ -529,7 +529,7 @@
         </w:tc>
         <w:tc>
           <w:tcPr>
-            <w:tcW w:type="dxa" w:w="3460"/>
+            <w:tcW w:type="dxa" w:w="3336"/>
             <w:tcBorders>
               <w:top w:val="single" w:color="555555" w:sz="4"/>
               <w:left w:val="single" w:color="555555" w:sz="4"/>
@@ -562,7 +562,7 @@
         </w:tc>
         <w:tc>
           <w:tcPr>
-            <w:tcW w:type="dxa" w:w="2300"/>
+            <w:tcW w:type="dxa" w:w="2217"/>
             <w:tcBorders>
               <w:top w:val="single" w:color="555555" w:sz="4"/>
               <w:left w:val="single" w:color="555555" w:sz="4"/>
@@ -596,7 +596,7 @@
         </w:tc>
         <w:tc>
           <w:tcPr>
-            <w:tcW w:type="dxa" w:w="3460"/>
+            <w:tcW w:type="dxa" w:w="3336"/>
             <w:tcBorders>
               <w:top w:val="single" w:color="555555" w:sz="4"/>
               <w:left w:val="single" w:color="555555" w:sz="4"/>
@@ -631,7 +631,7 @@
     </w:tbl>
     <w:tbl>
       <w:tblPr>
-        <w:tblW w:type="dxa" w:w="11520"/>
+        <w:tblW w:type="dxa" w:w="11106"/>
         <w:tblBorders>
           <w:top w:val="single" w:color="auto" w:sz="4"/>
           <w:left w:val="single" w:color="auto" w:sz="4"/>
@@ -643,8 +643,8 @@
         <w:tblLayout w:type="fixed"/>
       </w:tblPr>
       <w:tblGrid>
-        <w:gridCol w:w="4600"/>
-        <w:gridCol w:w="6920"/>
+        <w:gridCol w:w="4435"/>
+        <w:gridCol w:w="6671"/>
       </w:tblGrid>
       <w:tr>
         <w:trPr>
@@ -652,7 +652,7 @@
         </w:trPr>
         <w:tc>
           <w:tcPr>
-            <w:tcW w:type="dxa" w:w="4600"/>
+            <w:tcW w:type="dxa" w:w="4435"/>
             <w:tcBorders>
               <w:top w:val="single" w:color="555555" w:sz="4"/>
               <w:left w:val="single" w:color="555555" w:sz="4"/>
@@ -686,7 +686,7 @@
         </w:tc>
         <w:tc>
           <w:tcPr>
-            <w:tcW w:type="dxa" w:w="6920"/>
+            <w:tcW w:type="dxa" w:w="6671"/>
             <w:tcBorders>
               <w:top w:val="single" w:color="555555" w:sz="4"/>
               <w:left w:val="single" w:color="555555" w:sz="4"/>
@@ -736,7 +736,7 @@
     </w:p>
     <w:tbl>
       <w:tblPr>
-        <w:tblW w:type="dxa" w:w="11520"/>
+        <w:tblW w:type="dxa" w:w="11106"/>
         <w:tblBorders>
           <w:top w:val="single" w:color="auto" w:sz="4"/>
           <w:left w:val="single" w:color="auto" w:sz="4"/>
@@ -748,12 +748,12 @@
         <w:tblLayout w:type="fixed"/>
       </w:tblPr>
       <w:tblGrid>
-        <w:gridCol w:w="600"/>
-        <w:gridCol w:w="4560"/>
-        <w:gridCol w:w="600"/>
-        <w:gridCol w:w="600"/>
-        <w:gridCol w:w="4560"/>
-        <w:gridCol w:w="600"/>
+        <w:gridCol w:w="578"/>
+        <w:gridCol w:w="4396"/>
+        <w:gridCol w:w="578"/>
+        <w:gridCol w:w="578"/>
+        <w:gridCol w:w="4396"/>
+        <w:gridCol w:w="580"/>
       </w:tblGrid>
       <w:tr>
         <w:trPr>
@@ -761,7 +761,7 @@
         </w:trPr>
         <w:tc>
           <w:tcPr>
-            <w:tcW w:type="dxa" w:w="600"/>
+            <w:tcW w:type="dxa" w:w="578"/>
             <w:tcBorders>
               <w:top w:val="single" w:color="555555" w:sz="4"/>
               <w:left w:val="single" w:color="555555" w:sz="4"/>
@@ -796,7 +796,7 @@
         </w:tc>
         <w:tc>
           <w:tcPr>
-            <w:tcW w:type="dxa" w:w="4560"/>
+            <w:tcW w:type="dxa" w:w="4396"/>
             <w:tcBorders>
               <w:top w:val="single" w:color="555555" w:sz="4"/>
               <w:left w:val="single" w:color="555555" w:sz="4"/>
@@ -831,7 +831,7 @@
         </w:tc>
         <w:tc>
           <w:tcPr>
-            <w:tcW w:type="dxa" w:w="600"/>
+            <w:tcW w:type="dxa" w:w="578"/>
             <w:tcBorders>
               <w:top w:val="single" w:color="555555" w:sz="4"/>
               <w:left w:val="single" w:color="555555" w:sz="4"/>
@@ -866,7 +866,7 @@
         </w:tc>
         <w:tc>
           <w:tcPr>
-            <w:tcW w:type="dxa" w:w="600"/>
+            <w:tcW w:type="dxa" w:w="578"/>
             <w:tcBorders>
               <w:top w:val="single" w:color="555555" w:sz="4"/>
               <w:left w:val="single" w:color="555555" w:sz="4"/>
@@ -901,7 +901,7 @@
         </w:tc>
         <w:tc>
           <w:tcPr>
-            <w:tcW w:type="dxa" w:w="4560"/>
+            <w:tcW w:type="dxa" w:w="4396"/>
             <w:tcBorders>
               <w:top w:val="single" w:color="555555" w:sz="4"/>
               <w:left w:val="single" w:color="555555" w:sz="4"/>
@@ -936,7 +936,7 @@
         </w:tc>
         <w:tc>
           <w:tcPr>
-            <w:tcW w:type="dxa" w:w="600"/>
+            <w:tcW w:type="dxa" w:w="580"/>
             <w:tcBorders>
               <w:top w:val="single" w:color="555555" w:sz="4"/>
               <w:left w:val="single" w:color="555555" w:sz="4"/>
@@ -976,7 +976,7 @@
         </w:trPr>
         <w:tc>
           <w:tcPr>
-            <w:tcW w:type="dxa" w:w="600"/>
+            <w:tcW w:type="dxa" w:w="578"/>
             <w:tcBorders>
               <w:top w:val="single" w:color="555555" w:sz="4"/>
               <w:left w:val="single" w:color="555555" w:sz="4"/>
@@ -1008,70 +1008,70 @@
         </w:tc>
         <w:tc>
           <w:tcPr>
-            <w:tcW w:type="dxa" w:w="4560"/>
-            <w:tcBorders>
-              <w:top w:val="single" w:color="555555" w:sz="4"/>
-              <w:left w:val="single" w:color="555555" w:sz="4"/>
-              <w:bottom w:val="single" w:color="555555" w:sz="4"/>
-              <w:right w:val="single" w:color="555555" w:sz="4"/>
-            </w:tcBorders>
-            <w:tcMar>
-              <w:top w:type="dxa" w:w="30"/>
-              <w:left w:type="dxa" w:w="60"/>
-              <w:bottom w:type="dxa" w:w="30"/>
-              <w:right w:type="dxa" w:w="60"/>
-            </w:tcMar>
-            <w:vAlign w:val="center"/>
-          </w:tcPr>
-          <w:p>
-            <w:pPr>
-              <w:spacing w:after="0" w:before="0"/>
-            </w:pPr>
-            <w:r>
-              <w:rPr>
-                <w:rFonts w:ascii="Arial" w:cs="Arial" w:eastAsia="Arial" w:hAnsi="Arial"/>
-                <w:sz w:val="18"/>
-                <w:szCs w:val="18"/>
-              </w:rPr>
-              <w:t xml:space="preserve"/>
-            </w:r>
-          </w:p>
-        </w:tc>
-        <w:tc>
-          <w:tcPr>
-            <w:tcW w:type="dxa" w:w="600"/>
-            <w:tcBorders>
-              <w:top w:val="single" w:color="555555" w:sz="4"/>
-              <w:left w:val="single" w:color="555555" w:sz="4"/>
-              <w:bottom w:val="single" w:color="555555" w:sz="4"/>
-              <w:right w:val="single" w:color="555555" w:sz="4"/>
-            </w:tcBorders>
-            <w:tcMar>
-              <w:top w:type="dxa" w:w="30"/>
-              <w:left w:type="dxa" w:w="60"/>
-              <w:bottom w:type="dxa" w:w="30"/>
-              <w:right w:type="dxa" w:w="60"/>
-            </w:tcMar>
-            <w:vAlign w:val="center"/>
-          </w:tcPr>
-          <w:p>
-            <w:pPr>
-              <w:spacing w:after="0" w:before="0"/>
-              <w:jc w:val="center"/>
-            </w:pPr>
-            <w:r>
-              <w:rPr>
-                <w:rFonts w:ascii="Arial" w:cs="Arial" w:eastAsia="Arial" w:hAnsi="Arial"/>
-                <w:sz w:val="18"/>
-                <w:szCs w:val="18"/>
-              </w:rPr>
-              <w:t xml:space="preserve"/>
-            </w:r>
-          </w:p>
-        </w:tc>
-        <w:tc>
-          <w:tcPr>
-            <w:tcW w:type="dxa" w:w="600"/>
+            <w:tcW w:type="dxa" w:w="4396"/>
+            <w:tcBorders>
+              <w:top w:val="single" w:color="555555" w:sz="4"/>
+              <w:left w:val="single" w:color="555555" w:sz="4"/>
+              <w:bottom w:val="single" w:color="555555" w:sz="4"/>
+              <w:right w:val="single" w:color="555555" w:sz="4"/>
+            </w:tcBorders>
+            <w:tcMar>
+              <w:top w:type="dxa" w:w="30"/>
+              <w:left w:type="dxa" w:w="60"/>
+              <w:bottom w:type="dxa" w:w="30"/>
+              <w:right w:type="dxa" w:w="60"/>
+            </w:tcMar>
+            <w:vAlign w:val="center"/>
+          </w:tcPr>
+          <w:p>
+            <w:pPr>
+              <w:spacing w:after="0" w:before="0"/>
+            </w:pPr>
+            <w:r>
+              <w:rPr>
+                <w:rFonts w:ascii="Arial" w:cs="Arial" w:eastAsia="Arial" w:hAnsi="Arial"/>
+                <w:sz w:val="18"/>
+                <w:szCs w:val="18"/>
+              </w:rPr>
+              <w:t xml:space="preserve"/>
+            </w:r>
+          </w:p>
+        </w:tc>
+        <w:tc>
+          <w:tcPr>
+            <w:tcW w:type="dxa" w:w="578"/>
+            <w:tcBorders>
+              <w:top w:val="single" w:color="555555" w:sz="4"/>
+              <w:left w:val="single" w:color="555555" w:sz="4"/>
+              <w:bottom w:val="single" w:color="555555" w:sz="4"/>
+              <w:right w:val="single" w:color="555555" w:sz="4"/>
+            </w:tcBorders>
+            <w:tcMar>
+              <w:top w:type="dxa" w:w="30"/>
+              <w:left w:type="dxa" w:w="60"/>
+              <w:bottom w:type="dxa" w:w="30"/>
+              <w:right w:type="dxa" w:w="60"/>
+            </w:tcMar>
+            <w:vAlign w:val="center"/>
+          </w:tcPr>
+          <w:p>
+            <w:pPr>
+              <w:spacing w:after="0" w:before="0"/>
+              <w:jc w:val="center"/>
+            </w:pPr>
+            <w:r>
+              <w:rPr>
+                <w:rFonts w:ascii="Arial" w:cs="Arial" w:eastAsia="Arial" w:hAnsi="Arial"/>
+                <w:sz w:val="18"/>
+                <w:szCs w:val="18"/>
+              </w:rPr>
+              <w:t xml:space="preserve"/>
+            </w:r>
+          </w:p>
+        </w:tc>
+        <w:tc>
+          <w:tcPr>
+            <w:tcW w:type="dxa" w:w="578"/>
             <w:tcBorders>
               <w:top w:val="single" w:color="555555" w:sz="4"/>
               <w:left w:val="single" w:color="555555" w:sz="4"/>
@@ -1103,38 +1103,38 @@
         </w:tc>
         <w:tc>
           <w:tcPr>
-            <w:tcW w:type="dxa" w:w="4560"/>
-            <w:tcBorders>
-              <w:top w:val="single" w:color="555555" w:sz="4"/>
-              <w:left w:val="single" w:color="555555" w:sz="4"/>
-              <w:bottom w:val="single" w:color="555555" w:sz="4"/>
-              <w:right w:val="single" w:color="555555" w:sz="4"/>
-            </w:tcBorders>
-            <w:tcMar>
-              <w:top w:type="dxa" w:w="30"/>
-              <w:left w:type="dxa" w:w="60"/>
-              <w:bottom w:type="dxa" w:w="30"/>
-              <w:right w:type="dxa" w:w="60"/>
-            </w:tcMar>
-            <w:vAlign w:val="center"/>
-          </w:tcPr>
-          <w:p>
-            <w:pPr>
-              <w:spacing w:after="0" w:before="0"/>
-            </w:pPr>
-            <w:r>
-              <w:rPr>
-                <w:rFonts w:ascii="Arial" w:cs="Arial" w:eastAsia="Arial" w:hAnsi="Arial"/>
-                <w:sz w:val="18"/>
-                <w:szCs w:val="18"/>
-              </w:rPr>
-              <w:t xml:space="preserve"/>
-            </w:r>
-          </w:p>
-        </w:tc>
-        <w:tc>
-          <w:tcPr>
-            <w:tcW w:type="dxa" w:w="600"/>
+            <w:tcW w:type="dxa" w:w="4396"/>
+            <w:tcBorders>
+              <w:top w:val="single" w:color="555555" w:sz="4"/>
+              <w:left w:val="single" w:color="555555" w:sz="4"/>
+              <w:bottom w:val="single" w:color="555555" w:sz="4"/>
+              <w:right w:val="single" w:color="555555" w:sz="4"/>
+            </w:tcBorders>
+            <w:tcMar>
+              <w:top w:type="dxa" w:w="30"/>
+              <w:left w:type="dxa" w:w="60"/>
+              <w:bottom w:type="dxa" w:w="30"/>
+              <w:right w:type="dxa" w:w="60"/>
+            </w:tcMar>
+            <w:vAlign w:val="center"/>
+          </w:tcPr>
+          <w:p>
+            <w:pPr>
+              <w:spacing w:after="0" w:before="0"/>
+            </w:pPr>
+            <w:r>
+              <w:rPr>
+                <w:rFonts w:ascii="Arial" w:cs="Arial" w:eastAsia="Arial" w:hAnsi="Arial"/>
+                <w:sz w:val="18"/>
+                <w:szCs w:val="18"/>
+              </w:rPr>
+              <w:t xml:space="preserve"/>
+            </w:r>
+          </w:p>
+        </w:tc>
+        <w:tc>
+          <w:tcPr>
+            <w:tcW w:type="dxa" w:w="580"/>
             <w:tcBorders>
               <w:top w:val="single" w:color="555555" w:sz="4"/>
               <w:left w:val="single" w:color="555555" w:sz="4"/>
@@ -1171,7 +1171,7 @@
         </w:trPr>
         <w:tc>
           <w:tcPr>
-            <w:tcW w:type="dxa" w:w="600"/>
+            <w:tcW w:type="dxa" w:w="578"/>
             <w:tcBorders>
               <w:top w:val="single" w:color="555555" w:sz="4"/>
               <w:left w:val="single" w:color="555555" w:sz="4"/>
@@ -1203,70 +1203,70 @@
         </w:tc>
         <w:tc>
           <w:tcPr>
-            <w:tcW w:type="dxa" w:w="4560"/>
-            <w:tcBorders>
-              <w:top w:val="single" w:color="555555" w:sz="4"/>
-              <w:left w:val="single" w:color="555555" w:sz="4"/>
-              <w:bottom w:val="single" w:color="555555" w:sz="4"/>
-              <w:right w:val="single" w:color="555555" w:sz="4"/>
-            </w:tcBorders>
-            <w:tcMar>
-              <w:top w:type="dxa" w:w="30"/>
-              <w:left w:type="dxa" w:w="60"/>
-              <w:bottom w:type="dxa" w:w="30"/>
-              <w:right w:type="dxa" w:w="60"/>
-            </w:tcMar>
-            <w:vAlign w:val="center"/>
-          </w:tcPr>
-          <w:p>
-            <w:pPr>
-              <w:spacing w:after="0" w:before="0"/>
-            </w:pPr>
-            <w:r>
-              <w:rPr>
-                <w:rFonts w:ascii="Arial" w:cs="Arial" w:eastAsia="Arial" w:hAnsi="Arial"/>
-                <w:sz w:val="18"/>
-                <w:szCs w:val="18"/>
-              </w:rPr>
-              <w:t xml:space="preserve"/>
-            </w:r>
-          </w:p>
-        </w:tc>
-        <w:tc>
-          <w:tcPr>
-            <w:tcW w:type="dxa" w:w="600"/>
-            <w:tcBorders>
-              <w:top w:val="single" w:color="555555" w:sz="4"/>
-              <w:left w:val="single" w:color="555555" w:sz="4"/>
-              <w:bottom w:val="single" w:color="555555" w:sz="4"/>
-              <w:right w:val="single" w:color="555555" w:sz="4"/>
-            </w:tcBorders>
-            <w:tcMar>
-              <w:top w:type="dxa" w:w="30"/>
-              <w:left w:type="dxa" w:w="60"/>
-              <w:bottom w:type="dxa" w:w="30"/>
-              <w:right w:type="dxa" w:w="60"/>
-            </w:tcMar>
-            <w:vAlign w:val="center"/>
-          </w:tcPr>
-          <w:p>
-            <w:pPr>
-              <w:spacing w:after="0" w:before="0"/>
-              <w:jc w:val="center"/>
-            </w:pPr>
-            <w:r>
-              <w:rPr>
-                <w:rFonts w:ascii="Arial" w:cs="Arial" w:eastAsia="Arial" w:hAnsi="Arial"/>
-                <w:sz w:val="18"/>
-                <w:szCs w:val="18"/>
-              </w:rPr>
-              <w:t xml:space="preserve"/>
-            </w:r>
-          </w:p>
-        </w:tc>
-        <w:tc>
-          <w:tcPr>
-            <w:tcW w:type="dxa" w:w="600"/>
+            <w:tcW w:type="dxa" w:w="4396"/>
+            <w:tcBorders>
+              <w:top w:val="single" w:color="555555" w:sz="4"/>
+              <w:left w:val="single" w:color="555555" w:sz="4"/>
+              <w:bottom w:val="single" w:color="555555" w:sz="4"/>
+              <w:right w:val="single" w:color="555555" w:sz="4"/>
+            </w:tcBorders>
+            <w:tcMar>
+              <w:top w:type="dxa" w:w="30"/>
+              <w:left w:type="dxa" w:w="60"/>
+              <w:bottom w:type="dxa" w:w="30"/>
+              <w:right w:type="dxa" w:w="60"/>
+            </w:tcMar>
+            <w:vAlign w:val="center"/>
+          </w:tcPr>
+          <w:p>
+            <w:pPr>
+              <w:spacing w:after="0" w:before="0"/>
+            </w:pPr>
+            <w:r>
+              <w:rPr>
+                <w:rFonts w:ascii="Arial" w:cs="Arial" w:eastAsia="Arial" w:hAnsi="Arial"/>
+                <w:sz w:val="18"/>
+                <w:szCs w:val="18"/>
+              </w:rPr>
+              <w:t xml:space="preserve"/>
+            </w:r>
+          </w:p>
+        </w:tc>
+        <w:tc>
+          <w:tcPr>
+            <w:tcW w:type="dxa" w:w="578"/>
+            <w:tcBorders>
+              <w:top w:val="single" w:color="555555" w:sz="4"/>
+              <w:left w:val="single" w:color="555555" w:sz="4"/>
+              <w:bottom w:val="single" w:color="555555" w:sz="4"/>
+              <w:right w:val="single" w:color="555555" w:sz="4"/>
+            </w:tcBorders>
+            <w:tcMar>
+              <w:top w:type="dxa" w:w="30"/>
+              <w:left w:type="dxa" w:w="60"/>
+              <w:bottom w:type="dxa" w:w="30"/>
+              <w:right w:type="dxa" w:w="60"/>
+            </w:tcMar>
+            <w:vAlign w:val="center"/>
+          </w:tcPr>
+          <w:p>
+            <w:pPr>
+              <w:spacing w:after="0" w:before="0"/>
+              <w:jc w:val="center"/>
+            </w:pPr>
+            <w:r>
+              <w:rPr>
+                <w:rFonts w:ascii="Arial" w:cs="Arial" w:eastAsia="Arial" w:hAnsi="Arial"/>
+                <w:sz w:val="18"/>
+                <w:szCs w:val="18"/>
+              </w:rPr>
+              <w:t xml:space="preserve"/>
+            </w:r>
+          </w:p>
+        </w:tc>
+        <w:tc>
+          <w:tcPr>
+            <w:tcW w:type="dxa" w:w="578"/>
             <w:tcBorders>
               <w:top w:val="single" w:color="555555" w:sz="4"/>
               <w:left w:val="single" w:color="555555" w:sz="4"/>
@@ -1298,38 +1298,38 @@
         </w:tc>
         <w:tc>
           <w:tcPr>
-            <w:tcW w:type="dxa" w:w="4560"/>
-            <w:tcBorders>
-              <w:top w:val="single" w:color="555555" w:sz="4"/>
-              <w:left w:val="single" w:color="555555" w:sz="4"/>
-              <w:bottom w:val="single" w:color="555555" w:sz="4"/>
-              <w:right w:val="single" w:color="555555" w:sz="4"/>
-            </w:tcBorders>
-            <w:tcMar>
-              <w:top w:type="dxa" w:w="30"/>
-              <w:left w:type="dxa" w:w="60"/>
-              <w:bottom w:type="dxa" w:w="30"/>
-              <w:right w:type="dxa" w:w="60"/>
-            </w:tcMar>
-            <w:vAlign w:val="center"/>
-          </w:tcPr>
-          <w:p>
-            <w:pPr>
-              <w:spacing w:after="0" w:before="0"/>
-            </w:pPr>
-            <w:r>
-              <w:rPr>
-                <w:rFonts w:ascii="Arial" w:cs="Arial" w:eastAsia="Arial" w:hAnsi="Arial"/>
-                <w:sz w:val="18"/>
-                <w:szCs w:val="18"/>
-              </w:rPr>
-              <w:t xml:space="preserve"/>
-            </w:r>
-          </w:p>
-        </w:tc>
-        <w:tc>
-          <w:tcPr>
-            <w:tcW w:type="dxa" w:w="600"/>
+            <w:tcW w:type="dxa" w:w="4396"/>
+            <w:tcBorders>
+              <w:top w:val="single" w:color="555555" w:sz="4"/>
+              <w:left w:val="single" w:color="555555" w:sz="4"/>
+              <w:bottom w:val="single" w:color="555555" w:sz="4"/>
+              <w:right w:val="single" w:color="555555" w:sz="4"/>
+            </w:tcBorders>
+            <w:tcMar>
+              <w:top w:type="dxa" w:w="30"/>
+              <w:left w:type="dxa" w:w="60"/>
+              <w:bottom w:type="dxa" w:w="30"/>
+              <w:right w:type="dxa" w:w="60"/>
+            </w:tcMar>
+            <w:vAlign w:val="center"/>
+          </w:tcPr>
+          <w:p>
+            <w:pPr>
+              <w:spacing w:after="0" w:before="0"/>
+            </w:pPr>
+            <w:r>
+              <w:rPr>
+                <w:rFonts w:ascii="Arial" w:cs="Arial" w:eastAsia="Arial" w:hAnsi="Arial"/>
+                <w:sz w:val="18"/>
+                <w:szCs w:val="18"/>
+              </w:rPr>
+              <w:t xml:space="preserve"/>
+            </w:r>
+          </w:p>
+        </w:tc>
+        <w:tc>
+          <w:tcPr>
+            <w:tcW w:type="dxa" w:w="580"/>
             <w:tcBorders>
               <w:top w:val="single" w:color="555555" w:sz="4"/>
               <w:left w:val="single" w:color="555555" w:sz="4"/>
@@ -1366,7 +1366,7 @@
         </w:trPr>
         <w:tc>
           <w:tcPr>
-            <w:tcW w:type="dxa" w:w="600"/>
+            <w:tcW w:type="dxa" w:w="578"/>
             <w:tcBorders>
               <w:top w:val="single" w:color="555555" w:sz="4"/>
               <w:left w:val="single" w:color="555555" w:sz="4"/>
@@ -1398,70 +1398,70 @@
         </w:tc>
         <w:tc>
           <w:tcPr>
-            <w:tcW w:type="dxa" w:w="4560"/>
-            <w:tcBorders>
-              <w:top w:val="single" w:color="555555" w:sz="4"/>
-              <w:left w:val="single" w:color="555555" w:sz="4"/>
-              <w:bottom w:val="single" w:color="555555" w:sz="4"/>
-              <w:right w:val="single" w:color="555555" w:sz="4"/>
-            </w:tcBorders>
-            <w:tcMar>
-              <w:top w:type="dxa" w:w="30"/>
-              <w:left w:type="dxa" w:w="60"/>
-              <w:bottom w:type="dxa" w:w="30"/>
-              <w:right w:type="dxa" w:w="60"/>
-            </w:tcMar>
-            <w:vAlign w:val="center"/>
-          </w:tcPr>
-          <w:p>
-            <w:pPr>
-              <w:spacing w:after="0" w:before="0"/>
-            </w:pPr>
-            <w:r>
-              <w:rPr>
-                <w:rFonts w:ascii="Arial" w:cs="Arial" w:eastAsia="Arial" w:hAnsi="Arial"/>
-                <w:sz w:val="18"/>
-                <w:szCs w:val="18"/>
-              </w:rPr>
-              <w:t xml:space="preserve"/>
-            </w:r>
-          </w:p>
-        </w:tc>
-        <w:tc>
-          <w:tcPr>
-            <w:tcW w:type="dxa" w:w="600"/>
-            <w:tcBorders>
-              <w:top w:val="single" w:color="555555" w:sz="4"/>
-              <w:left w:val="single" w:color="555555" w:sz="4"/>
-              <w:bottom w:val="single" w:color="555555" w:sz="4"/>
-              <w:right w:val="single" w:color="555555" w:sz="4"/>
-            </w:tcBorders>
-            <w:tcMar>
-              <w:top w:type="dxa" w:w="30"/>
-              <w:left w:type="dxa" w:w="60"/>
-              <w:bottom w:type="dxa" w:w="30"/>
-              <w:right w:type="dxa" w:w="60"/>
-            </w:tcMar>
-            <w:vAlign w:val="center"/>
-          </w:tcPr>
-          <w:p>
-            <w:pPr>
-              <w:spacing w:after="0" w:before="0"/>
-              <w:jc w:val="center"/>
-            </w:pPr>
-            <w:r>
-              <w:rPr>
-                <w:rFonts w:ascii="Arial" w:cs="Arial" w:eastAsia="Arial" w:hAnsi="Arial"/>
-                <w:sz w:val="18"/>
-                <w:szCs w:val="18"/>
-              </w:rPr>
-              <w:t xml:space="preserve"/>
-            </w:r>
-          </w:p>
-        </w:tc>
-        <w:tc>
-          <w:tcPr>
-            <w:tcW w:type="dxa" w:w="600"/>
+            <w:tcW w:type="dxa" w:w="4396"/>
+            <w:tcBorders>
+              <w:top w:val="single" w:color="555555" w:sz="4"/>
+              <w:left w:val="single" w:color="555555" w:sz="4"/>
+              <w:bottom w:val="single" w:color="555555" w:sz="4"/>
+              <w:right w:val="single" w:color="555555" w:sz="4"/>
+            </w:tcBorders>
+            <w:tcMar>
+              <w:top w:type="dxa" w:w="30"/>
+              <w:left w:type="dxa" w:w="60"/>
+              <w:bottom w:type="dxa" w:w="30"/>
+              <w:right w:type="dxa" w:w="60"/>
+            </w:tcMar>
+            <w:vAlign w:val="center"/>
+          </w:tcPr>
+          <w:p>
+            <w:pPr>
+              <w:spacing w:after="0" w:before="0"/>
+            </w:pPr>
+            <w:r>
+              <w:rPr>
+                <w:rFonts w:ascii="Arial" w:cs="Arial" w:eastAsia="Arial" w:hAnsi="Arial"/>
+                <w:sz w:val="18"/>
+                <w:szCs w:val="18"/>
+              </w:rPr>
+              <w:t xml:space="preserve"/>
+            </w:r>
+          </w:p>
+        </w:tc>
+        <w:tc>
+          <w:tcPr>
+            <w:tcW w:type="dxa" w:w="578"/>
+            <w:tcBorders>
+              <w:top w:val="single" w:color="555555" w:sz="4"/>
+              <w:left w:val="single" w:color="555555" w:sz="4"/>
+              <w:bottom w:val="single" w:color="555555" w:sz="4"/>
+              <w:right w:val="single" w:color="555555" w:sz="4"/>
+            </w:tcBorders>
+            <w:tcMar>
+              <w:top w:type="dxa" w:w="30"/>
+              <w:left w:type="dxa" w:w="60"/>
+              <w:bottom w:type="dxa" w:w="30"/>
+              <w:right w:type="dxa" w:w="60"/>
+            </w:tcMar>
+            <w:vAlign w:val="center"/>
+          </w:tcPr>
+          <w:p>
+            <w:pPr>
+              <w:spacing w:after="0" w:before="0"/>
+              <w:jc w:val="center"/>
+            </w:pPr>
+            <w:r>
+              <w:rPr>
+                <w:rFonts w:ascii="Arial" w:cs="Arial" w:eastAsia="Arial" w:hAnsi="Arial"/>
+                <w:sz w:val="18"/>
+                <w:szCs w:val="18"/>
+              </w:rPr>
+              <w:t xml:space="preserve"/>
+            </w:r>
+          </w:p>
+        </w:tc>
+        <w:tc>
+          <w:tcPr>
+            <w:tcW w:type="dxa" w:w="578"/>
             <w:tcBorders>
               <w:top w:val="single" w:color="555555" w:sz="4"/>
               <w:left w:val="single" w:color="555555" w:sz="4"/>
@@ -1493,38 +1493,38 @@
         </w:tc>
         <w:tc>
           <w:tcPr>
-            <w:tcW w:type="dxa" w:w="4560"/>
-            <w:tcBorders>
-              <w:top w:val="single" w:color="555555" w:sz="4"/>
-              <w:left w:val="single" w:color="555555" w:sz="4"/>
-              <w:bottom w:val="single" w:color="555555" w:sz="4"/>
-              <w:right w:val="single" w:color="555555" w:sz="4"/>
-            </w:tcBorders>
-            <w:tcMar>
-              <w:top w:type="dxa" w:w="30"/>
-              <w:left w:type="dxa" w:w="60"/>
-              <w:bottom w:type="dxa" w:w="30"/>
-              <w:right w:type="dxa" w:w="60"/>
-            </w:tcMar>
-            <w:vAlign w:val="center"/>
-          </w:tcPr>
-          <w:p>
-            <w:pPr>
-              <w:spacing w:after="0" w:before="0"/>
-            </w:pPr>
-            <w:r>
-              <w:rPr>
-                <w:rFonts w:ascii="Arial" w:cs="Arial" w:eastAsia="Arial" w:hAnsi="Arial"/>
-                <w:sz w:val="18"/>
-                <w:szCs w:val="18"/>
-              </w:rPr>
-              <w:t xml:space="preserve"/>
-            </w:r>
-          </w:p>
-        </w:tc>
-        <w:tc>
-          <w:tcPr>
-            <w:tcW w:type="dxa" w:w="600"/>
+            <w:tcW w:type="dxa" w:w="4396"/>
+            <w:tcBorders>
+              <w:top w:val="single" w:color="555555" w:sz="4"/>
+              <w:left w:val="single" w:color="555555" w:sz="4"/>
+              <w:bottom w:val="single" w:color="555555" w:sz="4"/>
+              <w:right w:val="single" w:color="555555" w:sz="4"/>
+            </w:tcBorders>
+            <w:tcMar>
+              <w:top w:type="dxa" w:w="30"/>
+              <w:left w:type="dxa" w:w="60"/>
+              <w:bottom w:type="dxa" w:w="30"/>
+              <w:right w:type="dxa" w:w="60"/>
+            </w:tcMar>
+            <w:vAlign w:val="center"/>
+          </w:tcPr>
+          <w:p>
+            <w:pPr>
+              <w:spacing w:after="0" w:before="0"/>
+            </w:pPr>
+            <w:r>
+              <w:rPr>
+                <w:rFonts w:ascii="Arial" w:cs="Arial" w:eastAsia="Arial" w:hAnsi="Arial"/>
+                <w:sz w:val="18"/>
+                <w:szCs w:val="18"/>
+              </w:rPr>
+              <w:t xml:space="preserve"/>
+            </w:r>
+          </w:p>
+        </w:tc>
+        <w:tc>
+          <w:tcPr>
+            <w:tcW w:type="dxa" w:w="580"/>
             <w:tcBorders>
               <w:top w:val="single" w:color="555555" w:sz="4"/>
               <w:left w:val="single" w:color="555555" w:sz="4"/>
@@ -1561,7 +1561,7 @@
         </w:trPr>
         <w:tc>
           <w:tcPr>
-            <w:tcW w:type="dxa" w:w="600"/>
+            <w:tcW w:type="dxa" w:w="578"/>
             <w:tcBorders>
               <w:top w:val="single" w:color="555555" w:sz="4"/>
               <w:left w:val="single" w:color="555555" w:sz="4"/>
@@ -1593,70 +1593,70 @@
         </w:tc>
         <w:tc>
           <w:tcPr>
-            <w:tcW w:type="dxa" w:w="4560"/>
-            <w:tcBorders>
-              <w:top w:val="single" w:color="555555" w:sz="4"/>
-              <w:left w:val="single" w:color="555555" w:sz="4"/>
-              <w:bottom w:val="single" w:color="555555" w:sz="4"/>
-              <w:right w:val="single" w:color="555555" w:sz="4"/>
-            </w:tcBorders>
-            <w:tcMar>
-              <w:top w:type="dxa" w:w="30"/>
-              <w:left w:type="dxa" w:w="60"/>
-              <w:bottom w:type="dxa" w:w="30"/>
-              <w:right w:type="dxa" w:w="60"/>
-            </w:tcMar>
-            <w:vAlign w:val="center"/>
-          </w:tcPr>
-          <w:p>
-            <w:pPr>
-              <w:spacing w:after="0" w:before="0"/>
-            </w:pPr>
-            <w:r>
-              <w:rPr>
-                <w:rFonts w:ascii="Arial" w:cs="Arial" w:eastAsia="Arial" w:hAnsi="Arial"/>
-                <w:sz w:val="18"/>
-                <w:szCs w:val="18"/>
-              </w:rPr>
-              <w:t xml:space="preserve"/>
-            </w:r>
-          </w:p>
-        </w:tc>
-        <w:tc>
-          <w:tcPr>
-            <w:tcW w:type="dxa" w:w="600"/>
-            <w:tcBorders>
-              <w:top w:val="single" w:color="555555" w:sz="4"/>
-              <w:left w:val="single" w:color="555555" w:sz="4"/>
-              <w:bottom w:val="single" w:color="555555" w:sz="4"/>
-              <w:right w:val="single" w:color="555555" w:sz="4"/>
-            </w:tcBorders>
-            <w:tcMar>
-              <w:top w:type="dxa" w:w="30"/>
-              <w:left w:type="dxa" w:w="60"/>
-              <w:bottom w:type="dxa" w:w="30"/>
-              <w:right w:type="dxa" w:w="60"/>
-            </w:tcMar>
-            <w:vAlign w:val="center"/>
-          </w:tcPr>
-          <w:p>
-            <w:pPr>
-              <w:spacing w:after="0" w:before="0"/>
-              <w:jc w:val="center"/>
-            </w:pPr>
-            <w:r>
-              <w:rPr>
-                <w:rFonts w:ascii="Arial" w:cs="Arial" w:eastAsia="Arial" w:hAnsi="Arial"/>
-                <w:sz w:val="18"/>
-                <w:szCs w:val="18"/>
-              </w:rPr>
-              <w:t xml:space="preserve"/>
-            </w:r>
-          </w:p>
-        </w:tc>
-        <w:tc>
-          <w:tcPr>
-            <w:tcW w:type="dxa" w:w="600"/>
+            <w:tcW w:type="dxa" w:w="4396"/>
+            <w:tcBorders>
+              <w:top w:val="single" w:color="555555" w:sz="4"/>
+              <w:left w:val="single" w:color="555555" w:sz="4"/>
+              <w:bottom w:val="single" w:color="555555" w:sz="4"/>
+              <w:right w:val="single" w:color="555555" w:sz="4"/>
+            </w:tcBorders>
+            <w:tcMar>
+              <w:top w:type="dxa" w:w="30"/>
+              <w:left w:type="dxa" w:w="60"/>
+              <w:bottom w:type="dxa" w:w="30"/>
+              <w:right w:type="dxa" w:w="60"/>
+            </w:tcMar>
+            <w:vAlign w:val="center"/>
+          </w:tcPr>
+          <w:p>
+            <w:pPr>
+              <w:spacing w:after="0" w:before="0"/>
+            </w:pPr>
+            <w:r>
+              <w:rPr>
+                <w:rFonts w:ascii="Arial" w:cs="Arial" w:eastAsia="Arial" w:hAnsi="Arial"/>
+                <w:sz w:val="18"/>
+                <w:szCs w:val="18"/>
+              </w:rPr>
+              <w:t xml:space="preserve"/>
+            </w:r>
+          </w:p>
+        </w:tc>
+        <w:tc>
+          <w:tcPr>
+            <w:tcW w:type="dxa" w:w="578"/>
+            <w:tcBorders>
+              <w:top w:val="single" w:color="555555" w:sz="4"/>
+              <w:left w:val="single" w:color="555555" w:sz="4"/>
+              <w:bottom w:val="single" w:color="555555" w:sz="4"/>
+              <w:right w:val="single" w:color="555555" w:sz="4"/>
+            </w:tcBorders>
+            <w:tcMar>
+              <w:top w:type="dxa" w:w="30"/>
+              <w:left w:type="dxa" w:w="60"/>
+              <w:bottom w:type="dxa" w:w="30"/>
+              <w:right w:type="dxa" w:w="60"/>
+            </w:tcMar>
+            <w:vAlign w:val="center"/>
+          </w:tcPr>
+          <w:p>
+            <w:pPr>
+              <w:spacing w:after="0" w:before="0"/>
+              <w:jc w:val="center"/>
+            </w:pPr>
+            <w:r>
+              <w:rPr>
+                <w:rFonts w:ascii="Arial" w:cs="Arial" w:eastAsia="Arial" w:hAnsi="Arial"/>
+                <w:sz w:val="18"/>
+                <w:szCs w:val="18"/>
+              </w:rPr>
+              <w:t xml:space="preserve"/>
+            </w:r>
+          </w:p>
+        </w:tc>
+        <w:tc>
+          <w:tcPr>
+            <w:tcW w:type="dxa" w:w="578"/>
             <w:tcBorders>
               <w:top w:val="single" w:color="555555" w:sz="4"/>
               <w:left w:val="single" w:color="555555" w:sz="4"/>
@@ -1688,38 +1688,38 @@
         </w:tc>
         <w:tc>
           <w:tcPr>
-            <w:tcW w:type="dxa" w:w="4560"/>
-            <w:tcBorders>
-              <w:top w:val="single" w:color="555555" w:sz="4"/>
-              <w:left w:val="single" w:color="555555" w:sz="4"/>
-              <w:bottom w:val="single" w:color="555555" w:sz="4"/>
-              <w:right w:val="single" w:color="555555" w:sz="4"/>
-            </w:tcBorders>
-            <w:tcMar>
-              <w:top w:type="dxa" w:w="30"/>
-              <w:left w:type="dxa" w:w="60"/>
-              <w:bottom w:type="dxa" w:w="30"/>
-              <w:right w:type="dxa" w:w="60"/>
-            </w:tcMar>
-            <w:vAlign w:val="center"/>
-          </w:tcPr>
-          <w:p>
-            <w:pPr>
-              <w:spacing w:after="0" w:before="0"/>
-            </w:pPr>
-            <w:r>
-              <w:rPr>
-                <w:rFonts w:ascii="Arial" w:cs="Arial" w:eastAsia="Arial" w:hAnsi="Arial"/>
-                <w:sz w:val="18"/>
-                <w:szCs w:val="18"/>
-              </w:rPr>
-              <w:t xml:space="preserve"/>
-            </w:r>
-          </w:p>
-        </w:tc>
-        <w:tc>
-          <w:tcPr>
-            <w:tcW w:type="dxa" w:w="600"/>
+            <w:tcW w:type="dxa" w:w="4396"/>
+            <w:tcBorders>
+              <w:top w:val="single" w:color="555555" w:sz="4"/>
+              <w:left w:val="single" w:color="555555" w:sz="4"/>
+              <w:bottom w:val="single" w:color="555555" w:sz="4"/>
+              <w:right w:val="single" w:color="555555" w:sz="4"/>
+            </w:tcBorders>
+            <w:tcMar>
+              <w:top w:type="dxa" w:w="30"/>
+              <w:left w:type="dxa" w:w="60"/>
+              <w:bottom w:type="dxa" w:w="30"/>
+              <w:right w:type="dxa" w:w="60"/>
+            </w:tcMar>
+            <w:vAlign w:val="center"/>
+          </w:tcPr>
+          <w:p>
+            <w:pPr>
+              <w:spacing w:after="0" w:before="0"/>
+            </w:pPr>
+            <w:r>
+              <w:rPr>
+                <w:rFonts w:ascii="Arial" w:cs="Arial" w:eastAsia="Arial" w:hAnsi="Arial"/>
+                <w:sz w:val="18"/>
+                <w:szCs w:val="18"/>
+              </w:rPr>
+              <w:t xml:space="preserve"/>
+            </w:r>
+          </w:p>
+        </w:tc>
+        <w:tc>
+          <w:tcPr>
+            <w:tcW w:type="dxa" w:w="580"/>
             <w:tcBorders>
               <w:top w:val="single" w:color="555555" w:sz="4"/>
               <w:left w:val="single" w:color="555555" w:sz="4"/>
@@ -1756,7 +1756,7 @@
         </w:trPr>
         <w:tc>
           <w:tcPr>
-            <w:tcW w:type="dxa" w:w="600"/>
+            <w:tcW w:type="dxa" w:w="578"/>
             <w:tcBorders>
               <w:top w:val="single" w:color="555555" w:sz="4"/>
               <w:left w:val="single" w:color="555555" w:sz="4"/>
@@ -1788,70 +1788,70 @@
         </w:tc>
         <w:tc>
           <w:tcPr>
-            <w:tcW w:type="dxa" w:w="4560"/>
-            <w:tcBorders>
-              <w:top w:val="single" w:color="555555" w:sz="4"/>
-              <w:left w:val="single" w:color="555555" w:sz="4"/>
-              <w:bottom w:val="single" w:color="555555" w:sz="4"/>
-              <w:right w:val="single" w:color="555555" w:sz="4"/>
-            </w:tcBorders>
-            <w:tcMar>
-              <w:top w:type="dxa" w:w="30"/>
-              <w:left w:type="dxa" w:w="60"/>
-              <w:bottom w:type="dxa" w:w="30"/>
-              <w:right w:type="dxa" w:w="60"/>
-            </w:tcMar>
-            <w:vAlign w:val="center"/>
-          </w:tcPr>
-          <w:p>
-            <w:pPr>
-              <w:spacing w:after="0" w:before="0"/>
-            </w:pPr>
-            <w:r>
-              <w:rPr>
-                <w:rFonts w:ascii="Arial" w:cs="Arial" w:eastAsia="Arial" w:hAnsi="Arial"/>
-                <w:sz w:val="18"/>
-                <w:szCs w:val="18"/>
-              </w:rPr>
-              <w:t xml:space="preserve"/>
-            </w:r>
-          </w:p>
-        </w:tc>
-        <w:tc>
-          <w:tcPr>
-            <w:tcW w:type="dxa" w:w="600"/>
-            <w:tcBorders>
-              <w:top w:val="single" w:color="555555" w:sz="4"/>
-              <w:left w:val="single" w:color="555555" w:sz="4"/>
-              <w:bottom w:val="single" w:color="555555" w:sz="4"/>
-              <w:right w:val="single" w:color="555555" w:sz="4"/>
-            </w:tcBorders>
-            <w:tcMar>
-              <w:top w:type="dxa" w:w="30"/>
-              <w:left w:type="dxa" w:w="60"/>
-              <w:bottom w:type="dxa" w:w="30"/>
-              <w:right w:type="dxa" w:w="60"/>
-            </w:tcMar>
-            <w:vAlign w:val="center"/>
-          </w:tcPr>
-          <w:p>
-            <w:pPr>
-              <w:spacing w:after="0" w:before="0"/>
-              <w:jc w:val="center"/>
-            </w:pPr>
-            <w:r>
-              <w:rPr>
-                <w:rFonts w:ascii="Arial" w:cs="Arial" w:eastAsia="Arial" w:hAnsi="Arial"/>
-                <w:sz w:val="18"/>
-                <w:szCs w:val="18"/>
-              </w:rPr>
-              <w:t xml:space="preserve"/>
-            </w:r>
-          </w:p>
-        </w:tc>
-        <w:tc>
-          <w:tcPr>
-            <w:tcW w:type="dxa" w:w="600"/>
+            <w:tcW w:type="dxa" w:w="4396"/>
+            <w:tcBorders>
+              <w:top w:val="single" w:color="555555" w:sz="4"/>
+              <w:left w:val="single" w:color="555555" w:sz="4"/>
+              <w:bottom w:val="single" w:color="555555" w:sz="4"/>
+              <w:right w:val="single" w:color="555555" w:sz="4"/>
+            </w:tcBorders>
+            <w:tcMar>
+              <w:top w:type="dxa" w:w="30"/>
+              <w:left w:type="dxa" w:w="60"/>
+              <w:bottom w:type="dxa" w:w="30"/>
+              <w:right w:type="dxa" w:w="60"/>
+            </w:tcMar>
+            <w:vAlign w:val="center"/>
+          </w:tcPr>
+          <w:p>
+            <w:pPr>
+              <w:spacing w:after="0" w:before="0"/>
+            </w:pPr>
+            <w:r>
+              <w:rPr>
+                <w:rFonts w:ascii="Arial" w:cs="Arial" w:eastAsia="Arial" w:hAnsi="Arial"/>
+                <w:sz w:val="18"/>
+                <w:szCs w:val="18"/>
+              </w:rPr>
+              <w:t xml:space="preserve"/>
+            </w:r>
+          </w:p>
+        </w:tc>
+        <w:tc>
+          <w:tcPr>
+            <w:tcW w:type="dxa" w:w="578"/>
+            <w:tcBorders>
+              <w:top w:val="single" w:color="555555" w:sz="4"/>
+              <w:left w:val="single" w:color="555555" w:sz="4"/>
+              <w:bottom w:val="single" w:color="555555" w:sz="4"/>
+              <w:right w:val="single" w:color="555555" w:sz="4"/>
+            </w:tcBorders>
+            <w:tcMar>
+              <w:top w:type="dxa" w:w="30"/>
+              <w:left w:type="dxa" w:w="60"/>
+              <w:bottom w:type="dxa" w:w="30"/>
+              <w:right w:type="dxa" w:w="60"/>
+            </w:tcMar>
+            <w:vAlign w:val="center"/>
+          </w:tcPr>
+          <w:p>
+            <w:pPr>
+              <w:spacing w:after="0" w:before="0"/>
+              <w:jc w:val="center"/>
+            </w:pPr>
+            <w:r>
+              <w:rPr>
+                <w:rFonts w:ascii="Arial" w:cs="Arial" w:eastAsia="Arial" w:hAnsi="Arial"/>
+                <w:sz w:val="18"/>
+                <w:szCs w:val="18"/>
+              </w:rPr>
+              <w:t xml:space="preserve"/>
+            </w:r>
+          </w:p>
+        </w:tc>
+        <w:tc>
+          <w:tcPr>
+            <w:tcW w:type="dxa" w:w="578"/>
             <w:tcBorders>
               <w:top w:val="single" w:color="555555" w:sz="4"/>
               <w:left w:val="single" w:color="555555" w:sz="4"/>
@@ -1883,38 +1883,38 @@
         </w:tc>
         <w:tc>
           <w:tcPr>
-            <w:tcW w:type="dxa" w:w="4560"/>
-            <w:tcBorders>
-              <w:top w:val="single" w:color="555555" w:sz="4"/>
-              <w:left w:val="single" w:color="555555" w:sz="4"/>
-              <w:bottom w:val="single" w:color="555555" w:sz="4"/>
-              <w:right w:val="single" w:color="555555" w:sz="4"/>
-            </w:tcBorders>
-            <w:tcMar>
-              <w:top w:type="dxa" w:w="30"/>
-              <w:left w:type="dxa" w:w="60"/>
-              <w:bottom w:type="dxa" w:w="30"/>
-              <w:right w:type="dxa" w:w="60"/>
-            </w:tcMar>
-            <w:vAlign w:val="center"/>
-          </w:tcPr>
-          <w:p>
-            <w:pPr>
-              <w:spacing w:after="0" w:before="0"/>
-            </w:pPr>
-            <w:r>
-              <w:rPr>
-                <w:rFonts w:ascii="Arial" w:cs="Arial" w:eastAsia="Arial" w:hAnsi="Arial"/>
-                <w:sz w:val="18"/>
-                <w:szCs w:val="18"/>
-              </w:rPr>
-              <w:t xml:space="preserve"/>
-            </w:r>
-          </w:p>
-        </w:tc>
-        <w:tc>
-          <w:tcPr>
-            <w:tcW w:type="dxa" w:w="600"/>
+            <w:tcW w:type="dxa" w:w="4396"/>
+            <w:tcBorders>
+              <w:top w:val="single" w:color="555555" w:sz="4"/>
+              <w:left w:val="single" w:color="555555" w:sz="4"/>
+              <w:bottom w:val="single" w:color="555555" w:sz="4"/>
+              <w:right w:val="single" w:color="555555" w:sz="4"/>
+            </w:tcBorders>
+            <w:tcMar>
+              <w:top w:type="dxa" w:w="30"/>
+              <w:left w:type="dxa" w:w="60"/>
+              <w:bottom w:type="dxa" w:w="30"/>
+              <w:right w:type="dxa" w:w="60"/>
+            </w:tcMar>
+            <w:vAlign w:val="center"/>
+          </w:tcPr>
+          <w:p>
+            <w:pPr>
+              <w:spacing w:after="0" w:before="0"/>
+            </w:pPr>
+            <w:r>
+              <w:rPr>
+                <w:rFonts w:ascii="Arial" w:cs="Arial" w:eastAsia="Arial" w:hAnsi="Arial"/>
+                <w:sz w:val="18"/>
+                <w:szCs w:val="18"/>
+              </w:rPr>
+              <w:t xml:space="preserve"/>
+            </w:r>
+          </w:p>
+        </w:tc>
+        <w:tc>
+          <w:tcPr>
+            <w:tcW w:type="dxa" w:w="580"/>
             <w:tcBorders>
               <w:top w:val="single" w:color="555555" w:sz="4"/>
               <w:left w:val="single" w:color="555555" w:sz="4"/>
@@ -1978,7 +1978,7 @@
     </w:p>
     <w:tbl>
       <w:tblPr>
-        <w:tblW w:type="dxa" w:w="11520"/>
+        <w:tblW w:type="dxa" w:w="11106"/>
         <w:tblBorders>
           <w:top w:val="single" w:color="auto" w:sz="4"/>
           <w:left w:val="single" w:color="auto" w:sz="4"/>
@@ -1990,11 +1990,11 @@
         <w:tblLayout w:type="fixed"/>
       </w:tblPr>
       <w:tblGrid>
-        <w:gridCol w:w="4120"/>
-        <w:gridCol w:w="1250"/>
-        <w:gridCol w:w="1250"/>
-        <w:gridCol w:w="1300"/>
-        <w:gridCol w:w="3600"/>
+        <w:gridCol w:w="3972"/>
+        <w:gridCol w:w="1205"/>
+        <w:gridCol w:w="1205"/>
+        <w:gridCol w:w="1253"/>
+        <w:gridCol w:w="3471"/>
       </w:tblGrid>
       <w:tr>
         <w:trPr>
@@ -2002,7 +2002,7 @@
         </w:trPr>
         <w:tc>
           <w:tcPr>
-            <w:tcW w:type="dxa" w:w="4120"/>
+            <w:tcW w:type="dxa" w:w="3972"/>
             <w:tcBorders>
               <w:top w:val="single" w:color="555555" w:sz="4"/>
               <w:left w:val="single" w:color="555555" w:sz="4"/>
@@ -2037,7 +2037,7 @@
         </w:tc>
         <w:tc>
           <w:tcPr>
-            <w:tcW w:type="dxa" w:w="1250"/>
+            <w:tcW w:type="dxa" w:w="1205"/>
             <w:tcBorders>
               <w:top w:val="single" w:color="555555" w:sz="4"/>
               <w:left w:val="single" w:color="555555" w:sz="4"/>
@@ -2072,7 +2072,7 @@
         </w:tc>
         <w:tc>
           <w:tcPr>
-            <w:tcW w:type="dxa" w:w="1250"/>
+            <w:tcW w:type="dxa" w:w="1205"/>
             <w:tcBorders>
               <w:top w:val="single" w:color="555555" w:sz="4"/>
               <w:left w:val="single" w:color="555555" w:sz="4"/>
@@ -2107,7 +2107,7 @@
         </w:tc>
         <w:tc>
           <w:tcPr>
-            <w:tcW w:type="dxa" w:w="1300"/>
+            <w:tcW w:type="dxa" w:w="1253"/>
             <w:tcBorders>
               <w:top w:val="single" w:color="555555" w:sz="4"/>
               <w:left w:val="single" w:color="555555" w:sz="4"/>
@@ -2142,7 +2142,7 @@
         </w:tc>
         <w:tc>
           <w:tcPr>
-            <w:tcW w:type="dxa" w:w="3600"/>
+            <w:tcW w:type="dxa" w:w="3471"/>
             <w:tcBorders>
               <w:top w:val="single" w:color="555555" w:sz="4"/>
               <w:left w:val="single" w:color="555555" w:sz="4"/>
@@ -2182,7 +2182,7 @@
         </w:trPr>
         <w:tc>
           <w:tcPr>
-            <w:tcW w:type="dxa" w:w="4120"/>
+            <w:tcW w:type="dxa" w:w="3972"/>
             <w:tcBorders>
               <w:top w:val="single" w:color="555555" w:sz="4"/>
               <w:left w:val="single" w:color="555555" w:sz="4"/>
@@ -2213,7 +2213,7 @@
         </w:tc>
         <w:tc>
           <w:tcPr>
-            <w:tcW w:type="dxa" w:w="1250"/>
+            <w:tcW w:type="dxa" w:w="1205"/>
             <w:tcBorders>
               <w:top w:val="single" w:color="555555" w:sz="4"/>
               <w:left w:val="single" w:color="555555" w:sz="4"/>
@@ -2245,71 +2245,71 @@
         </w:tc>
         <w:tc>
           <w:tcPr>
-            <w:tcW w:type="dxa" w:w="1250"/>
-            <w:tcBorders>
-              <w:top w:val="single" w:color="555555" w:sz="4"/>
-              <w:left w:val="single" w:color="555555" w:sz="4"/>
-              <w:bottom w:val="single" w:color="555555" w:sz="4"/>
-              <w:right w:val="single" w:color="555555" w:sz="4"/>
-            </w:tcBorders>
-            <w:tcMar>
-              <w:top w:type="dxa" w:w="30"/>
-              <w:left w:type="dxa" w:w="60"/>
-              <w:bottom w:type="dxa" w:w="30"/>
-              <w:right w:type="dxa" w:w="60"/>
-            </w:tcMar>
-            <w:vAlign w:val="center"/>
-          </w:tcPr>
-          <w:p>
-            <w:pPr>
-              <w:spacing w:after="0" w:before="0"/>
-              <w:jc w:val="center"/>
-            </w:pPr>
-            <w:r>
-              <w:rPr>
-                <w:rFonts w:ascii="Arial" w:cs="Arial" w:eastAsia="Arial" w:hAnsi="Arial"/>
-                <w:sz w:val="18"/>
-                <w:szCs w:val="18"/>
-              </w:rPr>
-              <w:t xml:space="preserve"/>
-            </w:r>
-          </w:p>
-        </w:tc>
-        <w:tc>
-          <w:tcPr>
-            <w:tcW w:type="dxa" w:w="1300"/>
-            <w:tcBorders>
-              <w:top w:val="single" w:color="555555" w:sz="4"/>
-              <w:left w:val="single" w:color="555555" w:sz="4"/>
-              <w:bottom w:val="single" w:color="555555" w:sz="4"/>
-              <w:right w:val="single" w:color="555555" w:sz="4"/>
-            </w:tcBorders>
-            <w:tcMar>
-              <w:top w:type="dxa" w:w="30"/>
-              <w:left w:type="dxa" w:w="60"/>
-              <w:bottom w:type="dxa" w:w="30"/>
-              <w:right w:type="dxa" w:w="60"/>
-            </w:tcMar>
-            <w:vAlign w:val="center"/>
-          </w:tcPr>
-          <w:p>
-            <w:pPr>
-              <w:spacing w:after="0" w:before="0"/>
-              <w:jc w:val="center"/>
-            </w:pPr>
-            <w:r>
-              <w:rPr>
-                <w:rFonts w:ascii="Arial" w:cs="Arial" w:eastAsia="Arial" w:hAnsi="Arial"/>
-                <w:sz w:val="18"/>
-                <w:szCs w:val="18"/>
-              </w:rPr>
-              <w:t xml:space="preserve"/>
-            </w:r>
-          </w:p>
-        </w:tc>
-        <w:tc>
-          <w:tcPr>
-            <w:tcW w:type="dxa" w:w="3600"/>
+            <w:tcW w:type="dxa" w:w="1205"/>
+            <w:tcBorders>
+              <w:top w:val="single" w:color="555555" w:sz="4"/>
+              <w:left w:val="single" w:color="555555" w:sz="4"/>
+              <w:bottom w:val="single" w:color="555555" w:sz="4"/>
+              <w:right w:val="single" w:color="555555" w:sz="4"/>
+            </w:tcBorders>
+            <w:tcMar>
+              <w:top w:type="dxa" w:w="30"/>
+              <w:left w:type="dxa" w:w="60"/>
+              <w:bottom w:type="dxa" w:w="30"/>
+              <w:right w:type="dxa" w:w="60"/>
+            </w:tcMar>
+            <w:vAlign w:val="center"/>
+          </w:tcPr>
+          <w:p>
+            <w:pPr>
+              <w:spacing w:after="0" w:before="0"/>
+              <w:jc w:val="center"/>
+            </w:pPr>
+            <w:r>
+              <w:rPr>
+                <w:rFonts w:ascii="Arial" w:cs="Arial" w:eastAsia="Arial" w:hAnsi="Arial"/>
+                <w:sz w:val="18"/>
+                <w:szCs w:val="18"/>
+              </w:rPr>
+              <w:t xml:space="preserve"/>
+            </w:r>
+          </w:p>
+        </w:tc>
+        <w:tc>
+          <w:tcPr>
+            <w:tcW w:type="dxa" w:w="1253"/>
+            <w:tcBorders>
+              <w:top w:val="single" w:color="555555" w:sz="4"/>
+              <w:left w:val="single" w:color="555555" w:sz="4"/>
+              <w:bottom w:val="single" w:color="555555" w:sz="4"/>
+              <w:right w:val="single" w:color="555555" w:sz="4"/>
+            </w:tcBorders>
+            <w:tcMar>
+              <w:top w:type="dxa" w:w="30"/>
+              <w:left w:type="dxa" w:w="60"/>
+              <w:bottom w:type="dxa" w:w="30"/>
+              <w:right w:type="dxa" w:w="60"/>
+            </w:tcMar>
+            <w:vAlign w:val="center"/>
+          </w:tcPr>
+          <w:p>
+            <w:pPr>
+              <w:spacing w:after="0" w:before="0"/>
+              <w:jc w:val="center"/>
+            </w:pPr>
+            <w:r>
+              <w:rPr>
+                <w:rFonts w:ascii="Arial" w:cs="Arial" w:eastAsia="Arial" w:hAnsi="Arial"/>
+                <w:sz w:val="18"/>
+                <w:szCs w:val="18"/>
+              </w:rPr>
+              <w:t xml:space="preserve"/>
+            </w:r>
+          </w:p>
+        </w:tc>
+        <w:tc>
+          <w:tcPr>
+            <w:tcW w:type="dxa" w:w="3471"/>
             <w:tcBorders>
               <w:top w:val="single" w:color="555555" w:sz="4"/>
               <w:left w:val="single" w:color="555555" w:sz="4"/>
@@ -2345,7 +2345,7 @@
         </w:trPr>
         <w:tc>
           <w:tcPr>
-            <w:tcW w:type="dxa" w:w="4120"/>
+            <w:tcW w:type="dxa" w:w="3972"/>
             <w:tcBorders>
               <w:top w:val="single" w:color="555555" w:sz="4"/>
               <w:left w:val="single" w:color="555555" w:sz="4"/>
@@ -2376,7 +2376,7 @@
         </w:tc>
         <w:tc>
           <w:tcPr>
-            <w:tcW w:type="dxa" w:w="1250"/>
+            <w:tcW w:type="dxa" w:w="1205"/>
             <w:tcBorders>
               <w:top w:val="single" w:color="555555" w:sz="4"/>
               <w:left w:val="single" w:color="555555" w:sz="4"/>
@@ -2408,71 +2408,71 @@
         </w:tc>
         <w:tc>
           <w:tcPr>
-            <w:tcW w:type="dxa" w:w="1250"/>
-            <w:tcBorders>
-              <w:top w:val="single" w:color="555555" w:sz="4"/>
-              <w:left w:val="single" w:color="555555" w:sz="4"/>
-              <w:bottom w:val="single" w:color="555555" w:sz="4"/>
-              <w:right w:val="single" w:color="555555" w:sz="4"/>
-            </w:tcBorders>
-            <w:tcMar>
-              <w:top w:type="dxa" w:w="30"/>
-              <w:left w:type="dxa" w:w="60"/>
-              <w:bottom w:type="dxa" w:w="30"/>
-              <w:right w:type="dxa" w:w="60"/>
-            </w:tcMar>
-            <w:vAlign w:val="center"/>
-          </w:tcPr>
-          <w:p>
-            <w:pPr>
-              <w:spacing w:after="0" w:before="0"/>
-              <w:jc w:val="center"/>
-            </w:pPr>
-            <w:r>
-              <w:rPr>
-                <w:rFonts w:ascii="Arial" w:cs="Arial" w:eastAsia="Arial" w:hAnsi="Arial"/>
-                <w:sz w:val="18"/>
-                <w:szCs w:val="18"/>
-              </w:rPr>
-              <w:t xml:space="preserve"/>
-            </w:r>
-          </w:p>
-        </w:tc>
-        <w:tc>
-          <w:tcPr>
-            <w:tcW w:type="dxa" w:w="1300"/>
-            <w:tcBorders>
-              <w:top w:val="single" w:color="555555" w:sz="4"/>
-              <w:left w:val="single" w:color="555555" w:sz="4"/>
-              <w:bottom w:val="single" w:color="555555" w:sz="4"/>
-              <w:right w:val="single" w:color="555555" w:sz="4"/>
-            </w:tcBorders>
-            <w:tcMar>
-              <w:top w:type="dxa" w:w="30"/>
-              <w:left w:type="dxa" w:w="60"/>
-              <w:bottom w:type="dxa" w:w="30"/>
-              <w:right w:type="dxa" w:w="60"/>
-            </w:tcMar>
-            <w:vAlign w:val="center"/>
-          </w:tcPr>
-          <w:p>
-            <w:pPr>
-              <w:spacing w:after="0" w:before="0"/>
-              <w:jc w:val="center"/>
-            </w:pPr>
-            <w:r>
-              <w:rPr>
-                <w:rFonts w:ascii="Arial" w:cs="Arial" w:eastAsia="Arial" w:hAnsi="Arial"/>
-                <w:sz w:val="18"/>
-                <w:szCs w:val="18"/>
-              </w:rPr>
-              <w:t xml:space="preserve"/>
-            </w:r>
-          </w:p>
-        </w:tc>
-        <w:tc>
-          <w:tcPr>
-            <w:tcW w:type="dxa" w:w="3600"/>
+            <w:tcW w:type="dxa" w:w="1205"/>
+            <w:tcBorders>
+              <w:top w:val="single" w:color="555555" w:sz="4"/>
+              <w:left w:val="single" w:color="555555" w:sz="4"/>
+              <w:bottom w:val="single" w:color="555555" w:sz="4"/>
+              <w:right w:val="single" w:color="555555" w:sz="4"/>
+            </w:tcBorders>
+            <w:tcMar>
+              <w:top w:type="dxa" w:w="30"/>
+              <w:left w:type="dxa" w:w="60"/>
+              <w:bottom w:type="dxa" w:w="30"/>
+              <w:right w:type="dxa" w:w="60"/>
+            </w:tcMar>
+            <w:vAlign w:val="center"/>
+          </w:tcPr>
+          <w:p>
+            <w:pPr>
+              <w:spacing w:after="0" w:before="0"/>
+              <w:jc w:val="center"/>
+            </w:pPr>
+            <w:r>
+              <w:rPr>
+                <w:rFonts w:ascii="Arial" w:cs="Arial" w:eastAsia="Arial" w:hAnsi="Arial"/>
+                <w:sz w:val="18"/>
+                <w:szCs w:val="18"/>
+              </w:rPr>
+              <w:t xml:space="preserve"/>
+            </w:r>
+          </w:p>
+        </w:tc>
+        <w:tc>
+          <w:tcPr>
+            <w:tcW w:type="dxa" w:w="1253"/>
+            <w:tcBorders>
+              <w:top w:val="single" w:color="555555" w:sz="4"/>
+              <w:left w:val="single" w:color="555555" w:sz="4"/>
+              <w:bottom w:val="single" w:color="555555" w:sz="4"/>
+              <w:right w:val="single" w:color="555555" w:sz="4"/>
+            </w:tcBorders>
+            <w:tcMar>
+              <w:top w:type="dxa" w:w="30"/>
+              <w:left w:type="dxa" w:w="60"/>
+              <w:bottom w:type="dxa" w:w="30"/>
+              <w:right w:type="dxa" w:w="60"/>
+            </w:tcMar>
+            <w:vAlign w:val="center"/>
+          </w:tcPr>
+          <w:p>
+            <w:pPr>
+              <w:spacing w:after="0" w:before="0"/>
+              <w:jc w:val="center"/>
+            </w:pPr>
+            <w:r>
+              <w:rPr>
+                <w:rFonts w:ascii="Arial" w:cs="Arial" w:eastAsia="Arial" w:hAnsi="Arial"/>
+                <w:sz w:val="18"/>
+                <w:szCs w:val="18"/>
+              </w:rPr>
+              <w:t xml:space="preserve"/>
+            </w:r>
+          </w:p>
+        </w:tc>
+        <w:tc>
+          <w:tcPr>
+            <w:tcW w:type="dxa" w:w="3471"/>
             <w:tcBorders>
               <w:top w:val="single" w:color="555555" w:sz="4"/>
               <w:left w:val="single" w:color="555555" w:sz="4"/>
@@ -2508,7 +2508,7 @@
         </w:trPr>
         <w:tc>
           <w:tcPr>
-            <w:tcW w:type="dxa" w:w="4120"/>
+            <w:tcW w:type="dxa" w:w="3972"/>
             <w:tcBorders>
               <w:top w:val="single" w:color="555555" w:sz="4"/>
               <w:left w:val="single" w:color="555555" w:sz="4"/>
@@ -2539,7 +2539,7 @@
         </w:tc>
         <w:tc>
           <w:tcPr>
-            <w:tcW w:type="dxa" w:w="1250"/>
+            <w:tcW w:type="dxa" w:w="1205"/>
             <w:tcBorders>
               <w:top w:val="single" w:color="555555" w:sz="4"/>
               <w:left w:val="single" w:color="555555" w:sz="4"/>
@@ -2571,71 +2571,71 @@
         </w:tc>
         <w:tc>
           <w:tcPr>
-            <w:tcW w:type="dxa" w:w="1250"/>
-            <w:tcBorders>
-              <w:top w:val="single" w:color="555555" w:sz="4"/>
-              <w:left w:val="single" w:color="555555" w:sz="4"/>
-              <w:bottom w:val="single" w:color="555555" w:sz="4"/>
-              <w:right w:val="single" w:color="555555" w:sz="4"/>
-            </w:tcBorders>
-            <w:tcMar>
-              <w:top w:type="dxa" w:w="30"/>
-              <w:left w:type="dxa" w:w="60"/>
-              <w:bottom w:type="dxa" w:w="30"/>
-              <w:right w:type="dxa" w:w="60"/>
-            </w:tcMar>
-            <w:vAlign w:val="center"/>
-          </w:tcPr>
-          <w:p>
-            <w:pPr>
-              <w:spacing w:after="0" w:before="0"/>
-              <w:jc w:val="center"/>
-            </w:pPr>
-            <w:r>
-              <w:rPr>
-                <w:rFonts w:ascii="Arial" w:cs="Arial" w:eastAsia="Arial" w:hAnsi="Arial"/>
-                <w:sz w:val="18"/>
-                <w:szCs w:val="18"/>
-              </w:rPr>
-              <w:t xml:space="preserve"/>
-            </w:r>
-          </w:p>
-        </w:tc>
-        <w:tc>
-          <w:tcPr>
-            <w:tcW w:type="dxa" w:w="1300"/>
-            <w:tcBorders>
-              <w:top w:val="single" w:color="555555" w:sz="4"/>
-              <w:left w:val="single" w:color="555555" w:sz="4"/>
-              <w:bottom w:val="single" w:color="555555" w:sz="4"/>
-              <w:right w:val="single" w:color="555555" w:sz="4"/>
-            </w:tcBorders>
-            <w:tcMar>
-              <w:top w:type="dxa" w:w="30"/>
-              <w:left w:type="dxa" w:w="60"/>
-              <w:bottom w:type="dxa" w:w="30"/>
-              <w:right w:type="dxa" w:w="60"/>
-            </w:tcMar>
-            <w:vAlign w:val="center"/>
-          </w:tcPr>
-          <w:p>
-            <w:pPr>
-              <w:spacing w:after="0" w:before="0"/>
-              <w:jc w:val="center"/>
-            </w:pPr>
-            <w:r>
-              <w:rPr>
-                <w:rFonts w:ascii="Arial" w:cs="Arial" w:eastAsia="Arial" w:hAnsi="Arial"/>
-                <w:sz w:val="18"/>
-                <w:szCs w:val="18"/>
-              </w:rPr>
-              <w:t xml:space="preserve"/>
-            </w:r>
-          </w:p>
-        </w:tc>
-        <w:tc>
-          <w:tcPr>
-            <w:tcW w:type="dxa" w:w="3600"/>
+            <w:tcW w:type="dxa" w:w="1205"/>
+            <w:tcBorders>
+              <w:top w:val="single" w:color="555555" w:sz="4"/>
+              <w:left w:val="single" w:color="555555" w:sz="4"/>
+              <w:bottom w:val="single" w:color="555555" w:sz="4"/>
+              <w:right w:val="single" w:color="555555" w:sz="4"/>
+            </w:tcBorders>
+            <w:tcMar>
+              <w:top w:type="dxa" w:w="30"/>
+              <w:left w:type="dxa" w:w="60"/>
+              <w:bottom w:type="dxa" w:w="30"/>
+              <w:right w:type="dxa" w:w="60"/>
+            </w:tcMar>
+            <w:vAlign w:val="center"/>
+          </w:tcPr>
+          <w:p>
+            <w:pPr>
+              <w:spacing w:after="0" w:before="0"/>
+              <w:jc w:val="center"/>
+            </w:pPr>
+            <w:r>
+              <w:rPr>
+                <w:rFonts w:ascii="Arial" w:cs="Arial" w:eastAsia="Arial" w:hAnsi="Arial"/>
+                <w:sz w:val="18"/>
+                <w:szCs w:val="18"/>
+              </w:rPr>
+              <w:t xml:space="preserve"/>
+            </w:r>
+          </w:p>
+        </w:tc>
+        <w:tc>
+          <w:tcPr>
+            <w:tcW w:type="dxa" w:w="1253"/>
+            <w:tcBorders>
+              <w:top w:val="single" w:color="555555" w:sz="4"/>
+              <w:left w:val="single" w:color="555555" w:sz="4"/>
+              <w:bottom w:val="single" w:color="555555" w:sz="4"/>
+              <w:right w:val="single" w:color="555555" w:sz="4"/>
+            </w:tcBorders>
+            <w:tcMar>
+              <w:top w:type="dxa" w:w="30"/>
+              <w:left w:type="dxa" w:w="60"/>
+              <w:bottom w:type="dxa" w:w="30"/>
+              <w:right w:type="dxa" w:w="60"/>
+            </w:tcMar>
+            <w:vAlign w:val="center"/>
+          </w:tcPr>
+          <w:p>
+            <w:pPr>
+              <w:spacing w:after="0" w:before="0"/>
+              <w:jc w:val="center"/>
+            </w:pPr>
+            <w:r>
+              <w:rPr>
+                <w:rFonts w:ascii="Arial" w:cs="Arial" w:eastAsia="Arial" w:hAnsi="Arial"/>
+                <w:sz w:val="18"/>
+                <w:szCs w:val="18"/>
+              </w:rPr>
+              <w:t xml:space="preserve"/>
+            </w:r>
+          </w:p>
+        </w:tc>
+        <w:tc>
+          <w:tcPr>
+            <w:tcW w:type="dxa" w:w="3471"/>
             <w:tcBorders>
               <w:top w:val="single" w:color="555555" w:sz="4"/>
               <w:left w:val="single" w:color="555555" w:sz="4"/>
@@ -2671,7 +2671,7 @@
         </w:trPr>
         <w:tc>
           <w:tcPr>
-            <w:tcW w:type="dxa" w:w="4120"/>
+            <w:tcW w:type="dxa" w:w="3972"/>
             <w:tcBorders>
               <w:top w:val="single" w:color="555555" w:sz="4"/>
               <w:left w:val="single" w:color="555555" w:sz="4"/>
@@ -2702,7 +2702,7 @@
         </w:tc>
         <w:tc>
           <w:tcPr>
-            <w:tcW w:type="dxa" w:w="1250"/>
+            <w:tcW w:type="dxa" w:w="1205"/>
             <w:tcBorders>
               <w:top w:val="single" w:color="555555" w:sz="4"/>
               <w:left w:val="single" w:color="555555" w:sz="4"/>
@@ -2734,71 +2734,71 @@
         </w:tc>
         <w:tc>
           <w:tcPr>
-            <w:tcW w:type="dxa" w:w="1250"/>
-            <w:tcBorders>
-              <w:top w:val="single" w:color="555555" w:sz="4"/>
-              <w:left w:val="single" w:color="555555" w:sz="4"/>
-              <w:bottom w:val="single" w:color="555555" w:sz="4"/>
-              <w:right w:val="single" w:color="555555" w:sz="4"/>
-            </w:tcBorders>
-            <w:tcMar>
-              <w:top w:type="dxa" w:w="30"/>
-              <w:left w:type="dxa" w:w="60"/>
-              <w:bottom w:type="dxa" w:w="30"/>
-              <w:right w:type="dxa" w:w="60"/>
-            </w:tcMar>
-            <w:vAlign w:val="center"/>
-          </w:tcPr>
-          <w:p>
-            <w:pPr>
-              <w:spacing w:after="0" w:before="0"/>
-              <w:jc w:val="center"/>
-            </w:pPr>
-            <w:r>
-              <w:rPr>
-                <w:rFonts w:ascii="Arial" w:cs="Arial" w:eastAsia="Arial" w:hAnsi="Arial"/>
-                <w:sz w:val="18"/>
-                <w:szCs w:val="18"/>
-              </w:rPr>
-              <w:t xml:space="preserve"/>
-            </w:r>
-          </w:p>
-        </w:tc>
-        <w:tc>
-          <w:tcPr>
-            <w:tcW w:type="dxa" w:w="1300"/>
-            <w:tcBorders>
-              <w:top w:val="single" w:color="555555" w:sz="4"/>
-              <w:left w:val="single" w:color="555555" w:sz="4"/>
-              <w:bottom w:val="single" w:color="555555" w:sz="4"/>
-              <w:right w:val="single" w:color="555555" w:sz="4"/>
-            </w:tcBorders>
-            <w:tcMar>
-              <w:top w:type="dxa" w:w="30"/>
-              <w:left w:type="dxa" w:w="60"/>
-              <w:bottom w:type="dxa" w:w="30"/>
-              <w:right w:type="dxa" w:w="60"/>
-            </w:tcMar>
-            <w:vAlign w:val="center"/>
-          </w:tcPr>
-          <w:p>
-            <w:pPr>
-              <w:spacing w:after="0" w:before="0"/>
-              <w:jc w:val="center"/>
-            </w:pPr>
-            <w:r>
-              <w:rPr>
-                <w:rFonts w:ascii="Arial" w:cs="Arial" w:eastAsia="Arial" w:hAnsi="Arial"/>
-                <w:sz w:val="18"/>
-                <w:szCs w:val="18"/>
-              </w:rPr>
-              <w:t xml:space="preserve"/>
-            </w:r>
-          </w:p>
-        </w:tc>
-        <w:tc>
-          <w:tcPr>
-            <w:tcW w:type="dxa" w:w="3600"/>
+            <w:tcW w:type="dxa" w:w="1205"/>
+            <w:tcBorders>
+              <w:top w:val="single" w:color="555555" w:sz="4"/>
+              <w:left w:val="single" w:color="555555" w:sz="4"/>
+              <w:bottom w:val="single" w:color="555555" w:sz="4"/>
+              <w:right w:val="single" w:color="555555" w:sz="4"/>
+            </w:tcBorders>
+            <w:tcMar>
+              <w:top w:type="dxa" w:w="30"/>
+              <w:left w:type="dxa" w:w="60"/>
+              <w:bottom w:type="dxa" w:w="30"/>
+              <w:right w:type="dxa" w:w="60"/>
+            </w:tcMar>
+            <w:vAlign w:val="center"/>
+          </w:tcPr>
+          <w:p>
+            <w:pPr>
+              <w:spacing w:after="0" w:before="0"/>
+              <w:jc w:val="center"/>
+            </w:pPr>
+            <w:r>
+              <w:rPr>
+                <w:rFonts w:ascii="Arial" w:cs="Arial" w:eastAsia="Arial" w:hAnsi="Arial"/>
+                <w:sz w:val="18"/>
+                <w:szCs w:val="18"/>
+              </w:rPr>
+              <w:t xml:space="preserve"/>
+            </w:r>
+          </w:p>
+        </w:tc>
+        <w:tc>
+          <w:tcPr>
+            <w:tcW w:type="dxa" w:w="1253"/>
+            <w:tcBorders>
+              <w:top w:val="single" w:color="555555" w:sz="4"/>
+              <w:left w:val="single" w:color="555555" w:sz="4"/>
+              <w:bottom w:val="single" w:color="555555" w:sz="4"/>
+              <w:right w:val="single" w:color="555555" w:sz="4"/>
+            </w:tcBorders>
+            <w:tcMar>
+              <w:top w:type="dxa" w:w="30"/>
+              <w:left w:type="dxa" w:w="60"/>
+              <w:bottom w:type="dxa" w:w="30"/>
+              <w:right w:type="dxa" w:w="60"/>
+            </w:tcMar>
+            <w:vAlign w:val="center"/>
+          </w:tcPr>
+          <w:p>
+            <w:pPr>
+              <w:spacing w:after="0" w:before="0"/>
+              <w:jc w:val="center"/>
+            </w:pPr>
+            <w:r>
+              <w:rPr>
+                <w:rFonts w:ascii="Arial" w:cs="Arial" w:eastAsia="Arial" w:hAnsi="Arial"/>
+                <w:sz w:val="18"/>
+                <w:szCs w:val="18"/>
+              </w:rPr>
+              <w:t xml:space="preserve"/>
+            </w:r>
+          </w:p>
+        </w:tc>
+        <w:tc>
+          <w:tcPr>
+            <w:tcW w:type="dxa" w:w="3471"/>
             <w:tcBorders>
               <w:top w:val="single" w:color="555555" w:sz="4"/>
               <w:left w:val="single" w:color="555555" w:sz="4"/>
@@ -2834,7 +2834,7 @@
         </w:trPr>
         <w:tc>
           <w:tcPr>
-            <w:tcW w:type="dxa" w:w="4120"/>
+            <w:tcW w:type="dxa" w:w="3972"/>
             <w:tcBorders>
               <w:top w:val="single" w:color="555555" w:sz="4"/>
               <w:left w:val="single" w:color="555555" w:sz="4"/>
@@ -2865,7 +2865,7 @@
         </w:tc>
         <w:tc>
           <w:tcPr>
-            <w:tcW w:type="dxa" w:w="1250"/>
+            <w:tcW w:type="dxa" w:w="1205"/>
             <w:tcBorders>
               <w:top w:val="single" w:color="555555" w:sz="4"/>
               <w:left w:val="single" w:color="555555" w:sz="4"/>
@@ -2897,71 +2897,71 @@
         </w:tc>
         <w:tc>
           <w:tcPr>
-            <w:tcW w:type="dxa" w:w="1250"/>
-            <w:tcBorders>
-              <w:top w:val="single" w:color="555555" w:sz="4"/>
-              <w:left w:val="single" w:color="555555" w:sz="4"/>
-              <w:bottom w:val="single" w:color="555555" w:sz="4"/>
-              <w:right w:val="single" w:color="555555" w:sz="4"/>
-            </w:tcBorders>
-            <w:tcMar>
-              <w:top w:type="dxa" w:w="30"/>
-              <w:left w:type="dxa" w:w="60"/>
-              <w:bottom w:type="dxa" w:w="30"/>
-              <w:right w:type="dxa" w:w="60"/>
-            </w:tcMar>
-            <w:vAlign w:val="center"/>
-          </w:tcPr>
-          <w:p>
-            <w:pPr>
-              <w:spacing w:after="0" w:before="0"/>
-              <w:jc w:val="center"/>
-            </w:pPr>
-            <w:r>
-              <w:rPr>
-                <w:rFonts w:ascii="Arial" w:cs="Arial" w:eastAsia="Arial" w:hAnsi="Arial"/>
-                <w:sz w:val="18"/>
-                <w:szCs w:val="18"/>
-              </w:rPr>
-              <w:t xml:space="preserve"/>
-            </w:r>
-          </w:p>
-        </w:tc>
-        <w:tc>
-          <w:tcPr>
-            <w:tcW w:type="dxa" w:w="1300"/>
-            <w:tcBorders>
-              <w:top w:val="single" w:color="555555" w:sz="4"/>
-              <w:left w:val="single" w:color="555555" w:sz="4"/>
-              <w:bottom w:val="single" w:color="555555" w:sz="4"/>
-              <w:right w:val="single" w:color="555555" w:sz="4"/>
-            </w:tcBorders>
-            <w:tcMar>
-              <w:top w:type="dxa" w:w="30"/>
-              <w:left w:type="dxa" w:w="60"/>
-              <w:bottom w:type="dxa" w:w="30"/>
-              <w:right w:type="dxa" w:w="60"/>
-            </w:tcMar>
-            <w:vAlign w:val="center"/>
-          </w:tcPr>
-          <w:p>
-            <w:pPr>
-              <w:spacing w:after="0" w:before="0"/>
-              <w:jc w:val="center"/>
-            </w:pPr>
-            <w:r>
-              <w:rPr>
-                <w:rFonts w:ascii="Arial" w:cs="Arial" w:eastAsia="Arial" w:hAnsi="Arial"/>
-                <w:sz w:val="18"/>
-                <w:szCs w:val="18"/>
-              </w:rPr>
-              <w:t xml:space="preserve"/>
-            </w:r>
-          </w:p>
-        </w:tc>
-        <w:tc>
-          <w:tcPr>
-            <w:tcW w:type="dxa" w:w="3600"/>
+            <w:tcW w:type="dxa" w:w="1205"/>
+            <w:tcBorders>
+              <w:top w:val="single" w:color="555555" w:sz="4"/>
+              <w:left w:val="single" w:color="555555" w:sz="4"/>
+              <w:bottom w:val="single" w:color="555555" w:sz="4"/>
+              <w:right w:val="single" w:color="555555" w:sz="4"/>
+            </w:tcBorders>
+            <w:tcMar>
+              <w:top w:type="dxa" w:w="30"/>
+              <w:left w:type="dxa" w:w="60"/>
+              <w:bottom w:type="dxa" w:w="30"/>
+              <w:right w:type="dxa" w:w="60"/>
+            </w:tcMar>
+            <w:vAlign w:val="center"/>
+          </w:tcPr>
+          <w:p>
+            <w:pPr>
+              <w:spacing w:after="0" w:before="0"/>
+              <w:jc w:val="center"/>
+            </w:pPr>
+            <w:r>
+              <w:rPr>
+                <w:rFonts w:ascii="Arial" w:cs="Arial" w:eastAsia="Arial" w:hAnsi="Arial"/>
+                <w:sz w:val="18"/>
+                <w:szCs w:val="18"/>
+              </w:rPr>
+              <w:t xml:space="preserve"/>
+            </w:r>
+          </w:p>
+        </w:tc>
+        <w:tc>
+          <w:tcPr>
+            <w:tcW w:type="dxa" w:w="1253"/>
+            <w:tcBorders>
+              <w:top w:val="single" w:color="555555" w:sz="4"/>
+              <w:left w:val="single" w:color="555555" w:sz="4"/>
+              <w:bottom w:val="single" w:color="555555" w:sz="4"/>
+              <w:right w:val="single" w:color="555555" w:sz="4"/>
+            </w:tcBorders>
+            <w:tcMar>
+              <w:top w:type="dxa" w:w="30"/>
+              <w:left w:type="dxa" w:w="60"/>
+              <w:bottom w:type="dxa" w:w="30"/>
+              <w:right w:type="dxa" w:w="60"/>
+            </w:tcMar>
+            <w:vAlign w:val="center"/>
+          </w:tcPr>
+          <w:p>
+            <w:pPr>
+              <w:spacing w:after="0" w:before="0"/>
+              <w:jc w:val="center"/>
+            </w:pPr>
+            <w:r>
+              <w:rPr>
+                <w:rFonts w:ascii="Arial" w:cs="Arial" w:eastAsia="Arial" w:hAnsi="Arial"/>
+                <w:sz w:val="18"/>
+                <w:szCs w:val="18"/>
+              </w:rPr>
+              <w:t xml:space="preserve"/>
+            </w:r>
+          </w:p>
+        </w:tc>
+        <w:tc>
+          <w:tcPr>
+            <w:tcW w:type="dxa" w:w="3471"/>
             <w:tcBorders>
               <w:top w:val="single" w:color="555555" w:sz="4"/>
               <w:left w:val="single" w:color="555555" w:sz="4"/>
@@ -2997,7 +2997,7 @@
         </w:trPr>
         <w:tc>
           <w:tcPr>
-            <w:tcW w:type="dxa" w:w="4120"/>
+            <w:tcW w:type="dxa" w:w="3972"/>
             <w:tcBorders>
               <w:top w:val="single" w:color="555555" w:sz="4"/>
               <w:left w:val="single" w:color="555555" w:sz="4"/>
@@ -3028,7 +3028,7 @@
         </w:tc>
         <w:tc>
           <w:tcPr>
-            <w:tcW w:type="dxa" w:w="1250"/>
+            <w:tcW w:type="dxa" w:w="1205"/>
             <w:tcBorders>
               <w:top w:val="single" w:color="555555" w:sz="4"/>
               <w:left w:val="single" w:color="555555" w:sz="4"/>
@@ -3060,71 +3060,71 @@
         </w:tc>
         <w:tc>
           <w:tcPr>
-            <w:tcW w:type="dxa" w:w="1250"/>
-            <w:tcBorders>
-              <w:top w:val="single" w:color="555555" w:sz="4"/>
-              <w:left w:val="single" w:color="555555" w:sz="4"/>
-              <w:bottom w:val="single" w:color="555555" w:sz="4"/>
-              <w:right w:val="single" w:color="555555" w:sz="4"/>
-            </w:tcBorders>
-            <w:tcMar>
-              <w:top w:type="dxa" w:w="30"/>
-              <w:left w:type="dxa" w:w="60"/>
-              <w:bottom w:type="dxa" w:w="30"/>
-              <w:right w:type="dxa" w:w="60"/>
-            </w:tcMar>
-            <w:vAlign w:val="center"/>
-          </w:tcPr>
-          <w:p>
-            <w:pPr>
-              <w:spacing w:after="0" w:before="0"/>
-              <w:jc w:val="center"/>
-            </w:pPr>
-            <w:r>
-              <w:rPr>
-                <w:rFonts w:ascii="Arial" w:cs="Arial" w:eastAsia="Arial" w:hAnsi="Arial"/>
-                <w:sz w:val="18"/>
-                <w:szCs w:val="18"/>
-              </w:rPr>
-              <w:t xml:space="preserve"/>
-            </w:r>
-          </w:p>
-        </w:tc>
-        <w:tc>
-          <w:tcPr>
-            <w:tcW w:type="dxa" w:w="1300"/>
-            <w:tcBorders>
-              <w:top w:val="single" w:color="555555" w:sz="4"/>
-              <w:left w:val="single" w:color="555555" w:sz="4"/>
-              <w:bottom w:val="single" w:color="555555" w:sz="4"/>
-              <w:right w:val="single" w:color="555555" w:sz="4"/>
-            </w:tcBorders>
-            <w:tcMar>
-              <w:top w:type="dxa" w:w="30"/>
-              <w:left w:type="dxa" w:w="60"/>
-              <w:bottom w:type="dxa" w:w="30"/>
-              <w:right w:type="dxa" w:w="60"/>
-            </w:tcMar>
-            <w:vAlign w:val="center"/>
-          </w:tcPr>
-          <w:p>
-            <w:pPr>
-              <w:spacing w:after="0" w:before="0"/>
-              <w:jc w:val="center"/>
-            </w:pPr>
-            <w:r>
-              <w:rPr>
-                <w:rFonts w:ascii="Arial" w:cs="Arial" w:eastAsia="Arial" w:hAnsi="Arial"/>
-                <w:sz w:val="18"/>
-                <w:szCs w:val="18"/>
-              </w:rPr>
-              <w:t xml:space="preserve"/>
-            </w:r>
-          </w:p>
-        </w:tc>
-        <w:tc>
-          <w:tcPr>
-            <w:tcW w:type="dxa" w:w="3600"/>
+            <w:tcW w:type="dxa" w:w="1205"/>
+            <w:tcBorders>
+              <w:top w:val="single" w:color="555555" w:sz="4"/>
+              <w:left w:val="single" w:color="555555" w:sz="4"/>
+              <w:bottom w:val="single" w:color="555555" w:sz="4"/>
+              <w:right w:val="single" w:color="555555" w:sz="4"/>
+            </w:tcBorders>
+            <w:tcMar>
+              <w:top w:type="dxa" w:w="30"/>
+              <w:left w:type="dxa" w:w="60"/>
+              <w:bottom w:type="dxa" w:w="30"/>
+              <w:right w:type="dxa" w:w="60"/>
+            </w:tcMar>
+            <w:vAlign w:val="center"/>
+          </w:tcPr>
+          <w:p>
+            <w:pPr>
+              <w:spacing w:after="0" w:before="0"/>
+              <w:jc w:val="center"/>
+            </w:pPr>
+            <w:r>
+              <w:rPr>
+                <w:rFonts w:ascii="Arial" w:cs="Arial" w:eastAsia="Arial" w:hAnsi="Arial"/>
+                <w:sz w:val="18"/>
+                <w:szCs w:val="18"/>
+              </w:rPr>
+              <w:t xml:space="preserve"/>
+            </w:r>
+          </w:p>
+        </w:tc>
+        <w:tc>
+          <w:tcPr>
+            <w:tcW w:type="dxa" w:w="1253"/>
+            <w:tcBorders>
+              <w:top w:val="single" w:color="555555" w:sz="4"/>
+              <w:left w:val="single" w:color="555555" w:sz="4"/>
+              <w:bottom w:val="single" w:color="555555" w:sz="4"/>
+              <w:right w:val="single" w:color="555555" w:sz="4"/>
+            </w:tcBorders>
+            <w:tcMar>
+              <w:top w:type="dxa" w:w="30"/>
+              <w:left w:type="dxa" w:w="60"/>
+              <w:bottom w:type="dxa" w:w="30"/>
+              <w:right w:type="dxa" w:w="60"/>
+            </w:tcMar>
+            <w:vAlign w:val="center"/>
+          </w:tcPr>
+          <w:p>
+            <w:pPr>
+              <w:spacing w:after="0" w:before="0"/>
+              <w:jc w:val="center"/>
+            </w:pPr>
+            <w:r>
+              <w:rPr>
+                <w:rFonts w:ascii="Arial" w:cs="Arial" w:eastAsia="Arial" w:hAnsi="Arial"/>
+                <w:sz w:val="18"/>
+                <w:szCs w:val="18"/>
+              </w:rPr>
+              <w:t xml:space="preserve"/>
+            </w:r>
+          </w:p>
+        </w:tc>
+        <w:tc>
+          <w:tcPr>
+            <w:tcW w:type="dxa" w:w="3471"/>
             <w:tcBorders>
               <w:top w:val="single" w:color="555555" w:sz="4"/>
               <w:left w:val="single" w:color="555555" w:sz="4"/>
@@ -3160,7 +3160,7 @@
         </w:trPr>
         <w:tc>
           <w:tcPr>
-            <w:tcW w:type="dxa" w:w="4120"/>
+            <w:tcW w:type="dxa" w:w="3972"/>
             <w:tcBorders>
               <w:top w:val="single" w:color="555555" w:sz="4"/>
               <w:left w:val="single" w:color="555555" w:sz="4"/>
@@ -3191,103 +3191,103 @@
         </w:tc>
         <w:tc>
           <w:tcPr>
-            <w:tcW w:type="dxa" w:w="1250"/>
-            <w:tcBorders>
-              <w:top w:val="single" w:color="555555" w:sz="4"/>
-              <w:left w:val="single" w:color="555555" w:sz="4"/>
-              <w:bottom w:val="single" w:color="555555" w:sz="4"/>
-              <w:right w:val="single" w:color="555555" w:sz="4"/>
-            </w:tcBorders>
-            <w:tcMar>
-              <w:top w:type="dxa" w:w="30"/>
-              <w:left w:type="dxa" w:w="60"/>
-              <w:bottom w:type="dxa" w:w="30"/>
-              <w:right w:type="dxa" w:w="60"/>
-            </w:tcMar>
-            <w:vAlign w:val="center"/>
-          </w:tcPr>
-          <w:p>
-            <w:pPr>
-              <w:spacing w:after="0" w:before="0"/>
-              <w:jc w:val="center"/>
-            </w:pPr>
-            <w:r>
-              <w:rPr>
-                <w:rFonts w:ascii="Arial" w:cs="Arial" w:eastAsia="Arial" w:hAnsi="Arial"/>
-                <w:sz w:val="18"/>
-                <w:szCs w:val="18"/>
-              </w:rPr>
-              <w:t xml:space="preserve"/>
-            </w:r>
-          </w:p>
-        </w:tc>
-        <w:tc>
-          <w:tcPr>
-            <w:tcW w:type="dxa" w:w="1250"/>
-            <w:tcBorders>
-              <w:top w:val="single" w:color="555555" w:sz="4"/>
-              <w:left w:val="single" w:color="555555" w:sz="4"/>
-              <w:bottom w:val="single" w:color="555555" w:sz="4"/>
-              <w:right w:val="single" w:color="555555" w:sz="4"/>
-            </w:tcBorders>
-            <w:tcMar>
-              <w:top w:type="dxa" w:w="30"/>
-              <w:left w:type="dxa" w:w="60"/>
-              <w:bottom w:type="dxa" w:w="30"/>
-              <w:right w:type="dxa" w:w="60"/>
-            </w:tcMar>
-            <w:vAlign w:val="center"/>
-          </w:tcPr>
-          <w:p>
-            <w:pPr>
-              <w:spacing w:after="0" w:before="0"/>
-              <w:jc w:val="center"/>
-            </w:pPr>
-            <w:r>
-              <w:rPr>
-                <w:rFonts w:ascii="Arial" w:cs="Arial" w:eastAsia="Arial" w:hAnsi="Arial"/>
-                <w:sz w:val="18"/>
-                <w:szCs w:val="18"/>
-              </w:rPr>
-              <w:t xml:space="preserve"/>
-            </w:r>
-          </w:p>
-        </w:tc>
-        <w:tc>
-          <w:tcPr>
-            <w:tcW w:type="dxa" w:w="1300"/>
-            <w:tcBorders>
-              <w:top w:val="single" w:color="555555" w:sz="4"/>
-              <w:left w:val="single" w:color="555555" w:sz="4"/>
-              <w:bottom w:val="single" w:color="555555" w:sz="4"/>
-              <w:right w:val="single" w:color="555555" w:sz="4"/>
-            </w:tcBorders>
-            <w:tcMar>
-              <w:top w:type="dxa" w:w="30"/>
-              <w:left w:type="dxa" w:w="60"/>
-              <w:bottom w:type="dxa" w:w="30"/>
-              <w:right w:type="dxa" w:w="60"/>
-            </w:tcMar>
-            <w:vAlign w:val="center"/>
-          </w:tcPr>
-          <w:p>
-            <w:pPr>
-              <w:spacing w:after="0" w:before="0"/>
-              <w:jc w:val="center"/>
-            </w:pPr>
-            <w:r>
-              <w:rPr>
-                <w:rFonts w:ascii="Arial" w:cs="Arial" w:eastAsia="Arial" w:hAnsi="Arial"/>
-                <w:sz w:val="18"/>
-                <w:szCs w:val="18"/>
-              </w:rPr>
-              <w:t xml:space="preserve"/>
-            </w:r>
-          </w:p>
-        </w:tc>
-        <w:tc>
-          <w:tcPr>
-            <w:tcW w:type="dxa" w:w="3600"/>
+            <w:tcW w:type="dxa" w:w="1205"/>
+            <w:tcBorders>
+              <w:top w:val="single" w:color="555555" w:sz="4"/>
+              <w:left w:val="single" w:color="555555" w:sz="4"/>
+              <w:bottom w:val="single" w:color="555555" w:sz="4"/>
+              <w:right w:val="single" w:color="555555" w:sz="4"/>
+            </w:tcBorders>
+            <w:tcMar>
+              <w:top w:type="dxa" w:w="30"/>
+              <w:left w:type="dxa" w:w="60"/>
+              <w:bottom w:type="dxa" w:w="30"/>
+              <w:right w:type="dxa" w:w="60"/>
+            </w:tcMar>
+            <w:vAlign w:val="center"/>
+          </w:tcPr>
+          <w:p>
+            <w:pPr>
+              <w:spacing w:after="0" w:before="0"/>
+              <w:jc w:val="center"/>
+            </w:pPr>
+            <w:r>
+              <w:rPr>
+                <w:rFonts w:ascii="Arial" w:cs="Arial" w:eastAsia="Arial" w:hAnsi="Arial"/>
+                <w:sz w:val="18"/>
+                <w:szCs w:val="18"/>
+              </w:rPr>
+              <w:t xml:space="preserve"/>
+            </w:r>
+          </w:p>
+        </w:tc>
+        <w:tc>
+          <w:tcPr>
+            <w:tcW w:type="dxa" w:w="1205"/>
+            <w:tcBorders>
+              <w:top w:val="single" w:color="555555" w:sz="4"/>
+              <w:left w:val="single" w:color="555555" w:sz="4"/>
+              <w:bottom w:val="single" w:color="555555" w:sz="4"/>
+              <w:right w:val="single" w:color="555555" w:sz="4"/>
+            </w:tcBorders>
+            <w:tcMar>
+              <w:top w:type="dxa" w:w="30"/>
+              <w:left w:type="dxa" w:w="60"/>
+              <w:bottom w:type="dxa" w:w="30"/>
+              <w:right w:type="dxa" w:w="60"/>
+            </w:tcMar>
+            <w:vAlign w:val="center"/>
+          </w:tcPr>
+          <w:p>
+            <w:pPr>
+              <w:spacing w:after="0" w:before="0"/>
+              <w:jc w:val="center"/>
+            </w:pPr>
+            <w:r>
+              <w:rPr>
+                <w:rFonts w:ascii="Arial" w:cs="Arial" w:eastAsia="Arial" w:hAnsi="Arial"/>
+                <w:sz w:val="18"/>
+                <w:szCs w:val="18"/>
+              </w:rPr>
+              <w:t xml:space="preserve"/>
+            </w:r>
+          </w:p>
+        </w:tc>
+        <w:tc>
+          <w:tcPr>
+            <w:tcW w:type="dxa" w:w="1253"/>
+            <w:tcBorders>
+              <w:top w:val="single" w:color="555555" w:sz="4"/>
+              <w:left w:val="single" w:color="555555" w:sz="4"/>
+              <w:bottom w:val="single" w:color="555555" w:sz="4"/>
+              <w:right w:val="single" w:color="555555" w:sz="4"/>
+            </w:tcBorders>
+            <w:tcMar>
+              <w:top w:type="dxa" w:w="30"/>
+              <w:left w:type="dxa" w:w="60"/>
+              <w:bottom w:type="dxa" w:w="30"/>
+              <w:right w:type="dxa" w:w="60"/>
+            </w:tcMar>
+            <w:vAlign w:val="center"/>
+          </w:tcPr>
+          <w:p>
+            <w:pPr>
+              <w:spacing w:after="0" w:before="0"/>
+              <w:jc w:val="center"/>
+            </w:pPr>
+            <w:r>
+              <w:rPr>
+                <w:rFonts w:ascii="Arial" w:cs="Arial" w:eastAsia="Arial" w:hAnsi="Arial"/>
+                <w:sz w:val="18"/>
+                <w:szCs w:val="18"/>
+              </w:rPr>
+              <w:t xml:space="preserve"/>
+            </w:r>
+          </w:p>
+        </w:tc>
+        <w:tc>
+          <w:tcPr>
+            <w:tcW w:type="dxa" w:w="3471"/>
             <w:tcBorders>
               <w:top w:val="single" w:color="555555" w:sz="4"/>
               <w:left w:val="single" w:color="555555" w:sz="4"/>
@@ -3337,7 +3337,7 @@
     </w:p>
     <w:tbl>
       <w:tblPr>
-        <w:tblW w:type="dxa" w:w="11520"/>
+        <w:tblW w:type="dxa" w:w="11106"/>
         <w:tblBorders>
           <w:top w:val="single" w:color="auto" w:sz="4"/>
           <w:left w:val="single" w:color="auto" w:sz="4"/>
@@ -3349,7 +3349,7 @@
         <w:tblLayout w:type="fixed"/>
       </w:tblPr>
       <w:tblGrid>
-        <w:gridCol w:w="11520"/>
+        <w:gridCol w:w="11106"/>
       </w:tblGrid>
       <w:tr>
         <w:trPr>
@@ -3357,7 +3357,7 @@
         </w:trPr>
         <w:tc>
           <w:tcPr>
-            <w:tcW w:type="dxa" w:w="11520"/>
+            <w:tcW w:type="dxa" w:w="11106"/>
             <w:tcBorders>
               <w:top w:val="single" w:color="555555" w:sz="4"/>
               <w:left w:val="single" w:color="555555" w:sz="4"/>
@@ -3397,7 +3397,7 @@
         </w:trPr>
         <w:tc>
           <w:tcPr>
-            <w:tcW w:type="dxa" w:w="11520"/>
+            <w:tcW w:type="dxa" w:w="11106"/>
             <w:tcBorders>
               <w:top w:val="single" w:color="555555" w:sz="4"/>
               <w:left w:val="single" w:color="555555" w:sz="4"/>
@@ -3433,7 +3433,7 @@
         </w:trPr>
         <w:tc>
           <w:tcPr>
-            <w:tcW w:type="dxa" w:w="11520"/>
+            <w:tcW w:type="dxa" w:w="11106"/>
             <w:tcBorders>
               <w:top w:val="single" w:color="555555" w:sz="4"/>
               <w:left w:val="single" w:color="555555" w:sz="4"/>
@@ -3469,7 +3469,7 @@
         </w:trPr>
         <w:tc>
           <w:tcPr>
-            <w:tcW w:type="dxa" w:w="11520"/>
+            <w:tcW w:type="dxa" w:w="11106"/>
             <w:tcBorders>
               <w:top w:val="single" w:color="555555" w:sz="4"/>
               <w:left w:val="single" w:color="555555" w:sz="4"/>
@@ -3505,7 +3505,7 @@
         </w:trPr>
         <w:tc>
           <w:tcPr>
-            <w:tcW w:type="dxa" w:w="11520"/>
+            <w:tcW w:type="dxa" w:w="11106"/>
             <w:tcBorders>
               <w:top w:val="single" w:color="555555" w:sz="4"/>
               <w:left w:val="single" w:color="555555" w:sz="4"/>
@@ -3541,7 +3541,7 @@
         </w:trPr>
         <w:tc>
           <w:tcPr>
-            <w:tcW w:type="dxa" w:w="11520"/>
+            <w:tcW w:type="dxa" w:w="11106"/>
             <w:tcBorders>
               <w:top w:val="single" w:color="555555" w:sz="4"/>
               <w:left w:val="single" w:color="555555" w:sz="4"/>
@@ -3591,7 +3591,7 @@
     </w:p>
     <w:tbl>
       <w:tblPr>
-        <w:tblW w:type="dxa" w:w="11520"/>
+        <w:tblW w:type="dxa" w:w="11106"/>
         <w:tblBorders>
           <w:top w:val="single" w:color="auto" w:sz="4"/>
           <w:left w:val="single" w:color="auto" w:sz="4"/>
@@ -3603,9 +3603,9 @@
         <w:tblLayout w:type="fixed"/>
       </w:tblPr>
       <w:tblGrid>
-        <w:gridCol w:w="3420"/>
-        <w:gridCol w:w="4300"/>
-        <w:gridCol w:w="3800"/>
+        <w:gridCol w:w="3297"/>
+        <w:gridCol w:w="4145"/>
+        <w:gridCol w:w="3664"/>
       </w:tblGrid>
       <w:tr>
         <w:trPr>
@@ -3613,7 +3613,7 @@
         </w:trPr>
         <w:tc>
           <w:tcPr>
-            <w:tcW w:type="dxa" w:w="3420"/>
+            <w:tcW w:type="dxa" w:w="3297"/>
             <w:tcBorders>
               <w:top w:val="single" w:color="555555" w:sz="4"/>
               <w:left w:val="single" w:color="555555" w:sz="4"/>
@@ -3648,7 +3648,7 @@
         </w:tc>
         <w:tc>
           <w:tcPr>
-            <w:tcW w:type="dxa" w:w="4300"/>
+            <w:tcW w:type="dxa" w:w="4145"/>
             <w:tcBorders>
               <w:top w:val="single" w:color="555555" w:sz="4"/>
               <w:left w:val="single" w:color="555555" w:sz="4"/>
@@ -3683,7 +3683,7 @@
         </w:tc>
         <w:tc>
           <w:tcPr>
-            <w:tcW w:type="dxa" w:w="3800"/>
+            <w:tcW w:type="dxa" w:w="3664"/>
             <w:tcBorders>
               <w:top w:val="single" w:color="555555" w:sz="4"/>
               <w:left w:val="single" w:color="555555" w:sz="4"/>
@@ -3723,7 +3723,7 @@
         </w:trPr>
         <w:tc>
           <w:tcPr>
-            <w:tcW w:type="dxa" w:w="3420"/>
+            <w:tcW w:type="dxa" w:w="3297"/>
             <w:tcBorders>
               <w:top w:val="single" w:color="555555" w:sz="4"/>
               <w:left w:val="single" w:color="555555" w:sz="4"/>
@@ -3756,7 +3756,7 @@
         </w:tc>
         <w:tc>
           <w:tcPr>
-            <w:tcW w:type="dxa" w:w="4300"/>
+            <w:tcW w:type="dxa" w:w="4145"/>
             <w:tcBorders>
               <w:top w:val="single" w:color="555555" w:sz="4"/>
               <w:left w:val="single" w:color="555555" w:sz="4"/>
@@ -3789,7 +3789,7 @@
         </w:tc>
         <w:tc>
           <w:tcPr>
-            <w:tcW w:type="dxa" w:w="3800"/>
+            <w:tcW w:type="dxa" w:w="3664"/>
             <w:tcBorders>
               <w:top w:val="single" w:color="555555" w:sz="4"/>
               <w:left w:val="single" w:color="555555" w:sz="4"/>
@@ -3827,7 +3827,7 @@
         </w:trPr>
         <w:tc>
           <w:tcPr>
-            <w:tcW w:type="dxa" w:w="3420"/>
+            <w:tcW w:type="dxa" w:w="3297"/>
             <w:tcBorders>
               <w:top w:val="single" w:color="555555" w:sz="4"/>
               <w:left w:val="single" w:color="555555" w:sz="4"/>
@@ -3860,7 +3860,7 @@
         </w:tc>
         <w:tc>
           <w:tcPr>
-            <w:tcW w:type="dxa" w:w="4300"/>
+            <w:tcW w:type="dxa" w:w="4145"/>
             <w:tcBorders>
               <w:top w:val="single" w:color="555555" w:sz="4"/>
               <w:left w:val="single" w:color="555555" w:sz="4"/>
@@ -3893,7 +3893,7 @@
         </w:tc>
         <w:tc>
           <w:tcPr>
-            <w:tcW w:type="dxa" w:w="3800"/>
+            <w:tcW w:type="dxa" w:w="3664"/>
             <w:tcBorders>
               <w:top w:val="single" w:color="555555" w:sz="4"/>
               <w:left w:val="single" w:color="555555" w:sz="4"/>
@@ -3929,7 +3929,7 @@
     <w:sectPr>
       <w:footerReference w:type="default" r:id="rId7"/>
       <w:pgSz w:w="12240" w:h="15840" w:orient="portrait"/>
-      <w:pgMar w:top="600" w:right="360" w:bottom="600" w:left="360" w:header="708" w:footer="300" w:gutter="0"/>
+      <w:pgMar w:top="2268" w:right="567" w:bottom="2268" w:left="567" w:header="708" w:footer="567" w:gutter="0"/>
       <w:pgNumType/>
       <w:docGrid w:linePitch="360"/>
     </w:sectPr>

</xml_diff>

<commit_message>
Hoja de campo: nota final con resumen de funciones del monitor
Co-Authored-By: Claude Opus 5.5 <noreply@anthropic.com>
Claude-Session: https://claude.ai/code/session_01FfUnftB8faW5Tj1T7jUfMj
</commit_message>
<xml_diff>
--- a/Hoja_Campo_Limpieza_Roceria_Comuna2.docx
+++ b/Hoja_Campo_Limpieza_Roceria_Comuna2.docx
@@ -3124,7 +3124,28 @@
         </w:tc>
       </w:tr>
     </w:tbl>
-    <w:p/>
+    <w:p>
+      <w:pPr>
+        <w:spacing w:before="120" w:after="0"/>
+        <w:jc w:val="both"/>
+      </w:pPr>
+      <w:r>
+        <w:rPr>
+          <w:b/>
+          <w:bCs/>
+          <w:sz w:val="16"/>
+          <w:szCs w:val="16"/>
+        </w:rPr>
+        <w:t xml:space="preserve">Nota – Funciones del monitor(a) ambiental (Cláusulas 2ª y 8ª del contrato): </w:t>
+      </w:r>
+      <w:r>
+        <w:rPr>
+          <w:sz w:val="16"/>
+          <w:szCs w:val="16"/>
+        </w:rPr>
+        <w:t xml:space="preserve">Supervisar diariamente las labores de limpieza y rocería en el tramo autorizado, verificando avance, rendimiento y cumplimiento de instrucciones. Llevar el registro diario y entregar los reportes diarios y semanales con evidencia fotográfica. Organizar la cuadrilla y controlar herramientas y manejo de residuos. Informar de inmediato al responsable de obra o a la interventoría cualquier novedad, retraso o riesgo. Reportar solo lo realmente ejecutado.</w:t>
+      </w:r>
+    </w:p>
     <w:sectPr>
       <w:headerReference w:type="default" r:id="rId7"/>
       <w:footerReference w:type="default" r:id="rId8"/>

</xml_diff>